<commit_message>
docs(deployment): update guide and docx with live verified GitHub and Vercel URLs
</commit_message>
<xml_diff>
--- a/Sarathi_Deployment_Commands_Guide.docx
+++ b/Sarathi_Deployment_Commands_Guide.docx
@@ -4,73 +4,67 @@
   <w:body>
     <w:p>
       <w:pPr>
-        <w:spacing w:after="40"/>
+        <w:spacing w:before="0" w:after="80"/>
+        <w:jc w:val="center"/>
       </w:pPr>
       <w:r>
         <w:rPr>
-          <w:rFonts w:ascii="Segoe UI" w:hAnsi="Segoe UI"/>
+          <w:rFonts w:ascii="Arial" w:hAnsi="Arial"/>
           <w:b/>
-          <w:color w:val="284B3F"/>
+          <w:color w:val="1E293B"/>
           <w:sz w:val="44"/>
         </w:rPr>
-        <w:t>🕉️ Sarathi: Your Mental Wellness Companion</w:t>
+        <w:t>Sarathi: Mental Wellness Platform</w:t>
       </w:r>
     </w:p>
     <w:p>
       <w:pPr>
         <w:spacing w:after="280"/>
+        <w:jc w:val="center"/>
       </w:pPr>
       <w:r>
         <w:rPr>
-          <w:rFonts w:ascii="Segoe UI" w:hAnsi="Segoe UI"/>
-          <w:b/>
-          <w:color w:val="4D7C6F"/>
+          <w:rFonts w:ascii="Arial" w:hAnsi="Arial"/>
+          <w:i/>
+          <w:color w:val="475569"/>
           <w:sz w:val="26"/>
         </w:rPr>
-        <w:t>[Research Based Project] — Comprehensive Deployment Manual</w:t>
+        <w:t>Deployment Architecture &amp; Command Reference Guide (GitHub + Vercel)</w:t>
       </w:r>
     </w:p>
     <w:p>
       <w:pPr>
-        <w:spacing w:after="360"/>
+        <w:spacing w:after="320"/>
       </w:pPr>
       <w:r>
         <w:rPr>
-          <w:rFonts w:ascii="Consolas" w:hAnsi="Consolas"/>
-          <w:color w:val="5A6B64"/>
+          <w:rFonts w:ascii="Arial" w:hAnsi="Arial"/>
+          <w:color w:val="0F172A"/>
           <w:sz w:val="19"/>
         </w:rPr>
-        <w:t>Target GitHub Repository: sarathi-your-mental-wellness-companion</w:t>
+        <w:t>Project: Sarathi: Your Mental Wellness Companion [Research Based Project]</w:t>
         <w:br/>
-        <w:t>Target Vercel Project: sarathi-your-mental-wellness-companion</w:t>
+        <w:t>Repository Slug: ChahatModi18/sarathi-your-mental-wellness-companion</w:t>
         <w:br/>
-        <w:t>Platform Architecture: Flask 3.1 + FastAPI Microservice + NumPy Neural Classification + Vercel Serverless</w:t>
+        <w:t>Primary Production URL: https://sarathi-your-mental-wellness-compan.vercel.app</w:t>
+        <w:br/>
+        <w:t>Direct Deployment URL: https://sarathi-your-mental-wellness-companion-3xv8j6ust.vercel.app</w:t>
+        <w:br/>
+        <w:t>Status: Verified Operational (HTTP 200 OK) | 58/58 Automated Tests Passing</w:t>
       </w:r>
     </w:p>
     <w:p>
       <w:pPr>
-        <w:spacing w:after="160"/>
+        <w:pStyle w:val="Heading1"/>
       </w:pPr>
       <w:r>
         <w:rPr>
-          <w:rFonts w:ascii="Segoe UI" w:hAnsi="Segoe UI"/>
+          <w:rFonts w:ascii="Arial" w:hAnsi="Arial"/>
           <w:b/>
-          <w:color w:val="284B3F"/>
+          <w:color w:val="0E7490"/>
           <w:sz w:val="28"/>
         </w:rPr>
-        <w:t>1. GitHub Deployment Commands (Tabular Reference)</w:t>
-      </w:r>
-    </w:p>
-    <w:p>
-      <w:pPr>
-        <w:spacing w:after="200"/>
-      </w:pPr>
-      <w:r>
-        <w:rPr>
-          <w:rFonts w:ascii="Segoe UI" w:hAnsi="Segoe UI"/>
-          <w:sz w:val="20"/>
-        </w:rPr>
-        <w:t>The following sequence initializes your repository, excludes sensitive credentials, stages sanitized codebase artifacts, and publishes to GitHub under the designated repository name.</w:t>
+        <w:t>1. Verified Live Deployment Links</w:t>
       </w:r>
     </w:p>
     <w:tbl>
@@ -78,111 +72,79 @@
         <w:tblW w:type="auto" w:w="0"/>
         <w:jc w:val="center"/>
         <w:tblLook w:firstColumn="1" w:firstRow="1" w:lastColumn="0" w:lastRow="0" w:noHBand="0" w:noVBand="1" w:val="04A0"/>
-        <w:tblBorders>
-          <w:top w:val="single" w:sz="6" w:space="0" w:color="D1DCD6"/>
-          <w:bottom w:val="single" w:sz="6" w:space="0" w:color="D1DCD6"/>
-          <w:insideH w:val="single" w:sz="4" w:space="0" w:color="D1DCD6"/>
-          <w:insideV w:val="none"/>
-          <w:left w:val="none"/>
-          <w:right w:val="none"/>
-        </w:tblBorders>
       </w:tblPr>
       <w:tblGrid>
-        <w:gridCol w:w="2484"/>
-        <w:gridCol w:w="2484"/>
-        <w:gridCol w:w="2484"/>
-        <w:gridCol w:w="2484"/>
+        <w:gridCol w:w="3360"/>
+        <w:gridCol w:w="3360"/>
+        <w:gridCol w:w="3360"/>
       </w:tblGrid>
       <w:tr>
         <w:tc>
           <w:tcPr>
-            <w:tcW w:type="dxa" w:w="1440"/>
-            <w:shd w:fill="284B3F"/>
+            <w:tcW w:type="dxa" w:w="2592"/>
+            <w:shd w:fill="0E7490"/>
             <w:tcMar>
-              <w:top w:w="140" w:type="dxa"/>
-              <w:bottom w:w="140" w:type="dxa"/>
-              <w:left w:w="140" w:type="dxa"/>
-              <w:right w:w="140" w:type="dxa"/>
+              <w:top w:w="120" w:type="dxa"/>
+              <w:bottom w:w="120" w:type="dxa"/>
+              <w:left w:w="150" w:type="dxa"/>
+              <w:right w:w="150" w:type="dxa"/>
             </w:tcMar>
           </w:tcPr>
           <w:p>
             <w:r>
               <w:rPr>
-                <w:rFonts w:ascii="Segoe UI" w:hAnsi="Segoe UI"/>
+                <w:rFonts w:ascii="Arial" w:hAnsi="Arial"/>
                 <w:b/>
                 <w:color w:val="FFFFFF"/>
                 <w:sz w:val="19"/>
               </w:rPr>
-              <w:t>Step #</w:t>
+              <w:t>Resource</w:t>
             </w:r>
           </w:p>
         </w:tc>
         <w:tc>
           <w:tcPr>
-            <w:tcW w:type="dxa" w:w="3168"/>
-            <w:shd w:fill="284B3F"/>
+            <w:tcW w:type="dxa" w:w="5184"/>
+            <w:shd w:fill="0E7490"/>
             <w:tcMar>
-              <w:top w:w="140" w:type="dxa"/>
-              <w:bottom w:w="140" w:type="dxa"/>
-              <w:left w:w="140" w:type="dxa"/>
-              <w:right w:w="140" w:type="dxa"/>
+              <w:top w:w="120" w:type="dxa"/>
+              <w:bottom w:w="120" w:type="dxa"/>
+              <w:left w:w="150" w:type="dxa"/>
+              <w:right w:w="150" w:type="dxa"/>
             </w:tcMar>
           </w:tcPr>
           <w:p>
             <w:r>
               <w:rPr>
-                <w:rFonts w:ascii="Segoe UI" w:hAnsi="Segoe UI"/>
+                <w:rFonts w:ascii="Arial" w:hAnsi="Arial"/>
                 <w:b/>
                 <w:color w:val="FFFFFF"/>
                 <w:sz w:val="19"/>
               </w:rPr>
-              <w:t>Command / Action</w:t>
+              <w:t>Direct URL / Destination</w:t>
             </w:r>
           </w:p>
         </w:tc>
         <w:tc>
           <w:tcPr>
-            <w:tcW w:type="dxa" w:w="3312"/>
-            <w:shd w:fill="284B3F"/>
+            <w:tcW w:type="dxa" w:w="2304"/>
+            <w:shd w:fill="0E7490"/>
             <w:tcMar>
-              <w:top w:w="140" w:type="dxa"/>
-              <w:bottom w:w="140" w:type="dxa"/>
-              <w:left w:w="140" w:type="dxa"/>
-              <w:right w:w="140" w:type="dxa"/>
+              <w:top w:w="120" w:type="dxa"/>
+              <w:bottom w:w="120" w:type="dxa"/>
+              <w:left w:w="150" w:type="dxa"/>
+              <w:right w:w="150" w:type="dxa"/>
             </w:tcMar>
           </w:tcPr>
           <w:p>
             <w:r>
               <w:rPr>
-                <w:rFonts w:ascii="Segoe UI" w:hAnsi="Segoe UI"/>
+                <w:rFonts w:ascii="Arial" w:hAnsi="Arial"/>
                 <w:b/>
                 <w:color w:val="FFFFFF"/>
                 <w:sz w:val="19"/>
               </w:rPr>
-              <w:t>Technical Purpose &amp; Function</w:t>
-            </w:r>
-          </w:p>
-        </w:tc>
-        <w:tc>
-          <w:tcPr>
-            <w:tcW w:type="dxa" w:w="2880"/>
-            <w:shd w:fill="284B3F"/>
-            <w:tcMar>
-              <w:top w:w="140" w:type="dxa"/>
-              <w:bottom w:w="140" w:type="dxa"/>
-              <w:left w:w="140" w:type="dxa"/>
-              <w:right w:w="140" w:type="dxa"/>
-            </w:tcMar>
-          </w:tcPr>
-          <w:p>
-            <w:r>
-              <w:rPr>
-                <w:rFonts w:ascii="Segoe UI" w:hAnsi="Segoe UI"/>
-                <w:b/>
-                <w:color w:val="FFFFFF"/>
-                <w:sz w:val="19"/>
-              </w:rPr>
-              <w:t>Verification &amp; Output</w:t>
+              <w:t>Operational Status</w:t>
             </w:r>
           </w:p>
         </w:tc>
@@ -190,2231 +152,69 @@
       <w:tr>
         <w:tc>
           <w:tcPr>
-            <w:tcW w:type="dxa" w:w="1440"/>
-            <w:shd w:fill="FFFFFF"/>
+            <w:tcW w:type="dxa" w:w="2592"/>
+            <w:shd w:fill="F8FAFC"/>
             <w:tcMar>
-              <w:top w:w="100" w:type="dxa"/>
-              <w:bottom w:w="100" w:type="dxa"/>
-              <w:left w:w="120" w:type="dxa"/>
-              <w:right w:w="120" w:type="dxa"/>
+              <w:top w:w="90" w:type="dxa"/>
+              <w:bottom w:w="90" w:type="dxa"/>
+              <w:left w:w="150" w:type="dxa"/>
+              <w:right w:w="150" w:type="dxa"/>
             </w:tcMar>
-            <w:vAlign w:val="center"/>
           </w:tcPr>
           <w:p>
             <w:r>
               <w:rPr>
-                <w:rFonts w:ascii="Segoe UI" w:hAnsi="Segoe UI"/>
-                <w:color w:val="1B2B24"/>
-                <w:sz w:val="18"/>
+                <w:rFonts w:ascii="Arial" w:hAnsi="Arial"/>
+                <w:b/>
+                <w:color w:val="1E293B"/>
+                <w:sz w:val="17"/>
               </w:rPr>
-              <w:t>Step 1.1</w:t>
+              <w:t>GitHub Repository</w:t>
             </w:r>
           </w:p>
         </w:tc>
         <w:tc>
           <w:tcPr>
-            <w:tcW w:type="dxa" w:w="3168"/>
-            <w:shd w:fill="FFFFFF"/>
+            <w:tcW w:type="dxa" w:w="5184"/>
+            <w:shd w:fill="F8FAFC"/>
             <w:tcMar>
-              <w:top w:w="100" w:type="dxa"/>
-              <w:bottom w:w="100" w:type="dxa"/>
-              <w:left w:w="120" w:type="dxa"/>
-              <w:right w:w="120" w:type="dxa"/>
+              <w:top w:w="90" w:type="dxa"/>
+              <w:bottom w:w="90" w:type="dxa"/>
+              <w:left w:w="150" w:type="dxa"/>
+              <w:right w:w="150" w:type="dxa"/>
             </w:tcMar>
-            <w:vAlign w:val="center"/>
           </w:tcPr>
           <w:p>
             <w:r>
               <w:rPr>
-                <w:rFonts w:ascii="Consolas" w:hAnsi="Consolas"/>
-                <w:color w:val="1B2B24"/>
+                <w:rFonts w:ascii="Arial" w:hAnsi="Arial"/>
+                <w:color w:val="2563EB"/>
                 <w:sz w:val="17"/>
               </w:rPr>
-              <w:t>git status</w:t>
+              <w:t>https://github.com/ChahatModi18/sarathi-your-mental-wellness-companion</w:t>
             </w:r>
           </w:p>
         </w:tc>
         <w:tc>
           <w:tcPr>
-            <w:tcW w:type="dxa" w:w="3312"/>
-            <w:shd w:fill="FFFFFF"/>
+            <w:tcW w:type="dxa" w:w="2304"/>
+            <w:shd w:fill="F8FAFC"/>
             <w:tcMar>
-              <w:top w:w="100" w:type="dxa"/>
-              <w:bottom w:w="100" w:type="dxa"/>
-              <w:left w:w="120" w:type="dxa"/>
-              <w:right w:w="120" w:type="dxa"/>
-            </w:tcMar>
-            <w:vAlign w:val="center"/>
-          </w:tcPr>
-          <w:p>
-            <w:r>
-              <w:rPr>
-                <w:rFonts w:ascii="Segoe UI" w:hAnsi="Segoe UI"/>
-                <w:color w:val="1B2B24"/>
-                <w:sz w:val="18"/>
-              </w:rPr>
-              <w:t>Audits the current git working tree to inspect modified, untracked, or staged files.</w:t>
-            </w:r>
-          </w:p>
-        </w:tc>
-        <w:tc>
-          <w:tcPr>
-            <w:tcW w:type="dxa" w:w="2880"/>
-            <w:shd w:fill="FFFFFF"/>
-            <w:tcMar>
-              <w:top w:w="100" w:type="dxa"/>
-              <w:bottom w:w="100" w:type="dxa"/>
-              <w:left w:w="120" w:type="dxa"/>
-              <w:right w:w="120" w:type="dxa"/>
-            </w:tcMar>
-            <w:vAlign w:val="center"/>
-          </w:tcPr>
-          <w:p>
-            <w:r>
-              <w:rPr>
-                <w:rFonts w:ascii="Segoe UI" w:hAnsi="Segoe UI"/>
-                <w:color w:val="1B2B24"/>
-                <w:sz w:val="18"/>
-              </w:rPr>
-              <w:t>Confirms modified files; verifies that .env, archive, and food_ordering_platform are not tracked.</w:t>
-            </w:r>
-          </w:p>
-        </w:tc>
-      </w:tr>
-      <w:tr>
-        <w:tc>
-          <w:tcPr>
-            <w:tcW w:type="dxa" w:w="1440"/>
-            <w:shd w:fill="F4F7F5"/>
-            <w:tcMar>
-              <w:top w:w="100" w:type="dxa"/>
-              <w:bottom w:w="100" w:type="dxa"/>
-              <w:left w:w="120" w:type="dxa"/>
-              <w:right w:w="120" w:type="dxa"/>
-            </w:tcMar>
-            <w:vAlign w:val="center"/>
-          </w:tcPr>
-          <w:p>
-            <w:r>
-              <w:rPr>
-                <w:rFonts w:ascii="Segoe UI" w:hAnsi="Segoe UI"/>
-                <w:color w:val="1B2B24"/>
-                <w:sz w:val="18"/>
-              </w:rPr>
-              <w:t>Step 1.2</w:t>
-            </w:r>
-          </w:p>
-        </w:tc>
-        <w:tc>
-          <w:tcPr>
-            <w:tcW w:type="dxa" w:w="3168"/>
-            <w:shd w:fill="F4F7F5"/>
-            <w:tcMar>
-              <w:top w:w="100" w:type="dxa"/>
-              <w:bottom w:w="100" w:type="dxa"/>
-              <w:left w:w="120" w:type="dxa"/>
-              <w:right w:w="120" w:type="dxa"/>
-            </w:tcMar>
-            <w:vAlign w:val="center"/>
-          </w:tcPr>
-          <w:p>
-            <w:r>
-              <w:rPr>
-                <w:rFonts w:ascii="Consolas" w:hAnsi="Consolas"/>
-                <w:color w:val="1B2B24"/>
-                <w:sz w:val="17"/>
-              </w:rPr>
-              <w:t>Verify .gitignore</w:t>
-            </w:r>
-          </w:p>
-        </w:tc>
-        <w:tc>
-          <w:tcPr>
-            <w:tcW w:type="dxa" w:w="3312"/>
-            <w:shd w:fill="F4F7F5"/>
-            <w:tcMar>
-              <w:top w:w="100" w:type="dxa"/>
-              <w:bottom w:w="100" w:type="dxa"/>
-              <w:left w:w="120" w:type="dxa"/>
-              <w:right w:w="120" w:type="dxa"/>
-            </w:tcMar>
-            <w:vAlign w:val="center"/>
-          </w:tcPr>
-          <w:p>
-            <w:r>
-              <w:rPr>
-                <w:rFonts w:ascii="Segoe UI" w:hAnsi="Segoe UI"/>
-                <w:color w:val="1B2B24"/>
-                <w:sz w:val="18"/>
-              </w:rPr>
-              <w:t>Confirms that sensitive files (.env, *.log, *.key, secrets/) are shielded from tracking.</w:t>
-            </w:r>
-          </w:p>
-        </w:tc>
-        <w:tc>
-          <w:tcPr>
-            <w:tcW w:type="dxa" w:w="2880"/>
-            <w:shd w:fill="F4F7F5"/>
-            <w:tcMar>
-              <w:top w:w="100" w:type="dxa"/>
-              <w:bottom w:w="100" w:type="dxa"/>
-              <w:left w:w="120" w:type="dxa"/>
-              <w:right w:w="120" w:type="dxa"/>
-            </w:tcMar>
-            <w:vAlign w:val="center"/>
-          </w:tcPr>
-          <w:p>
-            <w:r>
-              <w:rPr>
-                <w:rFonts w:ascii="Segoe UI" w:hAnsi="Segoe UI"/>
-                <w:color w:val="1B2B24"/>
-                <w:sz w:val="18"/>
-              </w:rPr>
-              <w:t>.gitignore contains rules excluding .env, *.db, Lib/, Scripts/, and credentials.</w:t>
-            </w:r>
-          </w:p>
-        </w:tc>
-      </w:tr>
-      <w:tr>
-        <w:tc>
-          <w:tcPr>
-            <w:tcW w:type="dxa" w:w="1440"/>
-            <w:shd w:fill="FFFFFF"/>
-            <w:tcMar>
-              <w:top w:w="100" w:type="dxa"/>
-              <w:bottom w:w="100" w:type="dxa"/>
-              <w:left w:w="120" w:type="dxa"/>
-              <w:right w:w="120" w:type="dxa"/>
-            </w:tcMar>
-            <w:vAlign w:val="center"/>
-          </w:tcPr>
-          <w:p>
-            <w:r>
-              <w:rPr>
-                <w:rFonts w:ascii="Segoe UI" w:hAnsi="Segoe UI"/>
-                <w:color w:val="1B2B24"/>
-                <w:sz w:val="18"/>
-              </w:rPr>
-              <w:t>Step 1.3</w:t>
-            </w:r>
-          </w:p>
-        </w:tc>
-        <w:tc>
-          <w:tcPr>
-            <w:tcW w:type="dxa" w:w="3168"/>
-            <w:shd w:fill="FFFFFF"/>
-            <w:tcMar>
-              <w:top w:w="100" w:type="dxa"/>
-              <w:bottom w:w="100" w:type="dxa"/>
-              <w:left w:w="120" w:type="dxa"/>
-              <w:right w:w="120" w:type="dxa"/>
-            </w:tcMar>
-            <w:vAlign w:val="center"/>
-          </w:tcPr>
-          <w:p>
-            <w:r>
-              <w:rPr>
-                <w:rFonts w:ascii="Consolas" w:hAnsi="Consolas"/>
-                <w:color w:val="1B2B24"/>
-                <w:sz w:val="17"/>
-              </w:rPr>
-              <w:t>git add .</w:t>
-            </w:r>
-          </w:p>
-        </w:tc>
-        <w:tc>
-          <w:tcPr>
-            <w:tcW w:type="dxa" w:w="3312"/>
-            <w:shd w:fill="FFFFFF"/>
-            <w:tcMar>
-              <w:top w:w="100" w:type="dxa"/>
-              <w:bottom w:w="100" w:type="dxa"/>
-              <w:left w:w="120" w:type="dxa"/>
-              <w:right w:w="120" w:type="dxa"/>
-            </w:tcMar>
-            <w:vAlign w:val="center"/>
-          </w:tcPr>
-          <w:p>
-            <w:r>
-              <w:rPr>
-                <w:rFonts w:ascii="Segoe UI" w:hAnsi="Segoe UI"/>
-                <w:color w:val="1B2B24"/>
-                <w:sz w:val="18"/>
-              </w:rPr>
-              <w:t>Stages all sanitized production project files (templates, backend services, tests, docs, assets).</w:t>
-            </w:r>
-          </w:p>
-        </w:tc>
-        <w:tc>
-          <w:tcPr>
-            <w:tcW w:type="dxa" w:w="2880"/>
-            <w:shd w:fill="FFFFFF"/>
-            <w:tcMar>
-              <w:top w:w="100" w:type="dxa"/>
-              <w:bottom w:w="100" w:type="dxa"/>
-              <w:left w:w="120" w:type="dxa"/>
-              <w:right w:w="120" w:type="dxa"/>
-            </w:tcMar>
-            <w:vAlign w:val="center"/>
-          </w:tcPr>
-          <w:p>
-            <w:r>
-              <w:rPr>
-                <w:rFonts w:ascii="Segoe UI" w:hAnsi="Segoe UI"/>
-                <w:color w:val="1B2B24"/>
-                <w:sz w:val="18"/>
-              </w:rPr>
-              <w:t>All 157 project files staged cleanly without sensitive assets.</w:t>
-            </w:r>
-          </w:p>
-        </w:tc>
-      </w:tr>
-      <w:tr>
-        <w:tc>
-          <w:tcPr>
-            <w:tcW w:type="dxa" w:w="1440"/>
-            <w:shd w:fill="F4F7F5"/>
-            <w:tcMar>
-              <w:top w:w="100" w:type="dxa"/>
-              <w:bottom w:w="100" w:type="dxa"/>
-              <w:left w:w="120" w:type="dxa"/>
-              <w:right w:w="120" w:type="dxa"/>
-            </w:tcMar>
-            <w:vAlign w:val="center"/>
-          </w:tcPr>
-          <w:p>
-            <w:r>
-              <w:rPr>
-                <w:rFonts w:ascii="Segoe UI" w:hAnsi="Segoe UI"/>
-                <w:color w:val="1B2B24"/>
-                <w:sz w:val="18"/>
-              </w:rPr>
-              <w:t>Step 1.4</w:t>
-            </w:r>
-          </w:p>
-        </w:tc>
-        <w:tc>
-          <w:tcPr>
-            <w:tcW w:type="dxa" w:w="3168"/>
-            <w:shd w:fill="F4F7F5"/>
-            <w:tcMar>
-              <w:top w:w="100" w:type="dxa"/>
-              <w:bottom w:w="100" w:type="dxa"/>
-              <w:left w:w="120" w:type="dxa"/>
-              <w:right w:w="120" w:type="dxa"/>
-            </w:tcMar>
-            <w:vAlign w:val="center"/>
-          </w:tcPr>
-          <w:p>
-            <w:r>
-              <w:rPr>
-                <w:rFonts w:ascii="Consolas" w:hAnsi="Consolas"/>
-                <w:color w:val="1B2B24"/>
-                <w:sz w:val="17"/>
-              </w:rPr>
-              <w:t>git commit -m "feat: release Sarathi mental wellness platform..."</w:t>
-            </w:r>
-          </w:p>
-        </w:tc>
-        <w:tc>
-          <w:tcPr>
-            <w:tcW w:type="dxa" w:w="3312"/>
-            <w:shd w:fill="F4F7F5"/>
-            <w:tcMar>
-              <w:top w:w="100" w:type="dxa"/>
-              <w:bottom w:w="100" w:type="dxa"/>
-              <w:left w:w="120" w:type="dxa"/>
-              <w:right w:w="120" w:type="dxa"/>
-            </w:tcMar>
-            <w:vAlign w:val="center"/>
-          </w:tcPr>
-          <w:p>
-            <w:r>
-              <w:rPr>
-                <w:rFonts w:ascii="Segoe UI" w:hAnsi="Segoe UI"/>
-                <w:color w:val="1B2B24"/>
-                <w:sz w:val="18"/>
-              </w:rPr>
-              <w:t>Creates a cryptographic commit snapshot of the clean release on the local repository.</w:t>
-            </w:r>
-          </w:p>
-        </w:tc>
-        <w:tc>
-          <w:tcPr>
-            <w:tcW w:type="dxa" w:w="2880"/>
-            <w:shd w:fill="F4F7F5"/>
-            <w:tcMar>
-              <w:top w:w="100" w:type="dxa"/>
-              <w:bottom w:w="100" w:type="dxa"/>
-              <w:left w:w="120" w:type="dxa"/>
-              <w:right w:w="120" w:type="dxa"/>
-            </w:tcMar>
-            <w:vAlign w:val="center"/>
-          </w:tcPr>
-          <w:p>
-            <w:r>
-              <w:rPr>
-                <w:rFonts w:ascii="Segoe UI" w:hAnsi="Segoe UI"/>
-                <w:color w:val="1B2B24"/>
-                <w:sz w:val="18"/>
-              </w:rPr>
-              <w:t>[master (root-commit)] 157 files changed, 47,812 insertions(+).</w:t>
-            </w:r>
-          </w:p>
-        </w:tc>
-      </w:tr>
-      <w:tr>
-        <w:tc>
-          <w:tcPr>
-            <w:tcW w:type="dxa" w:w="1440"/>
-            <w:shd w:fill="FFFFFF"/>
-            <w:tcMar>
-              <w:top w:w="100" w:type="dxa"/>
-              <w:bottom w:w="100" w:type="dxa"/>
-              <w:left w:w="120" w:type="dxa"/>
-              <w:right w:w="120" w:type="dxa"/>
-            </w:tcMar>
-            <w:vAlign w:val="center"/>
-          </w:tcPr>
-          <w:p>
-            <w:r>
-              <w:rPr>
-                <w:rFonts w:ascii="Segoe UI" w:hAnsi="Segoe UI"/>
-                <w:color w:val="1B2B24"/>
-                <w:sz w:val="18"/>
-              </w:rPr>
-              <w:t>Step 1.5</w:t>
-            </w:r>
-          </w:p>
-        </w:tc>
-        <w:tc>
-          <w:tcPr>
-            <w:tcW w:type="dxa" w:w="3168"/>
-            <w:shd w:fill="FFFFFF"/>
-            <w:tcMar>
-              <w:top w:w="100" w:type="dxa"/>
-              <w:bottom w:w="100" w:type="dxa"/>
-              <w:left w:w="120" w:type="dxa"/>
-              <w:right w:w="120" w:type="dxa"/>
-            </w:tcMar>
-            <w:vAlign w:val="center"/>
-          </w:tcPr>
-          <w:p>
-            <w:r>
-              <w:rPr>
-                <w:rFonts w:ascii="Consolas" w:hAnsi="Consolas"/>
-                <w:color w:val="1B2B24"/>
-                <w:sz w:val="17"/>
-              </w:rPr>
-              <w:t>git branch -M main</w:t>
-            </w:r>
-          </w:p>
-        </w:tc>
-        <w:tc>
-          <w:tcPr>
-            <w:tcW w:type="dxa" w:w="3312"/>
-            <w:shd w:fill="FFFFFF"/>
-            <w:tcMar>
-              <w:top w:w="100" w:type="dxa"/>
-              <w:bottom w:w="100" w:type="dxa"/>
-              <w:left w:w="120" w:type="dxa"/>
-              <w:right w:w="120" w:type="dxa"/>
-            </w:tcMar>
-            <w:vAlign w:val="center"/>
-          </w:tcPr>
-          <w:p>
-            <w:r>
-              <w:rPr>
-                <w:rFonts w:ascii="Segoe UI" w:hAnsi="Segoe UI"/>
-                <w:color w:val="1B2B24"/>
-                <w:sz w:val="18"/>
-              </w:rPr>
-              <w:t>Renames the default primary branch to 'main' conforming to modern GitHub standards.</w:t>
-            </w:r>
-          </w:p>
-        </w:tc>
-        <w:tc>
-          <w:tcPr>
-            <w:tcW w:type="dxa" w:w="2880"/>
-            <w:shd w:fill="FFFFFF"/>
-            <w:tcMar>
-              <w:top w:w="100" w:type="dxa"/>
-              <w:bottom w:w="100" w:type="dxa"/>
-              <w:left w:w="120" w:type="dxa"/>
-              <w:right w:w="120" w:type="dxa"/>
-            </w:tcMar>
-            <w:vAlign w:val="center"/>
-          </w:tcPr>
-          <w:p>
-            <w:r>
-              <w:rPr>
-                <w:rFonts w:ascii="Segoe UI" w:hAnsi="Segoe UI"/>
-                <w:color w:val="1B2B24"/>
-                <w:sz w:val="18"/>
-              </w:rPr>
-              <w:t>Active branch identifier switches to 'main'.</w:t>
-            </w:r>
-          </w:p>
-        </w:tc>
-      </w:tr>
-      <w:tr>
-        <w:tc>
-          <w:tcPr>
-            <w:tcW w:type="dxa" w:w="1440"/>
-            <w:shd w:fill="F4F7F5"/>
-            <w:tcMar>
-              <w:top w:w="100" w:type="dxa"/>
-              <w:bottom w:w="100" w:type="dxa"/>
-              <w:left w:w="120" w:type="dxa"/>
-              <w:right w:w="120" w:type="dxa"/>
-            </w:tcMar>
-            <w:vAlign w:val="center"/>
-          </w:tcPr>
-          <w:p>
-            <w:r>
-              <w:rPr>
-                <w:rFonts w:ascii="Segoe UI" w:hAnsi="Segoe UI"/>
-                <w:color w:val="1B2B24"/>
-                <w:sz w:val="18"/>
-              </w:rPr>
-              <w:t>Step 1.6</w:t>
-              <w:br/>
-              <w:t>(Option A)</w:t>
-            </w:r>
-          </w:p>
-        </w:tc>
-        <w:tc>
-          <w:tcPr>
-            <w:tcW w:type="dxa" w:w="3168"/>
-            <w:shd w:fill="F4F7F5"/>
-            <w:tcMar>
-              <w:top w:w="100" w:type="dxa"/>
-              <w:bottom w:w="100" w:type="dxa"/>
-              <w:left w:w="120" w:type="dxa"/>
-              <w:right w:w="120" w:type="dxa"/>
-            </w:tcMar>
-            <w:vAlign w:val="center"/>
-          </w:tcPr>
-          <w:p>
-            <w:r>
-              <w:rPr>
-                <w:rFonts w:ascii="Consolas" w:hAnsi="Consolas"/>
-                <w:color w:val="1B2B24"/>
-                <w:sz w:val="17"/>
-              </w:rPr>
-              <w:t>gh repo create sarathi-your-mental-wellness-companion --public --source=. --remote=origin --description="Sarathi: Your mental Wellness Companion [research based project]"</w:t>
-            </w:r>
-          </w:p>
-        </w:tc>
-        <w:tc>
-          <w:tcPr>
-            <w:tcW w:type="dxa" w:w="3312"/>
-            <w:shd w:fill="F4F7F5"/>
-            <w:tcMar>
-              <w:top w:w="100" w:type="dxa"/>
-              <w:bottom w:w="100" w:type="dxa"/>
-              <w:left w:w="120" w:type="dxa"/>
-              <w:right w:w="120" w:type="dxa"/>
-            </w:tcMar>
-            <w:vAlign w:val="center"/>
-          </w:tcPr>
-          <w:p>
-            <w:r>
-              <w:rPr>
-                <w:rFonts w:ascii="Segoe UI" w:hAnsi="Segoe UI"/>
-                <w:color w:val="1B2B24"/>
-                <w:sz w:val="18"/>
-              </w:rPr>
-              <w:t>CLI Method: Automatically creates the public GitHub repository under your account and binds origin remote.</w:t>
-            </w:r>
-          </w:p>
-        </w:tc>
-        <w:tc>
-          <w:tcPr>
-            <w:tcW w:type="dxa" w:w="2880"/>
-            <w:shd w:fill="F4F7F5"/>
-            <w:tcMar>
-              <w:top w:w="100" w:type="dxa"/>
-              <w:bottom w:w="100" w:type="dxa"/>
-              <w:left w:w="120" w:type="dxa"/>
-              <w:right w:w="120" w:type="dxa"/>
-            </w:tcMar>
-            <w:vAlign w:val="center"/>
-          </w:tcPr>
-          <w:p>
-            <w:r>
-              <w:rPr>
-                <w:rFonts w:ascii="Segoe UI" w:hAnsi="Segoe UI"/>
-                <w:color w:val="1B2B24"/>
-                <w:sz w:val="18"/>
-              </w:rPr>
-              <w:t>✓ Created repository ChahatModi18/sarathi-your-mental-wellness-companion on GitHub.</w:t>
-            </w:r>
-          </w:p>
-        </w:tc>
-      </w:tr>
-      <w:tr>
-        <w:tc>
-          <w:tcPr>
-            <w:tcW w:type="dxa" w:w="1440"/>
-            <w:shd w:fill="FFFFFF"/>
-            <w:tcMar>
-              <w:top w:w="100" w:type="dxa"/>
-              <w:bottom w:w="100" w:type="dxa"/>
-              <w:left w:w="120" w:type="dxa"/>
-              <w:right w:w="120" w:type="dxa"/>
-            </w:tcMar>
-            <w:vAlign w:val="center"/>
-          </w:tcPr>
-          <w:p>
-            <w:r>
-              <w:rPr>
-                <w:rFonts w:ascii="Segoe UI" w:hAnsi="Segoe UI"/>
-                <w:color w:val="1B2B24"/>
-                <w:sz w:val="18"/>
-              </w:rPr>
-              <w:t>Step 1.6</w:t>
-              <w:br/>
-              <w:t>(Option B)</w:t>
-            </w:r>
-          </w:p>
-        </w:tc>
-        <w:tc>
-          <w:tcPr>
-            <w:tcW w:type="dxa" w:w="3168"/>
-            <w:shd w:fill="FFFFFF"/>
-            <w:tcMar>
-              <w:top w:w="100" w:type="dxa"/>
-              <w:bottom w:w="100" w:type="dxa"/>
-              <w:left w:w="120" w:type="dxa"/>
-              <w:right w:w="120" w:type="dxa"/>
-            </w:tcMar>
-            <w:vAlign w:val="center"/>
-          </w:tcPr>
-          <w:p>
-            <w:r>
-              <w:rPr>
-                <w:rFonts w:ascii="Consolas" w:hAnsi="Consolas"/>
-                <w:color w:val="1B2B24"/>
-                <w:sz w:val="17"/>
-              </w:rPr>
-              <w:t>1. Open github.com/new</w:t>
-              <w:br/>
-              <w:t>2. Name: sarathi-your-mental-wellness-companion</w:t>
-              <w:br/>
-              <w:t>3. Description: Sarathi: Your mental Wellness Companion [research based project]</w:t>
-              <w:br/>
-              <w:t>4. Click Create repository</w:t>
-            </w:r>
-          </w:p>
-        </w:tc>
-        <w:tc>
-          <w:tcPr>
-            <w:tcW w:type="dxa" w:w="3312"/>
-            <w:shd w:fill="FFFFFF"/>
-            <w:tcMar>
-              <w:top w:w="100" w:type="dxa"/>
-              <w:bottom w:w="100" w:type="dxa"/>
-              <w:left w:w="120" w:type="dxa"/>
-              <w:right w:w="120" w:type="dxa"/>
-            </w:tcMar>
-            <w:vAlign w:val="center"/>
-          </w:tcPr>
-          <w:p>
-            <w:r>
-              <w:rPr>
-                <w:rFonts w:ascii="Segoe UI" w:hAnsi="Segoe UI"/>
-                <w:color w:val="1B2B24"/>
-                <w:sz w:val="18"/>
-              </w:rPr>
-              <w:t>Web UI Method: Creates the remote repository shell on GitHub for users without GitHub CLI installed.</w:t>
-            </w:r>
-          </w:p>
-        </w:tc>
-        <w:tc>
-          <w:tcPr>
-            <w:tcW w:type="dxa" w:w="2880"/>
-            <w:shd w:fill="FFFFFF"/>
-            <w:tcMar>
-              <w:top w:w="100" w:type="dxa"/>
-              <w:bottom w:w="100" w:type="dxa"/>
-              <w:left w:w="120" w:type="dxa"/>
-              <w:right w:w="120" w:type="dxa"/>
-            </w:tcMar>
-            <w:vAlign w:val="center"/>
-          </w:tcPr>
-          <w:p>
-            <w:r>
-              <w:rPr>
-                <w:rFonts w:ascii="Segoe UI" w:hAnsi="Segoe UI"/>
-                <w:color w:val="1B2B24"/>
-                <w:sz w:val="18"/>
-              </w:rPr>
-              <w:t>GitHub initializes the empty repository and displays remote push commands.</w:t>
-            </w:r>
-          </w:p>
-        </w:tc>
-      </w:tr>
-      <w:tr>
-        <w:tc>
-          <w:tcPr>
-            <w:tcW w:type="dxa" w:w="1440"/>
-            <w:shd w:fill="F4F7F5"/>
-            <w:tcMar>
-              <w:top w:w="100" w:type="dxa"/>
-              <w:bottom w:w="100" w:type="dxa"/>
-              <w:left w:w="120" w:type="dxa"/>
-              <w:right w:w="120" w:type="dxa"/>
-            </w:tcMar>
-            <w:vAlign w:val="center"/>
-          </w:tcPr>
-          <w:p>
-            <w:r>
-              <w:rPr>
-                <w:rFonts w:ascii="Segoe UI" w:hAnsi="Segoe UI"/>
-                <w:color w:val="1B2B24"/>
-                <w:sz w:val="18"/>
-              </w:rPr>
-              <w:t>Step 1.7</w:t>
-            </w:r>
-          </w:p>
-        </w:tc>
-        <w:tc>
-          <w:tcPr>
-            <w:tcW w:type="dxa" w:w="3168"/>
-            <w:shd w:fill="F4F7F5"/>
-            <w:tcMar>
-              <w:top w:w="100" w:type="dxa"/>
-              <w:bottom w:w="100" w:type="dxa"/>
-              <w:left w:w="120" w:type="dxa"/>
-              <w:right w:w="120" w:type="dxa"/>
-            </w:tcMar>
-            <w:vAlign w:val="center"/>
-          </w:tcPr>
-          <w:p>
-            <w:r>
-              <w:rPr>
-                <w:rFonts w:ascii="Consolas" w:hAnsi="Consolas"/>
-                <w:color w:val="1B2B24"/>
-                <w:sz w:val="17"/>
-              </w:rPr>
-              <w:t>git remote set-url origin https://github.com/ChahatModi18/sarathi-your-mental-wellness-companion.git</w:t>
-            </w:r>
-          </w:p>
-        </w:tc>
-        <w:tc>
-          <w:tcPr>
-            <w:tcW w:type="dxa" w:w="3312"/>
-            <w:shd w:fill="F4F7F5"/>
-            <w:tcMar>
-              <w:top w:w="100" w:type="dxa"/>
-              <w:bottom w:w="100" w:type="dxa"/>
-              <w:left w:w="120" w:type="dxa"/>
-              <w:right w:w="120" w:type="dxa"/>
-            </w:tcMar>
-            <w:vAlign w:val="center"/>
-          </w:tcPr>
-          <w:p>
-            <w:r>
-              <w:rPr>
-                <w:rFonts w:ascii="Segoe UI" w:hAnsi="Segoe UI"/>
-                <w:color w:val="1B2B24"/>
-                <w:sz w:val="18"/>
-              </w:rPr>
-              <w:t>Configures your local git origin remote to point to the newly created GitHub repository.</w:t>
-            </w:r>
-          </w:p>
-        </w:tc>
-        <w:tc>
-          <w:tcPr>
-            <w:tcW w:type="dxa" w:w="2880"/>
-            <w:shd w:fill="F4F7F5"/>
-            <w:tcMar>
-              <w:top w:w="100" w:type="dxa"/>
-              <w:bottom w:w="100" w:type="dxa"/>
-              <w:left w:w="120" w:type="dxa"/>
-              <w:right w:w="120" w:type="dxa"/>
-            </w:tcMar>
-            <w:vAlign w:val="center"/>
-          </w:tcPr>
-          <w:p>
-            <w:r>
-              <w:rPr>
-                <w:rFonts w:ascii="Segoe UI" w:hAnsi="Segoe UI"/>
-                <w:color w:val="1B2B24"/>
-                <w:sz w:val="18"/>
-              </w:rPr>
-              <w:t>git remote -v displays fetch and push URLs matching the target repository.</w:t>
-            </w:r>
-          </w:p>
-        </w:tc>
-      </w:tr>
-      <w:tr>
-        <w:tc>
-          <w:tcPr>
-            <w:tcW w:type="dxa" w:w="1440"/>
-            <w:shd w:fill="FFFFFF"/>
-            <w:tcMar>
-              <w:top w:w="100" w:type="dxa"/>
-              <w:bottom w:w="100" w:type="dxa"/>
-              <w:left w:w="120" w:type="dxa"/>
-              <w:right w:w="120" w:type="dxa"/>
-            </w:tcMar>
-            <w:vAlign w:val="center"/>
-          </w:tcPr>
-          <w:p>
-            <w:r>
-              <w:rPr>
-                <w:rFonts w:ascii="Segoe UI" w:hAnsi="Segoe UI"/>
-                <w:color w:val="1B2B24"/>
-                <w:sz w:val="18"/>
-              </w:rPr>
-              <w:t>Step 1.8</w:t>
-            </w:r>
-          </w:p>
-        </w:tc>
-        <w:tc>
-          <w:tcPr>
-            <w:tcW w:type="dxa" w:w="3168"/>
-            <w:shd w:fill="FFFFFF"/>
-            <w:tcMar>
-              <w:top w:w="100" w:type="dxa"/>
-              <w:bottom w:w="100" w:type="dxa"/>
-              <w:left w:w="120" w:type="dxa"/>
-              <w:right w:w="120" w:type="dxa"/>
-            </w:tcMar>
-            <w:vAlign w:val="center"/>
-          </w:tcPr>
-          <w:p>
-            <w:r>
-              <w:rPr>
-                <w:rFonts w:ascii="Consolas" w:hAnsi="Consolas"/>
-                <w:color w:val="1B2B24"/>
-                <w:sz w:val="17"/>
-              </w:rPr>
-              <w:t>git push -u origin main</w:t>
-            </w:r>
-          </w:p>
-        </w:tc>
-        <w:tc>
-          <w:tcPr>
-            <w:tcW w:type="dxa" w:w="3312"/>
-            <w:shd w:fill="FFFFFF"/>
-            <w:tcMar>
-              <w:top w:w="100" w:type="dxa"/>
-              <w:bottom w:w="100" w:type="dxa"/>
-              <w:left w:w="120" w:type="dxa"/>
-              <w:right w:w="120" w:type="dxa"/>
-            </w:tcMar>
-            <w:vAlign w:val="center"/>
-          </w:tcPr>
-          <w:p>
-            <w:r>
-              <w:rPr>
-                <w:rFonts w:ascii="Segoe UI" w:hAnsi="Segoe UI"/>
-                <w:color w:val="1B2B24"/>
-                <w:sz w:val="18"/>
-              </w:rPr>
-              <w:t>Pushes the committed codebase, 58 passing tests, docs, and assets to GitHub main branch.</w:t>
-            </w:r>
-          </w:p>
-        </w:tc>
-        <w:tc>
-          <w:tcPr>
-            <w:tcW w:type="dxa" w:w="2880"/>
-            <w:shd w:fill="FFFFFF"/>
-            <w:tcMar>
-              <w:top w:w="100" w:type="dxa"/>
-              <w:bottom w:w="100" w:type="dxa"/>
-              <w:left w:w="120" w:type="dxa"/>
-              <w:right w:w="120" w:type="dxa"/>
-            </w:tcMar>
-            <w:vAlign w:val="center"/>
-          </w:tcPr>
-          <w:p>
-            <w:r>
-              <w:rPr>
-                <w:rFonts w:ascii="Segoe UI" w:hAnsi="Segoe UI"/>
-                <w:color w:val="1B2B24"/>
-                <w:sz w:val="18"/>
-              </w:rPr>
-              <w:t>To https://github.com/ChahatModi18/... * [new branch] main -&gt; main.</w:t>
-            </w:r>
-          </w:p>
-        </w:tc>
-      </w:tr>
-    </w:tbl>
-    <w:p>
-      <w:pPr>
-        <w:spacing w:after="280"/>
-      </w:pPr>
-    </w:p>
-    <w:p>
-      <w:pPr>
-        <w:spacing w:after="160"/>
-      </w:pPr>
-      <w:r>
-        <w:rPr>
-          <w:rFonts w:ascii="Segoe UI" w:hAnsi="Segoe UI"/>
-          <w:b/>
-          <w:color w:val="284B3F"/>
-          <w:sz w:val="28"/>
-        </w:rPr>
-        <w:t>2. Vercel Deployment Commands (Tabular Reference)</w:t>
-      </w:r>
-    </w:p>
-    <w:p>
-      <w:pPr>
-        <w:spacing w:after="200"/>
-      </w:pPr>
-      <w:r>
-        <w:rPr>
-          <w:rFonts w:ascii="Segoe UI" w:hAnsi="Segoe UI"/>
-          <w:sz w:val="20"/>
-        </w:rPr>
-        <w:t>Vercel executes the application serverless via vercel.json using @vercel/python. You can deploy via the CLI or connect your GitHub repository for automatic continuous integration.</w:t>
-      </w:r>
-    </w:p>
-    <w:tbl>
-      <w:tblPr>
-        <w:tblW w:type="auto" w:w="0"/>
-        <w:jc w:val="center"/>
-        <w:tblLook w:firstColumn="1" w:firstRow="1" w:lastColumn="0" w:lastRow="0" w:noHBand="0" w:noVBand="1" w:val="04A0"/>
-        <w:tblBorders>
-          <w:top w:val="single" w:sz="6" w:space="0" w:color="D1DCD6"/>
-          <w:bottom w:val="single" w:sz="6" w:space="0" w:color="D1DCD6"/>
-          <w:insideH w:val="single" w:sz="4" w:space="0" w:color="D1DCD6"/>
-          <w:insideV w:val="none"/>
-          <w:left w:val="none"/>
-          <w:right w:val="none"/>
-        </w:tblBorders>
-      </w:tblPr>
-      <w:tblGrid>
-        <w:gridCol w:w="2484"/>
-        <w:gridCol w:w="2484"/>
-        <w:gridCol w:w="2484"/>
-        <w:gridCol w:w="2484"/>
-      </w:tblGrid>
-      <w:tr>
-        <w:tc>
-          <w:tcPr>
-            <w:tcW w:type="dxa" w:w="1440"/>
-            <w:shd w:fill="284B3F"/>
-            <w:tcMar>
-              <w:top w:w="140" w:type="dxa"/>
-              <w:bottom w:w="140" w:type="dxa"/>
-              <w:left w:w="140" w:type="dxa"/>
-              <w:right w:w="140" w:type="dxa"/>
+              <w:top w:w="90" w:type="dxa"/>
+              <w:bottom w:w="90" w:type="dxa"/>
+              <w:left w:w="150" w:type="dxa"/>
+              <w:right w:w="150" w:type="dxa"/>
             </w:tcMar>
           </w:tcPr>
           <w:p>
             <w:r>
               <w:rPr>
-                <w:rFonts w:ascii="Segoe UI" w:hAnsi="Segoe UI"/>
+                <w:rFonts w:ascii="Arial" w:hAnsi="Arial"/>
                 <w:b/>
-                <w:color w:val="FFFFFF"/>
-                <w:sz w:val="19"/>
-              </w:rPr>
-              <w:t>Step #</w:t>
-            </w:r>
-          </w:p>
-        </w:tc>
-        <w:tc>
-          <w:tcPr>
-            <w:tcW w:type="dxa" w:w="3312"/>
-            <w:shd w:fill="284B3F"/>
-            <w:tcMar>
-              <w:top w:w="140" w:type="dxa"/>
-              <w:bottom w:w="140" w:type="dxa"/>
-              <w:left w:w="140" w:type="dxa"/>
-              <w:right w:w="140" w:type="dxa"/>
-            </w:tcMar>
-          </w:tcPr>
-          <w:p>
-            <w:r>
-              <w:rPr>
-                <w:rFonts w:ascii="Segoe UI" w:hAnsi="Segoe UI"/>
-                <w:b/>
-                <w:color w:val="FFFFFF"/>
-                <w:sz w:val="19"/>
-              </w:rPr>
-              <w:t>Command / Action</w:t>
-            </w:r>
-          </w:p>
-        </w:tc>
-        <w:tc>
-          <w:tcPr>
-            <w:tcW w:type="dxa" w:w="3168"/>
-            <w:shd w:fill="284B3F"/>
-            <w:tcMar>
-              <w:top w:w="140" w:type="dxa"/>
-              <w:bottom w:w="140" w:type="dxa"/>
-              <w:left w:w="140" w:type="dxa"/>
-              <w:right w:w="140" w:type="dxa"/>
-            </w:tcMar>
-          </w:tcPr>
-          <w:p>
-            <w:r>
-              <w:rPr>
-                <w:rFonts w:ascii="Segoe UI" w:hAnsi="Segoe UI"/>
-                <w:b/>
-                <w:color w:val="FFFFFF"/>
-                <w:sz w:val="19"/>
-              </w:rPr>
-              <w:t>Technical Purpose &amp; Function</w:t>
-            </w:r>
-          </w:p>
-        </w:tc>
-        <w:tc>
-          <w:tcPr>
-            <w:tcW w:type="dxa" w:w="2880"/>
-            <w:shd w:fill="284B3F"/>
-            <w:tcMar>
-              <w:top w:w="140" w:type="dxa"/>
-              <w:bottom w:w="140" w:type="dxa"/>
-              <w:left w:w="140" w:type="dxa"/>
-              <w:right w:w="140" w:type="dxa"/>
-            </w:tcMar>
-          </w:tcPr>
-          <w:p>
-            <w:r>
-              <w:rPr>
-                <w:rFonts w:ascii="Segoe UI" w:hAnsi="Segoe UI"/>
-                <w:b/>
-                <w:color w:val="FFFFFF"/>
-                <w:sz w:val="19"/>
-              </w:rPr>
-              <w:t>Verification &amp; Output</w:t>
-            </w:r>
-          </w:p>
-        </w:tc>
-      </w:tr>
-      <w:tr>
-        <w:tc>
-          <w:tcPr>
-            <w:tcW w:type="dxa" w:w="1440"/>
-            <w:shd w:fill="FFFFFF"/>
-            <w:tcMar>
-              <w:top w:w="100" w:type="dxa"/>
-              <w:bottom w:w="100" w:type="dxa"/>
-              <w:left w:w="120" w:type="dxa"/>
-              <w:right w:w="120" w:type="dxa"/>
-            </w:tcMar>
-            <w:vAlign w:val="center"/>
-          </w:tcPr>
-          <w:p>
-            <w:r>
-              <w:rPr>
-                <w:rFonts w:ascii="Segoe UI" w:hAnsi="Segoe UI"/>
-                <w:color w:val="1B2B24"/>
-                <w:sz w:val="18"/>
-              </w:rPr>
-              <w:t>Step 2.1</w:t>
-            </w:r>
-          </w:p>
-        </w:tc>
-        <w:tc>
-          <w:tcPr>
-            <w:tcW w:type="dxa" w:w="3312"/>
-            <w:shd w:fill="FFFFFF"/>
-            <w:tcMar>
-              <w:top w:w="100" w:type="dxa"/>
-              <w:bottom w:w="100" w:type="dxa"/>
-              <w:left w:w="120" w:type="dxa"/>
-              <w:right w:w="120" w:type="dxa"/>
-            </w:tcMar>
-            <w:vAlign w:val="center"/>
-          </w:tcPr>
-          <w:p>
-            <w:r>
-              <w:rPr>
-                <w:rFonts w:ascii="Consolas" w:hAnsi="Consolas"/>
-                <w:color w:val="1B2B24"/>
+                <w:color w:val="166534"/>
                 <w:sz w:val="17"/>
               </w:rPr>
-              <w:t>Verify vercel.json &amp; requirements.txt</w:t>
-            </w:r>
-          </w:p>
-        </w:tc>
-        <w:tc>
-          <w:tcPr>
-            <w:tcW w:type="dxa" w:w="3168"/>
-            <w:shd w:fill="FFFFFF"/>
-            <w:tcMar>
-              <w:top w:w="100" w:type="dxa"/>
-              <w:bottom w:w="100" w:type="dxa"/>
-              <w:left w:w="120" w:type="dxa"/>
-              <w:right w:w="120" w:type="dxa"/>
-            </w:tcMar>
-            <w:vAlign w:val="center"/>
-          </w:tcPr>
-          <w:p>
-            <w:r>
-              <w:rPr>
-                <w:rFonts w:ascii="Segoe UI" w:hAnsi="Segoe UI"/>
-                <w:color w:val="1B2B24"/>
-                <w:sz w:val="18"/>
-              </w:rPr>
-              <w:t>Ensures @vercel/python builds app.py and serverless requirements.txt excludes heavy desktop C-libraries.</w:t>
-            </w:r>
-          </w:p>
-        </w:tc>
-        <w:tc>
-          <w:tcPr>
-            <w:tcW w:type="dxa" w:w="2880"/>
-            <w:shd w:fill="FFFFFF"/>
-            <w:tcMar>
-              <w:top w:w="100" w:type="dxa"/>
-              <w:bottom w:w="100" w:type="dxa"/>
-              <w:left w:w="120" w:type="dxa"/>
-              <w:right w:w="120" w:type="dxa"/>
-            </w:tcMar>
-            <w:vAlign w:val="center"/>
-          </w:tcPr>
-          <w:p>
-            <w:r>
-              <w:rPr>
-                <w:rFonts w:ascii="Segoe UI" w:hAnsi="Segoe UI"/>
-                <w:color w:val="1B2B24"/>
-                <w:sz w:val="18"/>
-              </w:rPr>
-              <w:t>Root contains vercel.json; requirements.txt stays well under Vercel's 250MB limit.</w:t>
-            </w:r>
-          </w:p>
-        </w:tc>
-      </w:tr>
-      <w:tr>
-        <w:tc>
-          <w:tcPr>
-            <w:tcW w:type="dxa" w:w="1440"/>
-            <w:shd w:fill="F4F7F5"/>
-            <w:tcMar>
-              <w:top w:w="100" w:type="dxa"/>
-              <w:bottom w:w="100" w:type="dxa"/>
-              <w:left w:w="120" w:type="dxa"/>
-              <w:right w:w="120" w:type="dxa"/>
-            </w:tcMar>
-            <w:vAlign w:val="center"/>
-          </w:tcPr>
-          <w:p>
-            <w:r>
-              <w:rPr>
-                <w:rFonts w:ascii="Segoe UI" w:hAnsi="Segoe UI"/>
-                <w:color w:val="1B2B24"/>
-                <w:sz w:val="18"/>
-              </w:rPr>
-              <w:t>Step 2.2</w:t>
-            </w:r>
-          </w:p>
-        </w:tc>
-        <w:tc>
-          <w:tcPr>
-            <w:tcW w:type="dxa" w:w="3312"/>
-            <w:shd w:fill="F4F7F5"/>
-            <w:tcMar>
-              <w:top w:w="100" w:type="dxa"/>
-              <w:bottom w:w="100" w:type="dxa"/>
-              <w:left w:w="120" w:type="dxa"/>
-              <w:right w:w="120" w:type="dxa"/>
-            </w:tcMar>
-            <w:vAlign w:val="center"/>
-          </w:tcPr>
-          <w:p>
-            <w:r>
-              <w:rPr>
-                <w:rFonts w:ascii="Consolas" w:hAnsi="Consolas"/>
-                <w:color w:val="1B2B24"/>
-                <w:sz w:val="17"/>
-              </w:rPr>
-              <w:t>npx vercel login</w:t>
-            </w:r>
-          </w:p>
-        </w:tc>
-        <w:tc>
-          <w:tcPr>
-            <w:tcW w:type="dxa" w:w="3168"/>
-            <w:shd w:fill="F4F7F5"/>
-            <w:tcMar>
-              <w:top w:w="100" w:type="dxa"/>
-              <w:bottom w:w="100" w:type="dxa"/>
-              <w:left w:w="120" w:type="dxa"/>
-              <w:right w:w="120" w:type="dxa"/>
-            </w:tcMar>
-            <w:vAlign w:val="center"/>
-          </w:tcPr>
-          <w:p>
-            <w:r>
-              <w:rPr>
-                <w:rFonts w:ascii="Segoe UI" w:hAnsi="Segoe UI"/>
-                <w:color w:val="1B2B24"/>
-                <w:sz w:val="18"/>
-              </w:rPr>
-              <w:t>Authenticates your local terminal with your Vercel cloud account via browser token or email code.</w:t>
-            </w:r>
-          </w:p>
-        </w:tc>
-        <w:tc>
-          <w:tcPr>
-            <w:tcW w:type="dxa" w:w="2880"/>
-            <w:shd w:fill="F4F7F5"/>
-            <w:tcMar>
-              <w:top w:w="100" w:type="dxa"/>
-              <w:bottom w:w="100" w:type="dxa"/>
-              <w:left w:w="120" w:type="dxa"/>
-              <w:right w:w="120" w:type="dxa"/>
-            </w:tcMar>
-            <w:vAlign w:val="center"/>
-          </w:tcPr>
-          <w:p>
-            <w:r>
-              <w:rPr>
-                <w:rFonts w:ascii="Segoe UI" w:hAnsi="Segoe UI"/>
-                <w:color w:val="1B2B24"/>
-                <w:sz w:val="18"/>
-              </w:rPr>
-              <w:t>Success! Email confirmed / Logged in as your Vercel username.</w:t>
-            </w:r>
-          </w:p>
-        </w:tc>
-      </w:tr>
-      <w:tr>
-        <w:tc>
-          <w:tcPr>
-            <w:tcW w:type="dxa" w:w="1440"/>
-            <w:shd w:fill="FFFFFF"/>
-            <w:tcMar>
-              <w:top w:w="100" w:type="dxa"/>
-              <w:bottom w:w="100" w:type="dxa"/>
-              <w:left w:w="120" w:type="dxa"/>
-              <w:right w:w="120" w:type="dxa"/>
-            </w:tcMar>
-            <w:vAlign w:val="center"/>
-          </w:tcPr>
-          <w:p>
-            <w:r>
-              <w:rPr>
-                <w:rFonts w:ascii="Segoe UI" w:hAnsi="Segoe UI"/>
-                <w:color w:val="1B2B24"/>
-                <w:sz w:val="18"/>
-              </w:rPr>
-              <w:t>Step 2.3</w:t>
-            </w:r>
-          </w:p>
-        </w:tc>
-        <w:tc>
-          <w:tcPr>
-            <w:tcW w:type="dxa" w:w="3312"/>
-            <w:shd w:fill="FFFFFF"/>
-            <w:tcMar>
-              <w:top w:w="100" w:type="dxa"/>
-              <w:bottom w:w="100" w:type="dxa"/>
-              <w:left w:w="120" w:type="dxa"/>
-              <w:right w:w="120" w:type="dxa"/>
-            </w:tcMar>
-            <w:vAlign w:val="center"/>
-          </w:tcPr>
-          <w:p>
-            <w:r>
-              <w:rPr>
-                <w:rFonts w:ascii="Consolas" w:hAnsi="Consolas"/>
-                <w:color w:val="1B2B24"/>
-                <w:sz w:val="17"/>
-              </w:rPr>
-              <w:t>npx vercel link</w:t>
-            </w:r>
-          </w:p>
-        </w:tc>
-        <w:tc>
-          <w:tcPr>
-            <w:tcW w:type="dxa" w:w="3168"/>
-            <w:shd w:fill="FFFFFF"/>
-            <w:tcMar>
-              <w:top w:w="100" w:type="dxa"/>
-              <w:bottom w:w="100" w:type="dxa"/>
-              <w:left w:w="120" w:type="dxa"/>
-              <w:right w:w="120" w:type="dxa"/>
-            </w:tcMar>
-            <w:vAlign w:val="center"/>
-          </w:tcPr>
-          <w:p>
-            <w:r>
-              <w:rPr>
-                <w:rFonts w:ascii="Segoe UI" w:hAnsi="Segoe UI"/>
-                <w:color w:val="1B2B24"/>
-                <w:sz w:val="18"/>
-              </w:rPr>
-              <w:t>Links your local workspace to a Vercel project named sarathi-your-mental-wellness-companion.</w:t>
-            </w:r>
-          </w:p>
-        </w:tc>
-        <w:tc>
-          <w:tcPr>
-            <w:tcW w:type="dxa" w:w="2880"/>
-            <w:shd w:fill="FFFFFF"/>
-            <w:tcMar>
-              <w:top w:w="100" w:type="dxa"/>
-              <w:bottom w:w="100" w:type="dxa"/>
-              <w:left w:w="120" w:type="dxa"/>
-              <w:right w:w="120" w:type="dxa"/>
-            </w:tcMar>
-            <w:vAlign w:val="center"/>
-          </w:tcPr>
-          <w:p>
-            <w:r>
-              <w:rPr>
-                <w:rFonts w:ascii="Segoe UI" w:hAnsi="Segoe UI"/>
-                <w:color w:val="1B2B24"/>
-                <w:sz w:val="18"/>
-              </w:rPr>
-              <w:t>Prompts: Set up 'sarathi-your-mental-wellness-companion'? [Y/n] -&gt; links project.</w:t>
-            </w:r>
-          </w:p>
-        </w:tc>
-      </w:tr>
-      <w:tr>
-        <w:tc>
-          <w:tcPr>
-            <w:tcW w:type="dxa" w:w="1440"/>
-            <w:shd w:fill="F4F7F5"/>
-            <w:tcMar>
-              <w:top w:w="100" w:type="dxa"/>
-              <w:bottom w:w="100" w:type="dxa"/>
-              <w:left w:w="120" w:type="dxa"/>
-              <w:right w:w="120" w:type="dxa"/>
-            </w:tcMar>
-            <w:vAlign w:val="center"/>
-          </w:tcPr>
-          <w:p>
-            <w:r>
-              <w:rPr>
-                <w:rFonts w:ascii="Segoe UI" w:hAnsi="Segoe UI"/>
-                <w:color w:val="1B2B24"/>
-                <w:sz w:val="18"/>
-              </w:rPr>
-              <w:t>Step 2.4</w:t>
-            </w:r>
-          </w:p>
-        </w:tc>
-        <w:tc>
-          <w:tcPr>
-            <w:tcW w:type="dxa" w:w="3312"/>
-            <w:shd w:fill="F4F7F5"/>
-            <w:tcMar>
-              <w:top w:w="100" w:type="dxa"/>
-              <w:bottom w:w="100" w:type="dxa"/>
-              <w:left w:w="120" w:type="dxa"/>
-              <w:right w:w="120" w:type="dxa"/>
-            </w:tcMar>
-            <w:vAlign w:val="center"/>
-          </w:tcPr>
-          <w:p>
-            <w:r>
-              <w:rPr>
-                <w:rFonts w:ascii="Consolas" w:hAnsi="Consolas"/>
-                <w:color w:val="1B2B24"/>
-                <w:sz w:val="17"/>
-              </w:rPr>
-              <w:t>npx vercel env add FLASK_SECRET_KEY production</w:t>
-              <w:br/>
-              <w:t>npx vercel env add DB_HOST production</w:t>
-              <w:br/>
-              <w:t>npx vercel env add DB_USER production</w:t>
-              <w:br/>
-              <w:t>npx vercel env add DB_PASSWORD production</w:t>
-              <w:br/>
-              <w:t>npx vercel env add DB_NAME production</w:t>
-            </w:r>
-          </w:p>
-        </w:tc>
-        <w:tc>
-          <w:tcPr>
-            <w:tcW w:type="dxa" w:w="3168"/>
-            <w:shd w:fill="F4F7F5"/>
-            <w:tcMar>
-              <w:top w:w="100" w:type="dxa"/>
-              <w:bottom w:w="100" w:type="dxa"/>
-              <w:left w:w="120" w:type="dxa"/>
-              <w:right w:w="120" w:type="dxa"/>
-            </w:tcMar>
-            <w:vAlign w:val="center"/>
-          </w:tcPr>
-          <w:p>
-            <w:r>
-              <w:rPr>
-                <w:rFonts w:ascii="Segoe UI" w:hAnsi="Segoe UI"/>
-                <w:color w:val="1B2B24"/>
-                <w:sz w:val="18"/>
-              </w:rPr>
-              <w:t>Injects production encryption secrets and cloud MySQL connection variables into Vercel KMS.</w:t>
-            </w:r>
-          </w:p>
-        </w:tc>
-        <w:tc>
-          <w:tcPr>
-            <w:tcW w:type="dxa" w:w="2880"/>
-            <w:shd w:fill="F4F7F5"/>
-            <w:tcMar>
-              <w:top w:w="100" w:type="dxa"/>
-              <w:bottom w:w="100" w:type="dxa"/>
-              <w:left w:w="120" w:type="dxa"/>
-              <w:right w:w="120" w:type="dxa"/>
-            </w:tcMar>
-            <w:vAlign w:val="center"/>
-          </w:tcPr>
-          <w:p>
-            <w:r>
-              <w:rPr>
-                <w:rFonts w:ascii="Segoe UI" w:hAnsi="Segoe UI"/>
-                <w:color w:val="1B2B24"/>
-                <w:sz w:val="18"/>
-              </w:rPr>
-              <w:t>Environment variables securely encrypted in Vercel Cloud without appearing in Git.</w:t>
-            </w:r>
-          </w:p>
-        </w:tc>
-      </w:tr>
-      <w:tr>
-        <w:tc>
-          <w:tcPr>
-            <w:tcW w:type="dxa" w:w="1440"/>
-            <w:shd w:fill="FFFFFF"/>
-            <w:tcMar>
-              <w:top w:w="100" w:type="dxa"/>
-              <w:bottom w:w="100" w:type="dxa"/>
-              <w:left w:w="120" w:type="dxa"/>
-              <w:right w:w="120" w:type="dxa"/>
-            </w:tcMar>
-            <w:vAlign w:val="center"/>
-          </w:tcPr>
-          <w:p>
-            <w:r>
-              <w:rPr>
-                <w:rFonts w:ascii="Segoe UI" w:hAnsi="Segoe UI"/>
-                <w:color w:val="1B2B24"/>
-                <w:sz w:val="18"/>
-              </w:rPr>
-              <w:t>Step 2.5</w:t>
-            </w:r>
-          </w:p>
-        </w:tc>
-        <w:tc>
-          <w:tcPr>
-            <w:tcW w:type="dxa" w:w="3312"/>
-            <w:shd w:fill="FFFFFF"/>
-            <w:tcMar>
-              <w:top w:w="100" w:type="dxa"/>
-              <w:bottom w:w="100" w:type="dxa"/>
-              <w:left w:w="120" w:type="dxa"/>
-              <w:right w:w="120" w:type="dxa"/>
-            </w:tcMar>
-            <w:vAlign w:val="center"/>
-          </w:tcPr>
-          <w:p>
-            <w:r>
-              <w:rPr>
-                <w:rFonts w:ascii="Consolas" w:hAnsi="Consolas"/>
-                <w:color w:val="1B2B24"/>
-                <w:sz w:val="17"/>
-              </w:rPr>
-              <w:t>npx vercel</w:t>
-            </w:r>
-          </w:p>
-        </w:tc>
-        <w:tc>
-          <w:tcPr>
-            <w:tcW w:type="dxa" w:w="3168"/>
-            <w:shd w:fill="FFFFFF"/>
-            <w:tcMar>
-              <w:top w:w="100" w:type="dxa"/>
-              <w:bottom w:w="100" w:type="dxa"/>
-              <w:left w:w="120" w:type="dxa"/>
-              <w:right w:w="120" w:type="dxa"/>
-            </w:tcMar>
-            <w:vAlign w:val="center"/>
-          </w:tcPr>
-          <w:p>
-            <w:r>
-              <w:rPr>
-                <w:rFonts w:ascii="Segoe UI" w:hAnsi="Segoe UI"/>
-                <w:color w:val="1B2B24"/>
-                <w:sz w:val="18"/>
-              </w:rPr>
-              <w:t>Triggers a Preview Deployment to test serverless WSGI routing, static asset serving, and Jinja templates.</w:t>
-            </w:r>
-          </w:p>
-        </w:tc>
-        <w:tc>
-          <w:tcPr>
-            <w:tcW w:type="dxa" w:w="2880"/>
-            <w:shd w:fill="FFFFFF"/>
-            <w:tcMar>
-              <w:top w:w="100" w:type="dxa"/>
-              <w:bottom w:w="100" w:type="dxa"/>
-              <w:left w:w="120" w:type="dxa"/>
-              <w:right w:w="120" w:type="dxa"/>
-            </w:tcMar>
-            <w:vAlign w:val="center"/>
-          </w:tcPr>
-          <w:p>
-            <w:r>
-              <w:rPr>
-                <w:rFonts w:ascii="Segoe UI" w:hAnsi="Segoe UI"/>
-                <w:color w:val="1B2B24"/>
-                <w:sz w:val="18"/>
-              </w:rPr>
-              <w:t>Returns preview test URL: https://sarathi-your-mental-wellness-companion-xxx.vercel.app.</w:t>
-            </w:r>
-          </w:p>
-        </w:tc>
-      </w:tr>
-      <w:tr>
-        <w:tc>
-          <w:tcPr>
-            <w:tcW w:type="dxa" w:w="1440"/>
-            <w:shd w:fill="F4F7F5"/>
-            <w:tcMar>
-              <w:top w:w="100" w:type="dxa"/>
-              <w:bottom w:w="100" w:type="dxa"/>
-              <w:left w:w="120" w:type="dxa"/>
-              <w:right w:w="120" w:type="dxa"/>
-            </w:tcMar>
-            <w:vAlign w:val="center"/>
-          </w:tcPr>
-          <w:p>
-            <w:r>
-              <w:rPr>
-                <w:rFonts w:ascii="Segoe UI" w:hAnsi="Segoe UI"/>
-                <w:color w:val="1B2B24"/>
-                <w:sz w:val="18"/>
-              </w:rPr>
-              <w:t>Step 2.6</w:t>
-            </w:r>
-          </w:p>
-        </w:tc>
-        <w:tc>
-          <w:tcPr>
-            <w:tcW w:type="dxa" w:w="3312"/>
-            <w:shd w:fill="F4F7F5"/>
-            <w:tcMar>
-              <w:top w:w="100" w:type="dxa"/>
-              <w:bottom w:w="100" w:type="dxa"/>
-              <w:left w:w="120" w:type="dxa"/>
-              <w:right w:w="120" w:type="dxa"/>
-            </w:tcMar>
-            <w:vAlign w:val="center"/>
-          </w:tcPr>
-          <w:p>
-            <w:r>
-              <w:rPr>
-                <w:rFonts w:ascii="Consolas" w:hAnsi="Consolas"/>
-                <w:color w:val="1B2B24"/>
-                <w:sz w:val="17"/>
-              </w:rPr>
-              <w:t>npx vercel --prod</w:t>
-            </w:r>
-          </w:p>
-        </w:tc>
-        <w:tc>
-          <w:tcPr>
-            <w:tcW w:type="dxa" w:w="3168"/>
-            <w:shd w:fill="F4F7F5"/>
-            <w:tcMar>
-              <w:top w:w="100" w:type="dxa"/>
-              <w:bottom w:w="100" w:type="dxa"/>
-              <w:left w:w="120" w:type="dxa"/>
-              <w:right w:w="120" w:type="dxa"/>
-            </w:tcMar>
-            <w:vAlign w:val="center"/>
-          </w:tcPr>
-          <w:p>
-            <w:r>
-              <w:rPr>
-                <w:rFonts w:ascii="Segoe UI" w:hAnsi="Segoe UI"/>
-                <w:color w:val="1B2B24"/>
-                <w:sz w:val="18"/>
-              </w:rPr>
-              <w:t>Executes the final production deployment and binds the canonical live project domain.</w:t>
-            </w:r>
-          </w:p>
-        </w:tc>
-        <w:tc>
-          <w:tcPr>
-            <w:tcW w:type="dxa" w:w="2880"/>
-            <w:shd w:fill="F4F7F5"/>
-            <w:tcMar>
-              <w:top w:w="100" w:type="dxa"/>
-              <w:bottom w:w="100" w:type="dxa"/>
-              <w:left w:w="120" w:type="dxa"/>
-              <w:right w:w="120" w:type="dxa"/>
-            </w:tcMar>
-            <w:vAlign w:val="center"/>
-          </w:tcPr>
-          <w:p>
-            <w:r>
-              <w:rPr>
-                <w:rFonts w:ascii="Segoe UI" w:hAnsi="Segoe UI"/>
-                <w:color w:val="1B2B24"/>
-                <w:sz w:val="18"/>
-              </w:rPr>
-              <w:t>Production URL active: https://sarathi-your-mental-wellness-companion.vercel.app.</w:t>
-            </w:r>
-          </w:p>
-        </w:tc>
-      </w:tr>
-    </w:tbl>
-    <w:p>
-      <w:pPr>
-        <w:spacing w:after="280"/>
-      </w:pPr>
-    </w:p>
-    <w:p>
-      <w:pPr>
-        <w:spacing w:after="160"/>
-      </w:pPr>
-      <w:r>
-        <w:rPr>
-          <w:rFonts w:ascii="Segoe UI" w:hAnsi="Segoe UI"/>
-          <w:b/>
-          <w:color w:val="284B3F"/>
-          <w:sz w:val="28"/>
-        </w:rPr>
-        <w:t>3. One-Click Vercel Web Dashboard Alternative</w:t>
-      </w:r>
-    </w:p>
-    <w:p>
-      <w:pPr>
-        <w:spacing w:after="200"/>
-      </w:pPr>
-      <w:r>
-        <w:rPr>
-          <w:rFonts w:ascii="Segoe UI" w:hAnsi="Segoe UI"/>
-          <w:sz w:val="20"/>
-        </w:rPr>
-        <w:t>You can also deploy with zero CLI commands by linking your GitHub repository directly through the Vercel Web Console:</w:t>
-      </w:r>
-    </w:p>
-    <w:tbl>
-      <w:tblPr>
-        <w:tblW w:type="auto" w:w="0"/>
-        <w:jc w:val="center"/>
-        <w:tblLook w:firstColumn="1" w:firstRow="1" w:lastColumn="0" w:lastRow="0" w:noHBand="0" w:noVBand="1" w:val="04A0"/>
-        <w:tblBorders>
-          <w:top w:val="single" w:sz="6" w:space="0" w:color="D1DCD6"/>
-          <w:bottom w:val="single" w:sz="6" w:space="0" w:color="D1DCD6"/>
-          <w:insideH w:val="single" w:sz="4" w:space="0" w:color="D1DCD6"/>
-          <w:insideV w:val="none"/>
-          <w:left w:val="none"/>
-          <w:right w:val="none"/>
-        </w:tblBorders>
-      </w:tblPr>
-      <w:tblGrid>
-        <w:gridCol w:w="3312"/>
-        <w:gridCol w:w="3312"/>
-        <w:gridCol w:w="3312"/>
-      </w:tblGrid>
-      <w:tr>
-        <w:tc>
-          <w:tcPr>
-            <w:tcW w:type="dxa" w:w="1440"/>
-            <w:shd w:fill="284B3F"/>
-            <w:tcMar>
-              <w:top w:w="140" w:type="dxa"/>
-              <w:bottom w:w="140" w:type="dxa"/>
-              <w:left w:w="140" w:type="dxa"/>
-              <w:right w:w="140" w:type="dxa"/>
-            </w:tcMar>
-          </w:tcPr>
-          <w:p>
-            <w:r>
-              <w:rPr>
-                <w:rFonts w:ascii="Segoe UI" w:hAnsi="Segoe UI"/>
-                <w:b/>
-                <w:color w:val="FFFFFF"/>
-                <w:sz w:val="19"/>
-              </w:rPr>
-              <w:t>Step #</w:t>
-            </w:r>
-          </w:p>
-        </w:tc>
-        <w:tc>
-          <w:tcPr>
-            <w:tcW w:type="dxa" w:w="4608"/>
-            <w:shd w:fill="284B3F"/>
-            <w:tcMar>
-              <w:top w:w="140" w:type="dxa"/>
-              <w:bottom w:w="140" w:type="dxa"/>
-              <w:left w:w="140" w:type="dxa"/>
-              <w:right w:w="140" w:type="dxa"/>
-            </w:tcMar>
-          </w:tcPr>
-          <w:p>
-            <w:r>
-              <w:rPr>
-                <w:rFonts w:ascii="Segoe UI" w:hAnsi="Segoe UI"/>
-                <w:b/>
-                <w:color w:val="FFFFFF"/>
-                <w:sz w:val="19"/>
-              </w:rPr>
-              <w:t>Web Dashboard Action</w:t>
-            </w:r>
-          </w:p>
-        </w:tc>
-        <w:tc>
-          <w:tcPr>
-            <w:tcW w:type="dxa" w:w="4752"/>
-            <w:shd w:fill="284B3F"/>
-            <w:tcMar>
-              <w:top w:w="140" w:type="dxa"/>
-              <w:bottom w:w="140" w:type="dxa"/>
-              <w:left w:w="140" w:type="dxa"/>
-              <w:right w:w="140" w:type="dxa"/>
-            </w:tcMar>
-          </w:tcPr>
-          <w:p>
-            <w:r>
-              <w:rPr>
-                <w:rFonts w:ascii="Segoe UI" w:hAnsi="Segoe UI"/>
-                <w:b/>
-                <w:color w:val="FFFFFF"/>
-                <w:sz w:val="19"/>
-              </w:rPr>
-              <w:t>Purpose &amp; Details</w:t>
-            </w:r>
-          </w:p>
-        </w:tc>
-      </w:tr>
-      <w:tr>
-        <w:tc>
-          <w:tcPr>
-            <w:tcW w:type="dxa" w:w="1440"/>
-            <w:shd w:fill="FFFFFF"/>
-            <w:tcMar>
-              <w:top w:w="100" w:type="dxa"/>
-              <w:bottom w:w="100" w:type="dxa"/>
-              <w:left w:w="120" w:type="dxa"/>
-              <w:right w:w="120" w:type="dxa"/>
-            </w:tcMar>
-            <w:vAlign w:val="center"/>
-          </w:tcPr>
-          <w:p>
-            <w:r>
-              <w:rPr>
-                <w:rFonts w:ascii="Segoe UI" w:hAnsi="Segoe UI"/>
-                <w:color w:val="1B2B24"/>
-                <w:sz w:val="18"/>
-              </w:rPr>
-              <w:t>Step 3.1</w:t>
-            </w:r>
-          </w:p>
-        </w:tc>
-        <w:tc>
-          <w:tcPr>
-            <w:tcW w:type="dxa" w:w="4608"/>
-            <w:shd w:fill="FFFFFF"/>
-            <w:tcMar>
-              <w:top w:w="100" w:type="dxa"/>
-              <w:bottom w:w="100" w:type="dxa"/>
-              <w:left w:w="120" w:type="dxa"/>
-              <w:right w:w="120" w:type="dxa"/>
-            </w:tcMar>
-            <w:vAlign w:val="center"/>
-          </w:tcPr>
-          <w:p>
-            <w:r>
-              <w:rPr>
-                <w:rFonts w:ascii="Segoe UI" w:hAnsi="Segoe UI"/>
-                <w:color w:val="1B2B24"/>
-                <w:sz w:val="18"/>
-              </w:rPr>
-              <w:t>Navigate to vercel.com/new</w:t>
-            </w:r>
-          </w:p>
-        </w:tc>
-        <w:tc>
-          <w:tcPr>
-            <w:tcW w:type="dxa" w:w="4752"/>
-            <w:shd w:fill="FFFFFF"/>
-            <w:tcMar>
-              <w:top w:w="100" w:type="dxa"/>
-              <w:bottom w:w="100" w:type="dxa"/>
-              <w:left w:w="120" w:type="dxa"/>
-              <w:right w:w="120" w:type="dxa"/>
-            </w:tcMar>
-            <w:vAlign w:val="center"/>
-          </w:tcPr>
-          <w:p>
-            <w:r>
-              <w:rPr>
-                <w:rFonts w:ascii="Segoe UI" w:hAnsi="Segoe UI"/>
-                <w:color w:val="1B2B24"/>
-                <w:sz w:val="18"/>
-              </w:rPr>
-              <w:t>Opens the Vercel Git repository import screen.</w:t>
-            </w:r>
-          </w:p>
-        </w:tc>
-      </w:tr>
-      <w:tr>
-        <w:tc>
-          <w:tcPr>
-            <w:tcW w:type="dxa" w:w="1440"/>
-            <w:shd w:fill="F4F7F5"/>
-            <w:tcMar>
-              <w:top w:w="100" w:type="dxa"/>
-              <w:bottom w:w="100" w:type="dxa"/>
-              <w:left w:w="120" w:type="dxa"/>
-              <w:right w:w="120" w:type="dxa"/>
-            </w:tcMar>
-            <w:vAlign w:val="center"/>
-          </w:tcPr>
-          <w:p>
-            <w:r>
-              <w:rPr>
-                <w:rFonts w:ascii="Segoe UI" w:hAnsi="Segoe UI"/>
-                <w:color w:val="1B2B24"/>
-                <w:sz w:val="18"/>
-              </w:rPr>
-              <w:t>Step 3.2</w:t>
-            </w:r>
-          </w:p>
-        </w:tc>
-        <w:tc>
-          <w:tcPr>
-            <w:tcW w:type="dxa" w:w="4608"/>
-            <w:shd w:fill="F4F7F5"/>
-            <w:tcMar>
-              <w:top w:w="100" w:type="dxa"/>
-              <w:bottom w:w="100" w:type="dxa"/>
-              <w:left w:w="120" w:type="dxa"/>
-              <w:right w:w="120" w:type="dxa"/>
-            </w:tcMar>
-            <w:vAlign w:val="center"/>
-          </w:tcPr>
-          <w:p>
-            <w:r>
-              <w:rPr>
-                <w:rFonts w:ascii="Segoe UI" w:hAnsi="Segoe UI"/>
-                <w:color w:val="1B2B24"/>
-                <w:sz w:val="18"/>
-              </w:rPr>
-              <w:t>Select Import next to sarathi-your-mental-wellness-companion</w:t>
-            </w:r>
-          </w:p>
-        </w:tc>
-        <w:tc>
-          <w:tcPr>
-            <w:tcW w:type="dxa" w:w="4752"/>
-            <w:shd w:fill="F4F7F5"/>
-            <w:tcMar>
-              <w:top w:w="100" w:type="dxa"/>
-              <w:bottom w:w="100" w:type="dxa"/>
-              <w:left w:w="120" w:type="dxa"/>
-              <w:right w:w="120" w:type="dxa"/>
-            </w:tcMar>
-            <w:vAlign w:val="center"/>
-          </w:tcPr>
-          <w:p>
-            <w:r>
-              <w:rPr>
-                <w:rFonts w:ascii="Segoe UI" w:hAnsi="Segoe UI"/>
-                <w:color w:val="1B2B24"/>
-                <w:sz w:val="18"/>
-              </w:rPr>
-              <w:t>Links Vercel's automated deployment engine to your GitHub repository.</w:t>
-            </w:r>
-          </w:p>
-        </w:tc>
-      </w:tr>
-      <w:tr>
-        <w:tc>
-          <w:tcPr>
-            <w:tcW w:type="dxa" w:w="1440"/>
-            <w:shd w:fill="FFFFFF"/>
-            <w:tcMar>
-              <w:top w:w="100" w:type="dxa"/>
-              <w:bottom w:w="100" w:type="dxa"/>
-              <w:left w:w="120" w:type="dxa"/>
-              <w:right w:w="120" w:type="dxa"/>
-            </w:tcMar>
-            <w:vAlign w:val="center"/>
-          </w:tcPr>
-          <w:p>
-            <w:r>
-              <w:rPr>
-                <w:rFonts w:ascii="Segoe UI" w:hAnsi="Segoe UI"/>
-                <w:color w:val="1B2B24"/>
-                <w:sz w:val="18"/>
-              </w:rPr>
-              <w:t>Step 3.3</w:t>
-            </w:r>
-          </w:p>
-        </w:tc>
-        <w:tc>
-          <w:tcPr>
-            <w:tcW w:type="dxa" w:w="4608"/>
-            <w:shd w:fill="FFFFFF"/>
-            <w:tcMar>
-              <w:top w:w="100" w:type="dxa"/>
-              <w:bottom w:w="100" w:type="dxa"/>
-              <w:left w:w="120" w:type="dxa"/>
-              <w:right w:w="120" w:type="dxa"/>
-            </w:tcMar>
-            <w:vAlign w:val="center"/>
-          </w:tcPr>
-          <w:p>
-            <w:r>
-              <w:rPr>
-                <w:rFonts w:ascii="Segoe UI" w:hAnsi="Segoe UI"/>
-                <w:color w:val="1B2B24"/>
-                <w:sz w:val="18"/>
-              </w:rPr>
-              <w:t>Project Name: sarathi-your-mental-wellness-companion</w:t>
-            </w:r>
-          </w:p>
-        </w:tc>
-        <w:tc>
-          <w:tcPr>
-            <w:tcW w:type="dxa" w:w="4752"/>
-            <w:shd w:fill="FFFFFF"/>
-            <w:tcMar>
-              <w:top w:w="100" w:type="dxa"/>
-              <w:bottom w:w="100" w:type="dxa"/>
-              <w:left w:w="120" w:type="dxa"/>
-              <w:right w:w="120" w:type="dxa"/>
-            </w:tcMar>
-            <w:vAlign w:val="center"/>
-          </w:tcPr>
-          <w:p>
-            <w:r>
-              <w:rPr>
-                <w:rFonts w:ascii="Segoe UI" w:hAnsi="Segoe UI"/>
-                <w:color w:val="1B2B24"/>
-                <w:sz w:val="18"/>
-              </w:rPr>
-              <w:t>Configures the project domain matching the GitHub repository name.</w:t>
-            </w:r>
-          </w:p>
-        </w:tc>
-      </w:tr>
-      <w:tr>
-        <w:tc>
-          <w:tcPr>
-            <w:tcW w:type="dxa" w:w="1440"/>
-            <w:shd w:fill="F4F7F5"/>
-            <w:tcMar>
-              <w:top w:w="100" w:type="dxa"/>
-              <w:bottom w:w="100" w:type="dxa"/>
-              <w:left w:w="120" w:type="dxa"/>
-              <w:right w:w="120" w:type="dxa"/>
-            </w:tcMar>
-            <w:vAlign w:val="center"/>
-          </w:tcPr>
-          <w:p>
-            <w:r>
-              <w:rPr>
-                <w:rFonts w:ascii="Segoe UI" w:hAnsi="Segoe UI"/>
-                <w:color w:val="1B2B24"/>
-                <w:sz w:val="18"/>
-              </w:rPr>
-              <w:t>Step 3.4</w:t>
-            </w:r>
-          </w:p>
-        </w:tc>
-        <w:tc>
-          <w:tcPr>
-            <w:tcW w:type="dxa" w:w="4608"/>
-            <w:shd w:fill="F4F7F5"/>
-            <w:tcMar>
-              <w:top w:w="100" w:type="dxa"/>
-              <w:bottom w:w="100" w:type="dxa"/>
-              <w:left w:w="120" w:type="dxa"/>
-              <w:right w:w="120" w:type="dxa"/>
-            </w:tcMar>
-            <w:vAlign w:val="center"/>
-          </w:tcPr>
-          <w:p>
-            <w:r>
-              <w:rPr>
-                <w:rFonts w:ascii="Segoe UI" w:hAnsi="Segoe UI"/>
-                <w:color w:val="1B2B24"/>
-                <w:sz w:val="18"/>
-              </w:rPr>
-              <w:t>Framework Preset: Other (Root: ./)</w:t>
-            </w:r>
-          </w:p>
-        </w:tc>
-        <w:tc>
-          <w:tcPr>
-            <w:tcW w:type="dxa" w:w="4752"/>
-            <w:shd w:fill="F4F7F5"/>
-            <w:tcMar>
-              <w:top w:w="100" w:type="dxa"/>
-              <w:bottom w:w="100" w:type="dxa"/>
-              <w:left w:w="120" w:type="dxa"/>
-              <w:right w:w="120" w:type="dxa"/>
-            </w:tcMar>
-            <w:vAlign w:val="center"/>
-          </w:tcPr>
-          <w:p>
-            <w:r>
-              <w:rPr>
-                <w:rFonts w:ascii="Segoe UI" w:hAnsi="Segoe UI"/>
-                <w:color w:val="1B2B24"/>
-                <w:sz w:val="18"/>
-              </w:rPr>
-              <w:t>Vercel automatically detects vercel.json and selects the @vercel/python builder.</w:t>
-            </w:r>
-          </w:p>
-        </w:tc>
-      </w:tr>
-      <w:tr>
-        <w:tc>
-          <w:tcPr>
-            <w:tcW w:type="dxa" w:w="1440"/>
-            <w:shd w:fill="FFFFFF"/>
-            <w:tcMar>
-              <w:top w:w="100" w:type="dxa"/>
-              <w:bottom w:w="100" w:type="dxa"/>
-              <w:left w:w="120" w:type="dxa"/>
-              <w:right w:w="120" w:type="dxa"/>
-            </w:tcMar>
-            <w:vAlign w:val="center"/>
-          </w:tcPr>
-          <w:p>
-            <w:r>
-              <w:rPr>
-                <w:rFonts w:ascii="Segoe UI" w:hAnsi="Segoe UI"/>
-                <w:color w:val="1B2B24"/>
-                <w:sz w:val="18"/>
-              </w:rPr>
-              <w:t>Step 3.5</w:t>
-            </w:r>
-          </w:p>
-        </w:tc>
-        <w:tc>
-          <w:tcPr>
-            <w:tcW w:type="dxa" w:w="4608"/>
-            <w:shd w:fill="FFFFFF"/>
-            <w:tcMar>
-              <w:top w:w="100" w:type="dxa"/>
-              <w:bottom w:w="100" w:type="dxa"/>
-              <w:left w:w="120" w:type="dxa"/>
-              <w:right w:w="120" w:type="dxa"/>
-            </w:tcMar>
-            <w:vAlign w:val="center"/>
-          </w:tcPr>
-          <w:p>
-            <w:r>
-              <w:rPr>
-                <w:rFonts w:ascii="Segoe UI" w:hAnsi="Segoe UI"/>
-                <w:color w:val="1B2B24"/>
-                <w:sz w:val="18"/>
-              </w:rPr>
-              <w:t>Environment Variables: Add FLASK_SECRET_KEY, DB_HOST, DB_USER, DB_PASSWORD, DB_NAME</w:t>
-            </w:r>
-          </w:p>
-        </w:tc>
-        <w:tc>
-          <w:tcPr>
-            <w:tcW w:type="dxa" w:w="4752"/>
-            <w:shd w:fill="FFFFFF"/>
-            <w:tcMar>
-              <w:top w:w="100" w:type="dxa"/>
-              <w:bottom w:w="100" w:type="dxa"/>
-              <w:left w:w="120" w:type="dxa"/>
-              <w:right w:w="120" w:type="dxa"/>
-            </w:tcMar>
-            <w:vAlign w:val="center"/>
-          </w:tcPr>
-          <w:p>
-            <w:r>
-              <w:rPr>
-                <w:rFonts w:ascii="Segoe UI" w:hAnsi="Segoe UI"/>
-                <w:color w:val="1B2B24"/>
-                <w:sz w:val="18"/>
-              </w:rPr>
-              <w:t>Injects production database and session secrets safely in Vercel Cloud KMS.</w:t>
-            </w:r>
-          </w:p>
-        </w:tc>
-      </w:tr>
-      <w:tr>
-        <w:tc>
-          <w:tcPr>
-            <w:tcW w:type="dxa" w:w="1440"/>
-            <w:shd w:fill="F4F7F5"/>
-            <w:tcMar>
-              <w:top w:w="100" w:type="dxa"/>
-              <w:bottom w:w="100" w:type="dxa"/>
-              <w:left w:w="120" w:type="dxa"/>
-              <w:right w:w="120" w:type="dxa"/>
-            </w:tcMar>
-            <w:vAlign w:val="center"/>
-          </w:tcPr>
-          <w:p>
-            <w:r>
-              <w:rPr>
-                <w:rFonts w:ascii="Segoe UI" w:hAnsi="Segoe UI"/>
-                <w:color w:val="1B2B24"/>
-                <w:sz w:val="18"/>
-              </w:rPr>
-              <w:t>Step 3.6</w:t>
-            </w:r>
-          </w:p>
-        </w:tc>
-        <w:tc>
-          <w:tcPr>
-            <w:tcW w:type="dxa" w:w="4608"/>
-            <w:shd w:fill="F4F7F5"/>
-            <w:tcMar>
-              <w:top w:w="100" w:type="dxa"/>
-              <w:bottom w:w="100" w:type="dxa"/>
-              <w:left w:w="120" w:type="dxa"/>
-              <w:right w:w="120" w:type="dxa"/>
-            </w:tcMar>
-            <w:vAlign w:val="center"/>
-          </w:tcPr>
-          <w:p>
-            <w:r>
-              <w:rPr>
-                <w:rFonts w:ascii="Segoe UI" w:hAnsi="Segoe UI"/>
-                <w:color w:val="1B2B24"/>
-                <w:sz w:val="18"/>
-              </w:rPr>
-              <w:t>Click Deploy</w:t>
-            </w:r>
-          </w:p>
-        </w:tc>
-        <w:tc>
-          <w:tcPr>
-            <w:tcW w:type="dxa" w:w="4752"/>
-            <w:shd w:fill="F4F7F5"/>
-            <w:tcMar>
-              <w:top w:w="100" w:type="dxa"/>
-              <w:bottom w:w="100" w:type="dxa"/>
-              <w:left w:w="120" w:type="dxa"/>
-              <w:right w:w="120" w:type="dxa"/>
-            </w:tcMar>
-            <w:vAlign w:val="center"/>
-          </w:tcPr>
-          <w:p>
-            <w:r>
-              <w:rPr>
-                <w:rFonts w:ascii="Segoe UI" w:hAnsi="Segoe UI"/>
-                <w:color w:val="1B2B24"/>
-                <w:sz w:val="18"/>
-              </w:rPr>
-              <w:t>Vercel builds serverless functions and launches live website at https://sarathi-your-mental-wellness-companion.vercel.app.</w:t>
-            </w:r>
-          </w:p>
-        </w:tc>
-      </w:tr>
-    </w:tbl>
-    <w:p>
-      <w:pPr>
-        <w:spacing w:after="280"/>
-      </w:pPr>
-    </w:p>
-    <w:p>
-      <w:pPr>
-        <w:spacing w:after="160"/>
-      </w:pPr>
-      <w:r>
-        <w:rPr>
-          <w:rFonts w:ascii="Segoe UI" w:hAnsi="Segoe UI"/>
-          <w:b/>
-          <w:color w:val="284B3F"/>
-          <w:sz w:val="28"/>
-        </w:rPr>
-        <w:t>4. Verified Deployment URLs &amp; Demonstration Credentials</w:t>
-      </w:r>
-    </w:p>
-    <w:tbl>
-      <w:tblPr>
-        <w:tblW w:type="auto" w:w="0"/>
-        <w:jc w:val="center"/>
-        <w:tblLook w:firstColumn="1" w:firstRow="1" w:lastColumn="0" w:lastRow="0" w:noHBand="0" w:noVBand="1" w:val="04A0"/>
-        <w:tblBorders>
-          <w:top w:val="single" w:sz="6" w:space="0" w:color="D1DCD6"/>
-          <w:bottom w:val="single" w:sz="6" w:space="0" w:color="D1DCD6"/>
-          <w:insideH w:val="single" w:sz="4" w:space="0" w:color="D1DCD6"/>
-          <w:insideV w:val="none"/>
-          <w:left w:val="none"/>
-          <w:right w:val="none"/>
-        </w:tblBorders>
-      </w:tblPr>
-      <w:tblGrid>
-        <w:gridCol w:w="3312"/>
-        <w:gridCol w:w="3312"/>
-        <w:gridCol w:w="3312"/>
-      </w:tblGrid>
-      <w:tr>
-        <w:tc>
-          <w:tcPr>
-            <w:tcW w:type="dxa" w:w="2592"/>
-            <w:shd w:fill="284B3F"/>
-            <w:tcMar>
-              <w:top w:w="140" w:type="dxa"/>
-              <w:bottom w:w="140" w:type="dxa"/>
-              <w:left w:w="140" w:type="dxa"/>
-              <w:right w:w="140" w:type="dxa"/>
-            </w:tcMar>
-          </w:tcPr>
-          <w:p>
-            <w:r>
-              <w:rPr>
-                <w:rFonts w:ascii="Segoe UI" w:hAnsi="Segoe UI"/>
-                <w:b/>
-                <w:color w:val="FFFFFF"/>
-                <w:sz w:val="19"/>
-              </w:rPr>
-              <w:t>Portal / Environment</w:t>
-            </w:r>
-          </w:p>
-        </w:tc>
-        <w:tc>
-          <w:tcPr>
-            <w:tcW w:type="dxa" w:w="4608"/>
-            <w:shd w:fill="284B3F"/>
-            <w:tcMar>
-              <w:top w:w="140" w:type="dxa"/>
-              <w:bottom w:w="140" w:type="dxa"/>
-              <w:left w:w="140" w:type="dxa"/>
-              <w:right w:w="140" w:type="dxa"/>
-            </w:tcMar>
-          </w:tcPr>
-          <w:p>
-            <w:r>
-              <w:rPr>
-                <w:rFonts w:ascii="Segoe UI" w:hAnsi="Segoe UI"/>
-                <w:b/>
-                <w:color w:val="FFFFFF"/>
-                <w:sz w:val="19"/>
-              </w:rPr>
-              <w:t>Access URL</w:t>
-            </w:r>
-          </w:p>
-        </w:tc>
-        <w:tc>
-          <w:tcPr>
-            <w:tcW w:type="dxa" w:w="3600"/>
-            <w:shd w:fill="284B3F"/>
-            <w:tcMar>
-              <w:top w:w="140" w:type="dxa"/>
-              <w:bottom w:w="140" w:type="dxa"/>
-              <w:left w:w="140" w:type="dxa"/>
-              <w:right w:w="140" w:type="dxa"/>
-            </w:tcMar>
-          </w:tcPr>
-          <w:p>
-            <w:r>
-              <w:rPr>
-                <w:rFonts w:ascii="Segoe UI" w:hAnsi="Segoe UI"/>
-                <w:b/>
-                <w:color w:val="FFFFFF"/>
-                <w:sz w:val="19"/>
-              </w:rPr>
-              <w:t>Role &amp; Demo Credentials</w:t>
+              <w:t>Published (main branch)</w:t>
             </w:r>
           </w:p>
         </w:tc>
@@ -2425,67 +225,66 @@
             <w:tcW w:type="dxa" w:w="2592"/>
             <w:shd w:fill="FFFFFF"/>
             <w:tcMar>
-              <w:top w:w="100" w:type="dxa"/>
-              <w:bottom w:w="100" w:type="dxa"/>
-              <w:left w:w="120" w:type="dxa"/>
-              <w:right w:w="120" w:type="dxa"/>
+              <w:top w:w="90" w:type="dxa"/>
+              <w:bottom w:w="90" w:type="dxa"/>
+              <w:left w:w="150" w:type="dxa"/>
+              <w:right w:w="150" w:type="dxa"/>
             </w:tcMar>
-            <w:vAlign w:val="center"/>
           </w:tcPr>
           <w:p>
             <w:r>
               <w:rPr>
-                <w:rFonts w:ascii="Segoe UI" w:hAnsi="Segoe UI"/>
-                <w:color w:val="1B2B24"/>
-                <w:sz w:val="18"/>
+                <w:rFonts w:ascii="Arial" w:hAnsi="Arial"/>
+                <w:b/>
+                <w:color w:val="1E293B"/>
+                <w:sz w:val="17"/>
               </w:rPr>
-              <w:t>Local Web Server</w:t>
+              <w:t>Vercel Production Domain</w:t>
             </w:r>
           </w:p>
         </w:tc>
         <w:tc>
           <w:tcPr>
-            <w:tcW w:type="dxa" w:w="4608"/>
+            <w:tcW w:type="dxa" w:w="5184"/>
             <w:shd w:fill="FFFFFF"/>
             <w:tcMar>
-              <w:top w:w="100" w:type="dxa"/>
-              <w:bottom w:w="100" w:type="dxa"/>
-              <w:left w:w="120" w:type="dxa"/>
-              <w:right w:w="120" w:type="dxa"/>
+              <w:top w:w="90" w:type="dxa"/>
+              <w:bottom w:w="90" w:type="dxa"/>
+              <w:left w:w="150" w:type="dxa"/>
+              <w:right w:w="150" w:type="dxa"/>
             </w:tcMar>
-            <w:vAlign w:val="center"/>
           </w:tcPr>
           <w:p>
             <w:r>
               <w:rPr>
-                <w:rFonts w:ascii="Consolas" w:hAnsi="Consolas"/>
-                <w:color w:val="1B2B24"/>
+                <w:rFonts w:ascii="Arial" w:hAnsi="Arial"/>
+                <w:color w:val="2563EB"/>
                 <w:sz w:val="17"/>
               </w:rPr>
-              <w:t>http://127.0.0.1:5000</w:t>
+              <w:t>https://sarathi-your-mental-wellness-compan.vercel.app</w:t>
             </w:r>
           </w:p>
         </w:tc>
         <w:tc>
           <w:tcPr>
-            <w:tcW w:type="dxa" w:w="3600"/>
+            <w:tcW w:type="dxa" w:w="2304"/>
             <w:shd w:fill="FFFFFF"/>
             <w:tcMar>
-              <w:top w:w="100" w:type="dxa"/>
-              <w:bottom w:w="100" w:type="dxa"/>
-              <w:left w:w="120" w:type="dxa"/>
-              <w:right w:w="120" w:type="dxa"/>
+              <w:top w:w="90" w:type="dxa"/>
+              <w:bottom w:w="90" w:type="dxa"/>
+              <w:left w:w="150" w:type="dxa"/>
+              <w:right w:w="150" w:type="dxa"/>
             </w:tcMar>
-            <w:vAlign w:val="center"/>
           </w:tcPr>
           <w:p>
             <w:r>
               <w:rPr>
-                <w:rFonts w:ascii="Segoe UI" w:hAnsi="Segoe UI"/>
-                <w:color w:val="1B2B24"/>
-                <w:sz w:val="18"/>
+                <w:rFonts w:ascii="Arial" w:hAnsi="Arial"/>
+                <w:b/>
+                <w:color w:val="166534"/>
+                <w:sz w:val="17"/>
               </w:rPr>
-              <w:t>Landing page, Tri-theme switcher (Daylight, Amber, Midnight)</w:t>
+              <w:t>Live &amp; Active (HTTP 200)</w:t>
             </w:r>
           </w:p>
         </w:tc>
@@ -2494,69 +293,68 @@
         <w:tc>
           <w:tcPr>
             <w:tcW w:type="dxa" w:w="2592"/>
-            <w:shd w:fill="F4F7F5"/>
+            <w:shd w:fill="F8FAFC"/>
             <w:tcMar>
-              <w:top w:w="100" w:type="dxa"/>
-              <w:bottom w:w="100" w:type="dxa"/>
-              <w:left w:w="120" w:type="dxa"/>
-              <w:right w:w="120" w:type="dxa"/>
+              <w:top w:w="90" w:type="dxa"/>
+              <w:bottom w:w="90" w:type="dxa"/>
+              <w:left w:w="150" w:type="dxa"/>
+              <w:right w:w="150" w:type="dxa"/>
             </w:tcMar>
-            <w:vAlign w:val="center"/>
           </w:tcPr>
           <w:p>
             <w:r>
               <w:rPr>
-                <w:rFonts w:ascii="Segoe UI" w:hAnsi="Segoe UI"/>
-                <w:color w:val="1B2B24"/>
-                <w:sz w:val="18"/>
+                <w:rFonts w:ascii="Arial" w:hAnsi="Arial"/>
+                <w:b/>
+                <w:color w:val="1E293B"/>
+                <w:sz w:val="17"/>
               </w:rPr>
-              <w:t>Period &amp; Wellness Portal</w:t>
+              <w:t>Vercel Deployment URL</w:t>
             </w:r>
           </w:p>
         </w:tc>
         <w:tc>
           <w:tcPr>
-            <w:tcW w:type="dxa" w:w="4608"/>
-            <w:shd w:fill="F4F7F5"/>
+            <w:tcW w:type="dxa" w:w="5184"/>
+            <w:shd w:fill="F8FAFC"/>
             <w:tcMar>
-              <w:top w:w="100" w:type="dxa"/>
-              <w:bottom w:w="100" w:type="dxa"/>
-              <w:left w:w="120" w:type="dxa"/>
-              <w:right w:w="120" w:type="dxa"/>
+              <w:top w:w="90" w:type="dxa"/>
+              <w:bottom w:w="90" w:type="dxa"/>
+              <w:left w:w="150" w:type="dxa"/>
+              <w:right w:w="150" w:type="dxa"/>
             </w:tcMar>
-            <w:vAlign w:val="center"/>
           </w:tcPr>
           <w:p>
             <w:r>
               <w:rPr>
-                <w:rFonts w:ascii="Consolas" w:hAnsi="Consolas"/>
-                <w:color w:val="1B2B24"/>
+                <w:rFonts w:ascii="Arial" w:hAnsi="Arial"/>
+                <w:color w:val="2563EB"/>
                 <w:sz w:val="17"/>
               </w:rPr>
-              <w:t>http://127.0.0.1:5000/period</w:t>
+              <w:t>https://sarathi-your-mental-wellness-companion-3xv8j6ust.vercel.app</w:t>
             </w:r>
           </w:p>
         </w:tc>
         <w:tc>
           <w:tcPr>
-            <w:tcW w:type="dxa" w:w="3600"/>
-            <w:shd w:fill="F4F7F5"/>
+            <w:tcW w:type="dxa" w:w="2304"/>
+            <w:shd w:fill="F8FAFC"/>
             <w:tcMar>
-              <w:top w:w="100" w:type="dxa"/>
-              <w:bottom w:w="100" w:type="dxa"/>
-              <w:left w:w="120" w:type="dxa"/>
-              <w:right w:w="120" w:type="dxa"/>
+              <w:top w:w="90" w:type="dxa"/>
+              <w:bottom w:w="90" w:type="dxa"/>
+              <w:left w:w="150" w:type="dxa"/>
+              <w:right w:w="150" w:type="dxa"/>
             </w:tcMar>
-            <w:vAlign w:val="center"/>
           </w:tcPr>
           <w:p>
             <w:r>
               <w:rPr>
-                <w:rFonts w:ascii="Segoe UI" w:hAnsi="Segoe UI"/>
-                <w:color w:val="1B2B24"/>
-                <w:sz w:val="18"/>
+                <w:rFonts w:ascii="Arial" w:hAnsi="Arial"/>
+                <w:b/>
+                <w:color w:val="166534"/>
+                <w:sz w:val="17"/>
               </w:rPr>
-              <w:t>Username: chahat / Password: chahat (5 cycles, PCOS/PMDD screeners, edit/delete)</w:t>
+              <w:t>Deployed (READY)</w:t>
             </w:r>
           </w:p>
         </w:tc>
@@ -2567,67 +365,168 @@
             <w:tcW w:type="dxa" w:w="2592"/>
             <w:shd w:fill="FFFFFF"/>
             <w:tcMar>
-              <w:top w:w="100" w:type="dxa"/>
-              <w:bottom w:w="100" w:type="dxa"/>
-              <w:left w:w="120" w:type="dxa"/>
-              <w:right w:w="120" w:type="dxa"/>
+              <w:top w:w="90" w:type="dxa"/>
+              <w:bottom w:w="90" w:type="dxa"/>
+              <w:left w:w="150" w:type="dxa"/>
+              <w:right w:w="150" w:type="dxa"/>
             </w:tcMar>
-            <w:vAlign w:val="center"/>
           </w:tcPr>
           <w:p>
             <w:r>
               <w:rPr>
-                <w:rFonts w:ascii="Segoe UI" w:hAnsi="Segoe UI"/>
-                <w:color w:val="1B2B24"/>
-                <w:sz w:val="18"/>
+                <w:rFonts w:ascii="Arial" w:hAnsi="Arial"/>
+                <w:b/>
+                <w:color w:val="1E293B"/>
+                <w:sz w:val="17"/>
               </w:rPr>
-              <w:t>Admin Governance Console</w:t>
+              <w:t>Vercel Inspect Console</w:t>
             </w:r>
           </w:p>
         </w:tc>
         <w:tc>
           <w:tcPr>
-            <w:tcW w:type="dxa" w:w="4608"/>
+            <w:tcW w:type="dxa" w:w="5184"/>
             <w:shd w:fill="FFFFFF"/>
             <w:tcMar>
-              <w:top w:w="100" w:type="dxa"/>
-              <w:bottom w:w="100" w:type="dxa"/>
-              <w:left w:w="120" w:type="dxa"/>
-              <w:right w:w="120" w:type="dxa"/>
+              <w:top w:w="90" w:type="dxa"/>
+              <w:bottom w:w="90" w:type="dxa"/>
+              <w:left w:w="150" w:type="dxa"/>
+              <w:right w:w="150" w:type="dxa"/>
             </w:tcMar>
-            <w:vAlign w:val="center"/>
           </w:tcPr>
           <w:p>
             <w:r>
               <w:rPr>
-                <w:rFonts w:ascii="Consolas" w:hAnsi="Consolas"/>
-                <w:color w:val="1B2B24"/>
+                <w:rFonts w:ascii="Arial" w:hAnsi="Arial"/>
+                <w:color w:val="2563EB"/>
                 <w:sz w:val="17"/>
               </w:rPr>
-              <w:t>http://127.0.0.1:5000/admin/dashboard</w:t>
+              <w:t>https://vercel.com/chahatmodi18s-projects/sarathi-your-mental-wellness-companion/H8npvgSsTDoqRpaHCdCndSNHyWEj</w:t>
+            </w:r>
+          </w:p>
+        </w:tc>
+        <w:tc>
+          <w:tcPr>
+            <w:tcW w:type="dxa" w:w="2304"/>
+            <w:shd w:fill="FFFFFF"/>
+            <w:tcMar>
+              <w:top w:w="90" w:type="dxa"/>
+              <w:bottom w:w="90" w:type="dxa"/>
+              <w:left w:w="150" w:type="dxa"/>
+              <w:right w:w="150" w:type="dxa"/>
+            </w:tcMar>
+          </w:tcPr>
+          <w:p>
+            <w:r>
+              <w:rPr>
+                <w:rFonts w:ascii="Arial" w:hAnsi="Arial"/>
+                <w:b/>
+                <w:color w:val="166534"/>
+                <w:sz w:val="17"/>
+              </w:rPr>
+              <w:t>Monitoring Active</w:t>
+            </w:r>
+          </w:p>
+        </w:tc>
+      </w:tr>
+    </w:tbl>
+    <w:p>
+      <w:pPr>
+        <w:spacing w:after="240"/>
+      </w:pPr>
+    </w:p>
+    <w:p>
+      <w:pPr>
+        <w:pStyle w:val="Heading1"/>
+      </w:pPr>
+      <w:r>
+        <w:rPr>
+          <w:rFonts w:ascii="Arial" w:hAnsi="Arial"/>
+          <w:b/>
+          <w:color w:val="0E7490"/>
+          <w:sz w:val="28"/>
+        </w:rPr>
+        <w:t>2. GitHub Deployment Commands Reference Table</w:t>
+      </w:r>
+    </w:p>
+    <w:tbl>
+      <w:tblPr>
+        <w:tblW w:type="auto" w:w="0"/>
+        <w:jc w:val="center"/>
+        <w:tblLook w:firstColumn="1" w:firstRow="1" w:lastColumn="0" w:lastRow="0" w:noHBand="0" w:noVBand="1" w:val="04A0"/>
+      </w:tblPr>
+      <w:tblGrid>
+        <w:gridCol w:w="3360"/>
+        <w:gridCol w:w="3360"/>
+        <w:gridCol w:w="3360"/>
+      </w:tblGrid>
+      <w:tr>
+        <w:tc>
+          <w:tcPr>
+            <w:tcW w:type="dxa" w:w="2592"/>
+            <w:shd w:fill="1E293B"/>
+            <w:tcMar>
+              <w:top w:w="120" w:type="dxa"/>
+              <w:bottom w:w="120" w:type="dxa"/>
+              <w:left w:w="150" w:type="dxa"/>
+              <w:right w:w="150" w:type="dxa"/>
+            </w:tcMar>
+          </w:tcPr>
+          <w:p>
+            <w:r>
+              <w:rPr>
+                <w:rFonts w:ascii="Arial" w:hAnsi="Arial"/>
+                <w:b/>
+                <w:color w:val="FFFFFF"/>
+                <w:sz w:val="19"/>
+              </w:rPr>
+              <w:t>Execution Stage</w:t>
             </w:r>
           </w:p>
         </w:tc>
         <w:tc>
           <w:tcPr>
             <w:tcW w:type="dxa" w:w="3600"/>
-            <w:shd w:fill="FFFFFF"/>
+            <w:shd w:fill="1E293B"/>
             <w:tcMar>
-              <w:top w:w="100" w:type="dxa"/>
-              <w:bottom w:w="100" w:type="dxa"/>
-              <w:left w:w="120" w:type="dxa"/>
-              <w:right w:w="120" w:type="dxa"/>
+              <w:top w:w="120" w:type="dxa"/>
+              <w:bottom w:w="120" w:type="dxa"/>
+              <w:left w:w="150" w:type="dxa"/>
+              <w:right w:w="150" w:type="dxa"/>
             </w:tcMar>
-            <w:vAlign w:val="center"/>
           </w:tcPr>
           <w:p>
             <w:r>
               <w:rPr>
-                <w:rFonts w:ascii="Segoe UI" w:hAnsi="Segoe UI"/>
-                <w:color w:val="1B2B24"/>
-                <w:sz w:val="18"/>
+                <w:rFonts w:ascii="Arial" w:hAnsi="Arial"/>
+                <w:b/>
+                <w:color w:val="FFFFFF"/>
+                <w:sz w:val="19"/>
               </w:rPr>
-              <w:t>Username: admin / Password: admin (Table live search, counselor approvals)</w:t>
+              <w:t>Command / Operation</w:t>
+            </w:r>
+          </w:p>
+        </w:tc>
+        <w:tc>
+          <w:tcPr>
+            <w:tcW w:type="dxa" w:w="3888"/>
+            <w:shd w:fill="1E293B"/>
+            <w:tcMar>
+              <w:top w:w="120" w:type="dxa"/>
+              <w:bottom w:w="120" w:type="dxa"/>
+              <w:left w:w="150" w:type="dxa"/>
+              <w:right w:w="150" w:type="dxa"/>
+            </w:tcMar>
+          </w:tcPr>
+          <w:p>
+            <w:r>
+              <w:rPr>
+                <w:rFonts w:ascii="Arial" w:hAnsi="Arial"/>
+                <w:b/>
+                <w:color w:val="FFFFFF"/>
+                <w:sz w:val="19"/>
+              </w:rPr>
+              <w:t>Technical Purpose &amp; Function</w:t>
             </w:r>
           </w:p>
         </w:tc>
@@ -2636,69 +535,65 @@
         <w:tc>
           <w:tcPr>
             <w:tcW w:type="dxa" w:w="2592"/>
-            <w:shd w:fill="F4F7F5"/>
+            <w:shd w:fill="F8FAFC"/>
             <w:tcMar>
-              <w:top w:w="100" w:type="dxa"/>
-              <w:bottom w:w="100" w:type="dxa"/>
-              <w:left w:w="120" w:type="dxa"/>
-              <w:right w:w="120" w:type="dxa"/>
+              <w:top w:w="90" w:type="dxa"/>
+              <w:bottom w:w="90" w:type="dxa"/>
+              <w:left w:w="150" w:type="dxa"/>
+              <w:right w:w="150" w:type="dxa"/>
             </w:tcMar>
-            <w:vAlign w:val="center"/>
           </w:tcPr>
           <w:p>
             <w:r>
               <w:rPr>
-                <w:rFonts w:ascii="Segoe UI" w:hAnsi="Segoe UI"/>
-                <w:color w:val="1B2B24"/>
-                <w:sz w:val="18"/>
-              </w:rPr>
-              <w:t>Clinical Counselor Portal</w:t>
-            </w:r>
-          </w:p>
-        </w:tc>
-        <w:tc>
-          <w:tcPr>
-            <w:tcW w:type="dxa" w:w="4608"/>
-            <w:shd w:fill="F4F7F5"/>
-            <w:tcMar>
-              <w:top w:w="100" w:type="dxa"/>
-              <w:bottom w:w="100" w:type="dxa"/>
-              <w:left w:w="120" w:type="dxa"/>
-              <w:right w:w="120" w:type="dxa"/>
-            </w:tcMar>
-            <w:vAlign w:val="center"/>
-          </w:tcPr>
-          <w:p>
-            <w:r>
-              <w:rPr>
-                <w:rFonts w:ascii="Consolas" w:hAnsi="Consolas"/>
-                <w:color w:val="1B2B24"/>
+                <w:rFonts w:ascii="Arial" w:hAnsi="Arial"/>
+                <w:b/>
                 <w:sz w:val="17"/>
               </w:rPr>
-              <w:t>http://127.0.0.1:5000/counselor/dashboard</w:t>
+              <w:t>Step 1: Check Working Tree</w:t>
             </w:r>
           </w:p>
         </w:tc>
         <w:tc>
           <w:tcPr>
             <w:tcW w:type="dxa" w:w="3600"/>
-            <w:shd w:fill="F4F7F5"/>
+            <w:shd w:fill="F8FAFC"/>
             <w:tcMar>
-              <w:top w:w="100" w:type="dxa"/>
-              <w:bottom w:w="100" w:type="dxa"/>
-              <w:left w:w="120" w:type="dxa"/>
-              <w:right w:w="120" w:type="dxa"/>
+              <w:top w:w="90" w:type="dxa"/>
+              <w:bottom w:w="90" w:type="dxa"/>
+              <w:left w:w="150" w:type="dxa"/>
+              <w:right w:w="150" w:type="dxa"/>
             </w:tcMar>
-            <w:vAlign w:val="center"/>
           </w:tcPr>
           <w:p>
             <w:r>
               <w:rPr>
-                <w:rFonts w:ascii="Segoe UI" w:hAnsi="Segoe UI"/>
-                <w:color w:val="1B2B24"/>
-                <w:sz w:val="18"/>
+                <w:rFonts w:ascii="Consolas" w:hAnsi="Consolas"/>
+                <w:color w:val="C2410C"/>
+                <w:sz w:val="17"/>
               </w:rPr>
-              <w:t>Username: dr_sharma / Password: counselor123 (Client queues, slots)</w:t>
+              <w:t>git status</w:t>
+            </w:r>
+          </w:p>
+        </w:tc>
+        <w:tc>
+          <w:tcPr>
+            <w:tcW w:type="dxa" w:w="3888"/>
+            <w:shd w:fill="F8FAFC"/>
+            <w:tcMar>
+              <w:top w:w="90" w:type="dxa"/>
+              <w:bottom w:w="90" w:type="dxa"/>
+              <w:left w:w="150" w:type="dxa"/>
+              <w:right w:w="150" w:type="dxa"/>
+            </w:tcMar>
+          </w:tcPr>
+          <w:p>
+            <w:r>
+              <w:rPr>
+                <w:rFonts w:ascii="Arial" w:hAnsi="Arial"/>
+                <w:sz w:val="17"/>
+              </w:rPr>
+              <w:t>Audits current modified, staged, and untracked files before staging changes.</w:t>
             </w:r>
           </w:p>
         </w:tc>
@@ -2709,44 +604,20 @@
             <w:tcW w:type="dxa" w:w="2592"/>
             <w:shd w:fill="FFFFFF"/>
             <w:tcMar>
-              <w:top w:w="100" w:type="dxa"/>
-              <w:bottom w:w="100" w:type="dxa"/>
-              <w:left w:w="120" w:type="dxa"/>
-              <w:right w:w="120" w:type="dxa"/>
+              <w:top w:w="90" w:type="dxa"/>
+              <w:bottom w:w="90" w:type="dxa"/>
+              <w:left w:w="150" w:type="dxa"/>
+              <w:right w:w="150" w:type="dxa"/>
             </w:tcMar>
-            <w:vAlign w:val="center"/>
           </w:tcPr>
           <w:p>
             <w:r>
               <w:rPr>
-                <w:rFonts w:ascii="Segoe UI" w:hAnsi="Segoe UI"/>
-                <w:color w:val="1B2B24"/>
-                <w:sz w:val="18"/>
-              </w:rPr>
-              <w:t>Target GitHub Repository</w:t>
-            </w:r>
-          </w:p>
-        </w:tc>
-        <w:tc>
-          <w:tcPr>
-            <w:tcW w:type="dxa" w:w="4608"/>
-            <w:shd w:fill="FFFFFF"/>
-            <w:tcMar>
-              <w:top w:w="100" w:type="dxa"/>
-              <w:bottom w:w="100" w:type="dxa"/>
-              <w:left w:w="120" w:type="dxa"/>
-              <w:right w:w="120" w:type="dxa"/>
-            </w:tcMar>
-            <w:vAlign w:val="center"/>
-          </w:tcPr>
-          <w:p>
-            <w:r>
-              <w:rPr>
-                <w:rFonts w:ascii="Consolas" w:hAnsi="Consolas"/>
-                <w:color w:val="1B2B24"/>
+                <w:rFonts w:ascii="Arial" w:hAnsi="Arial"/>
+                <w:b/>
                 <w:sz w:val="17"/>
               </w:rPr>
-              <w:t>https://github.com/ChahatModi18/sarathi-your-mental-wellness-companion</w:t>
+              <w:t>Step 2: Security Verification</w:t>
             </w:r>
           </w:p>
         </w:tc>
@@ -2755,21 +626,41 @@
             <w:tcW w:type="dxa" w:w="3600"/>
             <w:shd w:fill="FFFFFF"/>
             <w:tcMar>
-              <w:top w:w="100" w:type="dxa"/>
-              <w:bottom w:w="100" w:type="dxa"/>
-              <w:left w:w="120" w:type="dxa"/>
-              <w:right w:w="120" w:type="dxa"/>
+              <w:top w:w="90" w:type="dxa"/>
+              <w:bottom w:w="90" w:type="dxa"/>
+              <w:left w:w="150" w:type="dxa"/>
+              <w:right w:w="150" w:type="dxa"/>
             </w:tcMar>
-            <w:vAlign w:val="center"/>
           </w:tcPr>
           <w:p>
             <w:r>
               <w:rPr>
-                <w:rFonts w:ascii="Segoe UI" w:hAnsi="Segoe UI"/>
-                <w:color w:val="1B2B24"/>
-                <w:sz w:val="18"/>
+                <w:rFonts w:ascii="Consolas" w:hAnsi="Consolas"/>
+                <w:color w:val="C2410C"/>
+                <w:sz w:val="17"/>
               </w:rPr>
-              <w:t>Sanitized repository, 58 passing tests, complete documentation library</w:t>
+              <w:t>Verify .gitignore</w:t>
+            </w:r>
+          </w:p>
+        </w:tc>
+        <w:tc>
+          <w:tcPr>
+            <w:tcW w:type="dxa" w:w="3888"/>
+            <w:shd w:fill="FFFFFF"/>
+            <w:tcMar>
+              <w:top w:w="90" w:type="dxa"/>
+              <w:bottom w:w="90" w:type="dxa"/>
+              <w:left w:w="150" w:type="dxa"/>
+              <w:right w:w="150" w:type="dxa"/>
+            </w:tcMar>
+          </w:tcPr>
+          <w:p>
+            <w:r>
+              <w:rPr>
+                <w:rFonts w:ascii="Arial" w:hAnsi="Arial"/>
+                <w:sz w:val="17"/>
+              </w:rPr>
+              <w:t>Ensures .env, credentials, secrets, logs, and temporary caches are strictly excluded.</w:t>
             </w:r>
           </w:p>
         </w:tc>
@@ -2778,69 +669,971 @@
         <w:tc>
           <w:tcPr>
             <w:tcW w:type="dxa" w:w="2592"/>
-            <w:shd w:fill="F4F7F5"/>
+            <w:shd w:fill="F8FAFC"/>
             <w:tcMar>
-              <w:top w:w="100" w:type="dxa"/>
-              <w:bottom w:w="100" w:type="dxa"/>
-              <w:left w:w="120" w:type="dxa"/>
-              <w:right w:w="120" w:type="dxa"/>
+              <w:top w:w="90" w:type="dxa"/>
+              <w:bottom w:w="90" w:type="dxa"/>
+              <w:left w:w="150" w:type="dxa"/>
+              <w:right w:w="150" w:type="dxa"/>
             </w:tcMar>
-            <w:vAlign w:val="center"/>
           </w:tcPr>
           <w:p>
             <w:r>
               <w:rPr>
-                <w:rFonts w:ascii="Segoe UI" w:hAnsi="Segoe UI"/>
-                <w:color w:val="1B2B24"/>
-                <w:sz w:val="18"/>
-              </w:rPr>
-              <w:t>Target Vercel Production</w:t>
-            </w:r>
-          </w:p>
-        </w:tc>
-        <w:tc>
-          <w:tcPr>
-            <w:tcW w:type="dxa" w:w="4608"/>
-            <w:shd w:fill="F4F7F5"/>
-            <w:tcMar>
-              <w:top w:w="100" w:type="dxa"/>
-              <w:bottom w:w="100" w:type="dxa"/>
-              <w:left w:w="120" w:type="dxa"/>
-              <w:right w:w="120" w:type="dxa"/>
-            </w:tcMar>
-            <w:vAlign w:val="center"/>
-          </w:tcPr>
-          <w:p>
-            <w:r>
-              <w:rPr>
-                <w:rFonts w:ascii="Consolas" w:hAnsi="Consolas"/>
-                <w:color w:val="1B2B24"/>
+                <w:rFonts w:ascii="Arial" w:hAnsi="Arial"/>
+                <w:b/>
                 <w:sz w:val="17"/>
               </w:rPr>
-              <w:t>https://sarathi-your-mental-wellness-companion.vercel.app</w:t>
+              <w:t>Step 3: Stage Sanitized Files</w:t>
             </w:r>
           </w:p>
         </w:tc>
         <w:tc>
           <w:tcPr>
             <w:tcW w:type="dxa" w:w="3600"/>
-            <w:shd w:fill="F4F7F5"/>
+            <w:shd w:fill="F8FAFC"/>
             <w:tcMar>
-              <w:top w:w="100" w:type="dxa"/>
-              <w:bottom w:w="100" w:type="dxa"/>
-              <w:left w:w="120" w:type="dxa"/>
-              <w:right w:w="120" w:type="dxa"/>
+              <w:top w:w="90" w:type="dxa"/>
+              <w:bottom w:w="90" w:type="dxa"/>
+              <w:left w:w="150" w:type="dxa"/>
+              <w:right w:w="150" w:type="dxa"/>
             </w:tcMar>
-            <w:vAlign w:val="center"/>
           </w:tcPr>
           <w:p>
             <w:r>
               <w:rPr>
-                <w:rFonts w:ascii="Segoe UI" w:hAnsi="Segoe UI"/>
-                <w:color w:val="1B2B24"/>
-                <w:sz w:val="18"/>
+                <w:rFonts w:ascii="Consolas" w:hAnsi="Consolas"/>
+                <w:color w:val="C2410C"/>
+                <w:sz w:val="17"/>
               </w:rPr>
-              <w:t>Cloud serverless deployment with free automated SSL certificate</w:t>
+              <w:t>git add .</w:t>
+            </w:r>
+          </w:p>
+        </w:tc>
+        <w:tc>
+          <w:tcPr>
+            <w:tcW w:type="dxa" w:w="3888"/>
+            <w:shd w:fill="F8FAFC"/>
+            <w:tcMar>
+              <w:top w:w="90" w:type="dxa"/>
+              <w:bottom w:w="90" w:type="dxa"/>
+              <w:left w:w="150" w:type="dxa"/>
+              <w:right w:w="150" w:type="dxa"/>
+            </w:tcMar>
+          </w:tcPr>
+          <w:p>
+            <w:r>
+              <w:rPr>
+                <w:rFonts w:ascii="Arial" w:hAnsi="Arial"/>
+                <w:sz w:val="17"/>
+              </w:rPr>
+              <w:t>Stages all application code, templates, assets, documentation, and tests.</w:t>
+            </w:r>
+          </w:p>
+        </w:tc>
+      </w:tr>
+      <w:tr>
+        <w:tc>
+          <w:tcPr>
+            <w:tcW w:type="dxa" w:w="2592"/>
+            <w:shd w:fill="FFFFFF"/>
+            <w:tcMar>
+              <w:top w:w="90" w:type="dxa"/>
+              <w:bottom w:w="90" w:type="dxa"/>
+              <w:left w:w="150" w:type="dxa"/>
+              <w:right w:w="150" w:type="dxa"/>
+            </w:tcMar>
+          </w:tcPr>
+          <w:p>
+            <w:r>
+              <w:rPr>
+                <w:rFonts w:ascii="Arial" w:hAnsi="Arial"/>
+                <w:b/>
+                <w:sz w:val="17"/>
+              </w:rPr>
+              <w:t>Step 4: Commit Cryptographic Snapshot</w:t>
+            </w:r>
+          </w:p>
+        </w:tc>
+        <w:tc>
+          <w:tcPr>
+            <w:tcW w:type="dxa" w:w="3600"/>
+            <w:shd w:fill="FFFFFF"/>
+            <w:tcMar>
+              <w:top w:w="90" w:type="dxa"/>
+              <w:bottom w:w="90" w:type="dxa"/>
+              <w:left w:w="150" w:type="dxa"/>
+              <w:right w:w="150" w:type="dxa"/>
+            </w:tcMar>
+          </w:tcPr>
+          <w:p>
+            <w:r>
+              <w:rPr>
+                <w:rFonts w:ascii="Consolas" w:hAnsi="Consolas"/>
+                <w:color w:val="C2410C"/>
+                <w:sz w:val="17"/>
+              </w:rPr>
+              <w:t>git commit -m "feat: release Sarathi..."</w:t>
+            </w:r>
+          </w:p>
+        </w:tc>
+        <w:tc>
+          <w:tcPr>
+            <w:tcW w:type="dxa" w:w="3888"/>
+            <w:shd w:fill="FFFFFF"/>
+            <w:tcMar>
+              <w:top w:w="90" w:type="dxa"/>
+              <w:bottom w:w="90" w:type="dxa"/>
+              <w:left w:w="150" w:type="dxa"/>
+              <w:right w:w="150" w:type="dxa"/>
+            </w:tcMar>
+          </w:tcPr>
+          <w:p>
+            <w:r>
+              <w:rPr>
+                <w:rFonts w:ascii="Arial" w:hAnsi="Arial"/>
+                <w:sz w:val="17"/>
+              </w:rPr>
+              <w:t>Creates a secure commit record with semantic metadata in local history.</w:t>
+            </w:r>
+          </w:p>
+        </w:tc>
+      </w:tr>
+      <w:tr>
+        <w:tc>
+          <w:tcPr>
+            <w:tcW w:type="dxa" w:w="2592"/>
+            <w:shd w:fill="F8FAFC"/>
+            <w:tcMar>
+              <w:top w:w="90" w:type="dxa"/>
+              <w:bottom w:w="90" w:type="dxa"/>
+              <w:left w:w="150" w:type="dxa"/>
+              <w:right w:w="150" w:type="dxa"/>
+            </w:tcMar>
+          </w:tcPr>
+          <w:p>
+            <w:r>
+              <w:rPr>
+                <w:rFonts w:ascii="Arial" w:hAnsi="Arial"/>
+                <w:b/>
+                <w:sz w:val="17"/>
+              </w:rPr>
+              <w:t>Step 5: Set Primary Branch</w:t>
+            </w:r>
+          </w:p>
+        </w:tc>
+        <w:tc>
+          <w:tcPr>
+            <w:tcW w:type="dxa" w:w="3600"/>
+            <w:shd w:fill="F8FAFC"/>
+            <w:tcMar>
+              <w:top w:w="90" w:type="dxa"/>
+              <w:bottom w:w="90" w:type="dxa"/>
+              <w:left w:w="150" w:type="dxa"/>
+              <w:right w:w="150" w:type="dxa"/>
+            </w:tcMar>
+          </w:tcPr>
+          <w:p>
+            <w:r>
+              <w:rPr>
+                <w:rFonts w:ascii="Consolas" w:hAnsi="Consolas"/>
+                <w:color w:val="C2410C"/>
+                <w:sz w:val="17"/>
+              </w:rPr>
+              <w:t>git branch -M main</w:t>
+            </w:r>
+          </w:p>
+        </w:tc>
+        <w:tc>
+          <w:tcPr>
+            <w:tcW w:type="dxa" w:w="3888"/>
+            <w:shd w:fill="F8FAFC"/>
+            <w:tcMar>
+              <w:top w:w="90" w:type="dxa"/>
+              <w:bottom w:w="90" w:type="dxa"/>
+              <w:left w:w="150" w:type="dxa"/>
+              <w:right w:w="150" w:type="dxa"/>
+            </w:tcMar>
+          </w:tcPr>
+          <w:p>
+            <w:r>
+              <w:rPr>
+                <w:rFonts w:ascii="Arial" w:hAnsi="Arial"/>
+                <w:sz w:val="17"/>
+              </w:rPr>
+              <w:t>Standardizes the primary production branch to main.</w:t>
+            </w:r>
+          </w:p>
+        </w:tc>
+      </w:tr>
+      <w:tr>
+        <w:tc>
+          <w:tcPr>
+            <w:tcW w:type="dxa" w:w="2592"/>
+            <w:shd w:fill="FFFFFF"/>
+            <w:tcMar>
+              <w:top w:w="90" w:type="dxa"/>
+              <w:bottom w:w="90" w:type="dxa"/>
+              <w:left w:w="150" w:type="dxa"/>
+              <w:right w:w="150" w:type="dxa"/>
+            </w:tcMar>
+          </w:tcPr>
+          <w:p>
+            <w:r>
+              <w:rPr>
+                <w:rFonts w:ascii="Arial" w:hAnsi="Arial"/>
+                <w:b/>
+                <w:sz w:val="17"/>
+              </w:rPr>
+              <w:t>Step 6: Remote Repository Initialization</w:t>
+            </w:r>
+          </w:p>
+        </w:tc>
+        <w:tc>
+          <w:tcPr>
+            <w:tcW w:type="dxa" w:w="3600"/>
+            <w:shd w:fill="FFFFFF"/>
+            <w:tcMar>
+              <w:top w:w="90" w:type="dxa"/>
+              <w:bottom w:w="90" w:type="dxa"/>
+              <w:left w:w="150" w:type="dxa"/>
+              <w:right w:w="150" w:type="dxa"/>
+            </w:tcMar>
+          </w:tcPr>
+          <w:p>
+            <w:r>
+              <w:rPr>
+                <w:rFonts w:ascii="Consolas" w:hAnsi="Consolas"/>
+                <w:color w:val="C2410C"/>
+                <w:sz w:val="17"/>
+              </w:rPr>
+              <w:t>POST https://api.github.com/user/repos</w:t>
+            </w:r>
+          </w:p>
+        </w:tc>
+        <w:tc>
+          <w:tcPr>
+            <w:tcW w:type="dxa" w:w="3888"/>
+            <w:shd w:fill="FFFFFF"/>
+            <w:tcMar>
+              <w:top w:w="90" w:type="dxa"/>
+              <w:bottom w:w="90" w:type="dxa"/>
+              <w:left w:w="150" w:type="dxa"/>
+              <w:right w:w="150" w:type="dxa"/>
+            </w:tcMar>
+          </w:tcPr>
+          <w:p>
+            <w:r>
+              <w:rPr>
+                <w:rFonts w:ascii="Arial" w:hAnsi="Arial"/>
+                <w:sz w:val="17"/>
+              </w:rPr>
+              <w:t>Initializes the remote repository sarathi-your-mental-wellness-companion on GitHub.</w:t>
+            </w:r>
+          </w:p>
+        </w:tc>
+      </w:tr>
+      <w:tr>
+        <w:tc>
+          <w:tcPr>
+            <w:tcW w:type="dxa" w:w="2592"/>
+            <w:shd w:fill="F8FAFC"/>
+            <w:tcMar>
+              <w:top w:w="90" w:type="dxa"/>
+              <w:bottom w:w="90" w:type="dxa"/>
+              <w:left w:w="150" w:type="dxa"/>
+              <w:right w:w="150" w:type="dxa"/>
+            </w:tcMar>
+          </w:tcPr>
+          <w:p>
+            <w:r>
+              <w:rPr>
+                <w:rFonts w:ascii="Arial" w:hAnsi="Arial"/>
+                <w:b/>
+                <w:sz w:val="17"/>
+              </w:rPr>
+              <w:t>Step 7: Configure Remote Origin</w:t>
+            </w:r>
+          </w:p>
+        </w:tc>
+        <w:tc>
+          <w:tcPr>
+            <w:tcW w:type="dxa" w:w="3600"/>
+            <w:shd w:fill="F8FAFC"/>
+            <w:tcMar>
+              <w:top w:w="90" w:type="dxa"/>
+              <w:bottom w:w="90" w:type="dxa"/>
+              <w:left w:w="150" w:type="dxa"/>
+              <w:right w:w="150" w:type="dxa"/>
+            </w:tcMar>
+          </w:tcPr>
+          <w:p>
+            <w:r>
+              <w:rPr>
+                <w:rFonts w:ascii="Consolas" w:hAnsi="Consolas"/>
+                <w:color w:val="C2410C"/>
+                <w:sz w:val="17"/>
+              </w:rPr>
+              <w:t>git remote set-url origin https://github.com/...</w:t>
+            </w:r>
+          </w:p>
+        </w:tc>
+        <w:tc>
+          <w:tcPr>
+            <w:tcW w:type="dxa" w:w="3888"/>
+            <w:shd w:fill="F8FAFC"/>
+            <w:tcMar>
+              <w:top w:w="90" w:type="dxa"/>
+              <w:bottom w:w="90" w:type="dxa"/>
+              <w:left w:w="150" w:type="dxa"/>
+              <w:right w:w="150" w:type="dxa"/>
+            </w:tcMar>
+          </w:tcPr>
+          <w:p>
+            <w:r>
+              <w:rPr>
+                <w:rFonts w:ascii="Arial" w:hAnsi="Arial"/>
+                <w:sz w:val="17"/>
+              </w:rPr>
+              <w:t>Sets the origin fetch and push URLs pointing to the created repository.</w:t>
+            </w:r>
+          </w:p>
+        </w:tc>
+      </w:tr>
+      <w:tr>
+        <w:tc>
+          <w:tcPr>
+            <w:tcW w:type="dxa" w:w="2592"/>
+            <w:shd w:fill="FFFFFF"/>
+            <w:tcMar>
+              <w:top w:w="90" w:type="dxa"/>
+              <w:bottom w:w="90" w:type="dxa"/>
+              <w:left w:w="150" w:type="dxa"/>
+              <w:right w:w="150" w:type="dxa"/>
+            </w:tcMar>
+          </w:tcPr>
+          <w:p>
+            <w:r>
+              <w:rPr>
+                <w:rFonts w:ascii="Arial" w:hAnsi="Arial"/>
+                <w:b/>
+                <w:sz w:val="17"/>
+              </w:rPr>
+              <w:t>Step 8: Transmit to Remote Main</w:t>
+            </w:r>
+          </w:p>
+        </w:tc>
+        <w:tc>
+          <w:tcPr>
+            <w:tcW w:type="dxa" w:w="3600"/>
+            <w:shd w:fill="FFFFFF"/>
+            <w:tcMar>
+              <w:top w:w="90" w:type="dxa"/>
+              <w:bottom w:w="90" w:type="dxa"/>
+              <w:left w:w="150" w:type="dxa"/>
+              <w:right w:w="150" w:type="dxa"/>
+            </w:tcMar>
+          </w:tcPr>
+          <w:p>
+            <w:r>
+              <w:rPr>
+                <w:rFonts w:ascii="Consolas" w:hAnsi="Consolas"/>
+                <w:color w:val="C2410C"/>
+                <w:sz w:val="17"/>
+              </w:rPr>
+              <w:t>git push -u origin main</w:t>
+            </w:r>
+          </w:p>
+        </w:tc>
+        <w:tc>
+          <w:tcPr>
+            <w:tcW w:type="dxa" w:w="3888"/>
+            <w:shd w:fill="FFFFFF"/>
+            <w:tcMar>
+              <w:top w:w="90" w:type="dxa"/>
+              <w:bottom w:w="90" w:type="dxa"/>
+              <w:left w:w="150" w:type="dxa"/>
+              <w:right w:w="150" w:type="dxa"/>
+            </w:tcMar>
+          </w:tcPr>
+          <w:p>
+            <w:r>
+              <w:rPr>
+                <w:rFonts w:ascii="Arial" w:hAnsi="Arial"/>
+                <w:sz w:val="17"/>
+              </w:rPr>
+              <w:t>Transmits all commits, history, and branches up to GitHub.</w:t>
+            </w:r>
+          </w:p>
+        </w:tc>
+      </w:tr>
+    </w:tbl>
+    <w:p>
+      <w:pPr>
+        <w:spacing w:after="240"/>
+      </w:pPr>
+    </w:p>
+    <w:p>
+      <w:pPr>
+        <w:pStyle w:val="Heading1"/>
+      </w:pPr>
+      <w:r>
+        <w:rPr>
+          <w:rFonts w:ascii="Arial" w:hAnsi="Arial"/>
+          <w:b/>
+          <w:color w:val="0E7490"/>
+          <w:sz w:val="28"/>
+        </w:rPr>
+        <w:t>3. Vercel Serverless Deployment Commands Reference Table</w:t>
+      </w:r>
+    </w:p>
+    <w:tbl>
+      <w:tblPr>
+        <w:tblW w:type="auto" w:w="0"/>
+        <w:jc w:val="center"/>
+        <w:tblLook w:firstColumn="1" w:firstRow="1" w:lastColumn="0" w:lastRow="0" w:noHBand="0" w:noVBand="1" w:val="04A0"/>
+      </w:tblPr>
+      <w:tblGrid>
+        <w:gridCol w:w="3360"/>
+        <w:gridCol w:w="3360"/>
+        <w:gridCol w:w="3360"/>
+      </w:tblGrid>
+      <w:tr>
+        <w:tc>
+          <w:tcPr>
+            <w:tcW w:type="dxa" w:w="2592"/>
+            <w:shd w:fill="047857"/>
+            <w:tcMar>
+              <w:top w:w="120" w:type="dxa"/>
+              <w:bottom w:w="120" w:type="dxa"/>
+              <w:left w:w="150" w:type="dxa"/>
+              <w:right w:w="150" w:type="dxa"/>
+            </w:tcMar>
+          </w:tcPr>
+          <w:p>
+            <w:r>
+              <w:rPr>
+                <w:rFonts w:ascii="Arial" w:hAnsi="Arial"/>
+                <w:b/>
+                <w:color w:val="FFFFFF"/>
+                <w:sz w:val="19"/>
+              </w:rPr>
+              <w:t>Deployment Phase</w:t>
+            </w:r>
+          </w:p>
+        </w:tc>
+        <w:tc>
+          <w:tcPr>
+            <w:tcW w:type="dxa" w:w="3744"/>
+            <w:shd w:fill="047857"/>
+            <w:tcMar>
+              <w:top w:w="120" w:type="dxa"/>
+              <w:bottom w:w="120" w:type="dxa"/>
+              <w:left w:w="150" w:type="dxa"/>
+              <w:right w:w="150" w:type="dxa"/>
+            </w:tcMar>
+          </w:tcPr>
+          <w:p>
+            <w:r>
+              <w:rPr>
+                <w:rFonts w:ascii="Arial" w:hAnsi="Arial"/>
+                <w:b/>
+                <w:color w:val="FFFFFF"/>
+                <w:sz w:val="19"/>
+              </w:rPr>
+              <w:t>Vercel Command</w:t>
+            </w:r>
+          </w:p>
+        </w:tc>
+        <w:tc>
+          <w:tcPr>
+            <w:tcW w:type="dxa" w:w="3744"/>
+            <w:shd w:fill="047857"/>
+            <w:tcMar>
+              <w:top w:w="120" w:type="dxa"/>
+              <w:bottom w:w="120" w:type="dxa"/>
+              <w:left w:w="150" w:type="dxa"/>
+              <w:right w:w="150" w:type="dxa"/>
+            </w:tcMar>
+          </w:tcPr>
+          <w:p>
+            <w:r>
+              <w:rPr>
+                <w:rFonts w:ascii="Arial" w:hAnsi="Arial"/>
+                <w:b/>
+                <w:color w:val="FFFFFF"/>
+                <w:sz w:val="19"/>
+              </w:rPr>
+              <w:t>Purpose &amp; Operational Impact</w:t>
+            </w:r>
+          </w:p>
+        </w:tc>
+      </w:tr>
+      <w:tr>
+        <w:tc>
+          <w:tcPr>
+            <w:tcW w:type="dxa" w:w="2592"/>
+            <w:shd w:fill="F8FAFC"/>
+            <w:tcMar>
+              <w:top w:w="90" w:type="dxa"/>
+              <w:bottom w:w="90" w:type="dxa"/>
+              <w:left w:w="150" w:type="dxa"/>
+              <w:right w:w="150" w:type="dxa"/>
+            </w:tcMar>
+          </w:tcPr>
+          <w:p>
+            <w:r>
+              <w:rPr>
+                <w:rFonts w:ascii="Arial" w:hAnsi="Arial"/>
+                <w:b/>
+                <w:sz w:val="17"/>
+              </w:rPr>
+              <w:t>Step 1: Routing Configuration</w:t>
+            </w:r>
+          </w:p>
+        </w:tc>
+        <w:tc>
+          <w:tcPr>
+            <w:tcW w:type="dxa" w:w="3744"/>
+            <w:shd w:fill="F8FAFC"/>
+            <w:tcMar>
+              <w:top w:w="90" w:type="dxa"/>
+              <w:bottom w:w="90" w:type="dxa"/>
+              <w:left w:w="150" w:type="dxa"/>
+              <w:right w:w="150" w:type="dxa"/>
+            </w:tcMar>
+          </w:tcPr>
+          <w:p>
+            <w:r>
+              <w:rPr>
+                <w:rFonts w:ascii="Consolas" w:hAnsi="Consolas"/>
+                <w:color w:val="047857"/>
+                <w:sz w:val="17"/>
+              </w:rPr>
+              <w:t>cat vercel.json</w:t>
+            </w:r>
+          </w:p>
+        </w:tc>
+        <w:tc>
+          <w:tcPr>
+            <w:tcW w:type="dxa" w:w="3744"/>
+            <w:shd w:fill="F8FAFC"/>
+            <w:tcMar>
+              <w:top w:w="90" w:type="dxa"/>
+              <w:bottom w:w="90" w:type="dxa"/>
+              <w:left w:w="150" w:type="dxa"/>
+              <w:right w:w="150" w:type="dxa"/>
+            </w:tcMar>
+          </w:tcPr>
+          <w:p>
+            <w:r>
+              <w:rPr>
+                <w:rFonts w:ascii="Arial" w:hAnsi="Arial"/>
+                <w:sz w:val="17"/>
+              </w:rPr>
+              <w:t>Verifies routing rules, @vercel/python runtime, and maxDuration settings.</w:t>
+            </w:r>
+          </w:p>
+        </w:tc>
+      </w:tr>
+      <w:tr>
+        <w:tc>
+          <w:tcPr>
+            <w:tcW w:type="dxa" w:w="2592"/>
+            <w:shd w:fill="FFFFFF"/>
+            <w:tcMar>
+              <w:top w:w="90" w:type="dxa"/>
+              <w:bottom w:w="90" w:type="dxa"/>
+              <w:left w:w="150" w:type="dxa"/>
+              <w:right w:w="150" w:type="dxa"/>
+            </w:tcMar>
+          </w:tcPr>
+          <w:p>
+            <w:r>
+              <w:rPr>
+                <w:rFonts w:ascii="Arial" w:hAnsi="Arial"/>
+                <w:b/>
+                <w:sz w:val="17"/>
+              </w:rPr>
+              <w:t>Step 2: Serverless Requirements</w:t>
+            </w:r>
+          </w:p>
+        </w:tc>
+        <w:tc>
+          <w:tcPr>
+            <w:tcW w:type="dxa" w:w="3744"/>
+            <w:shd w:fill="FFFFFF"/>
+            <w:tcMar>
+              <w:top w:w="90" w:type="dxa"/>
+              <w:bottom w:w="90" w:type="dxa"/>
+              <w:left w:w="150" w:type="dxa"/>
+              <w:right w:w="150" w:type="dxa"/>
+            </w:tcMar>
+          </w:tcPr>
+          <w:p>
+            <w:r>
+              <w:rPr>
+                <w:rFonts w:ascii="Consolas" w:hAnsi="Consolas"/>
+                <w:color w:val="047857"/>
+                <w:sz w:val="17"/>
+              </w:rPr>
+              <w:t>cat requirements.txt</w:t>
+            </w:r>
+          </w:p>
+        </w:tc>
+        <w:tc>
+          <w:tcPr>
+            <w:tcW w:type="dxa" w:w="3744"/>
+            <w:shd w:fill="FFFFFF"/>
+            <w:tcMar>
+              <w:top w:w="90" w:type="dxa"/>
+              <w:bottom w:w="90" w:type="dxa"/>
+              <w:left w:w="150" w:type="dxa"/>
+              <w:right w:w="150" w:type="dxa"/>
+            </w:tcMar>
+          </w:tcPr>
+          <w:p>
+            <w:r>
+              <w:rPr>
+                <w:rFonts w:ascii="Arial" w:hAnsi="Arial"/>
+                <w:sz w:val="17"/>
+              </w:rPr>
+              <w:t>Ensures web dependencies are segregated from heavy desktop GUI dependencies.</w:t>
+            </w:r>
+          </w:p>
+        </w:tc>
+      </w:tr>
+      <w:tr>
+        <w:tc>
+          <w:tcPr>
+            <w:tcW w:type="dxa" w:w="2592"/>
+            <w:shd w:fill="F8FAFC"/>
+            <w:tcMar>
+              <w:top w:w="90" w:type="dxa"/>
+              <w:bottom w:w="90" w:type="dxa"/>
+              <w:left w:w="150" w:type="dxa"/>
+              <w:right w:w="150" w:type="dxa"/>
+            </w:tcMar>
+          </w:tcPr>
+          <w:p>
+            <w:r>
+              <w:rPr>
+                <w:rFonts w:ascii="Arial" w:hAnsi="Arial"/>
+                <w:b/>
+                <w:sz w:val="17"/>
+              </w:rPr>
+              <w:t>Step 3: CLI Authentication</w:t>
+            </w:r>
+          </w:p>
+        </w:tc>
+        <w:tc>
+          <w:tcPr>
+            <w:tcW w:type="dxa" w:w="3744"/>
+            <w:shd w:fill="F8FAFC"/>
+            <w:tcMar>
+              <w:top w:w="90" w:type="dxa"/>
+              <w:bottom w:w="90" w:type="dxa"/>
+              <w:left w:w="150" w:type="dxa"/>
+              <w:right w:w="150" w:type="dxa"/>
+            </w:tcMar>
+          </w:tcPr>
+          <w:p>
+            <w:r>
+              <w:rPr>
+                <w:rFonts w:ascii="Consolas" w:hAnsi="Consolas"/>
+                <w:color w:val="047857"/>
+                <w:sz w:val="17"/>
+              </w:rPr>
+              <w:t>npx vercel login</w:t>
+            </w:r>
+          </w:p>
+        </w:tc>
+        <w:tc>
+          <w:tcPr>
+            <w:tcW w:type="dxa" w:w="3744"/>
+            <w:shd w:fill="F8FAFC"/>
+            <w:tcMar>
+              <w:top w:w="90" w:type="dxa"/>
+              <w:bottom w:w="90" w:type="dxa"/>
+              <w:left w:w="150" w:type="dxa"/>
+              <w:right w:w="150" w:type="dxa"/>
+            </w:tcMar>
+          </w:tcPr>
+          <w:p>
+            <w:r>
+              <w:rPr>
+                <w:rFonts w:ascii="Arial" w:hAnsi="Arial"/>
+                <w:sz w:val="17"/>
+              </w:rPr>
+              <w:t>Authenticates CLI session with Vercel team/account (chahatmodi18).</w:t>
+            </w:r>
+          </w:p>
+        </w:tc>
+      </w:tr>
+      <w:tr>
+        <w:tc>
+          <w:tcPr>
+            <w:tcW w:type="dxa" w:w="2592"/>
+            <w:shd w:fill="FFFFFF"/>
+            <w:tcMar>
+              <w:top w:w="90" w:type="dxa"/>
+              <w:bottom w:w="90" w:type="dxa"/>
+              <w:left w:w="150" w:type="dxa"/>
+              <w:right w:w="150" w:type="dxa"/>
+            </w:tcMar>
+          </w:tcPr>
+          <w:p>
+            <w:r>
+              <w:rPr>
+                <w:rFonts w:ascii="Arial" w:hAnsi="Arial"/>
+                <w:b/>
+                <w:sz w:val="17"/>
+              </w:rPr>
+              <w:t>Step 4: Project Linkage</w:t>
+            </w:r>
+          </w:p>
+        </w:tc>
+        <w:tc>
+          <w:tcPr>
+            <w:tcW w:type="dxa" w:w="3744"/>
+            <w:shd w:fill="FFFFFF"/>
+            <w:tcMar>
+              <w:top w:w="90" w:type="dxa"/>
+              <w:bottom w:w="90" w:type="dxa"/>
+              <w:left w:w="150" w:type="dxa"/>
+              <w:right w:w="150" w:type="dxa"/>
+            </w:tcMar>
+          </w:tcPr>
+          <w:p>
+            <w:r>
+              <w:rPr>
+                <w:rFonts w:ascii="Consolas" w:hAnsi="Consolas"/>
+                <w:color w:val="047857"/>
+                <w:sz w:val="17"/>
+              </w:rPr>
+              <w:t>npx vercel link</w:t>
+            </w:r>
+          </w:p>
+        </w:tc>
+        <w:tc>
+          <w:tcPr>
+            <w:tcW w:type="dxa" w:w="3744"/>
+            <w:shd w:fill="FFFFFF"/>
+            <w:tcMar>
+              <w:top w:w="90" w:type="dxa"/>
+              <w:bottom w:w="90" w:type="dxa"/>
+              <w:left w:w="150" w:type="dxa"/>
+              <w:right w:w="150" w:type="dxa"/>
+            </w:tcMar>
+          </w:tcPr>
+          <w:p>
+            <w:r>
+              <w:rPr>
+                <w:rFonts w:ascii="Arial" w:hAnsi="Arial"/>
+                <w:sz w:val="17"/>
+              </w:rPr>
+              <w:t>Associates the working tree with the Vercel project sarathi-your-mental-wellness-companion.</w:t>
+            </w:r>
+          </w:p>
+        </w:tc>
+      </w:tr>
+      <w:tr>
+        <w:tc>
+          <w:tcPr>
+            <w:tcW w:type="dxa" w:w="2592"/>
+            <w:shd w:fill="F8FAFC"/>
+            <w:tcMar>
+              <w:top w:w="90" w:type="dxa"/>
+              <w:bottom w:w="90" w:type="dxa"/>
+              <w:left w:w="150" w:type="dxa"/>
+              <w:right w:w="150" w:type="dxa"/>
+            </w:tcMar>
+          </w:tcPr>
+          <w:p>
+            <w:r>
+              <w:rPr>
+                <w:rFonts w:ascii="Arial" w:hAnsi="Arial"/>
+                <w:b/>
+                <w:sz w:val="17"/>
+              </w:rPr>
+              <w:t>Step 5: Cloud Secrets Setup</w:t>
+            </w:r>
+          </w:p>
+        </w:tc>
+        <w:tc>
+          <w:tcPr>
+            <w:tcW w:type="dxa" w:w="3744"/>
+            <w:shd w:fill="F8FAFC"/>
+            <w:tcMar>
+              <w:top w:w="90" w:type="dxa"/>
+              <w:bottom w:w="90" w:type="dxa"/>
+              <w:left w:w="150" w:type="dxa"/>
+              <w:right w:w="150" w:type="dxa"/>
+            </w:tcMar>
+          </w:tcPr>
+          <w:p>
+            <w:r>
+              <w:rPr>
+                <w:rFonts w:ascii="Consolas" w:hAnsi="Consolas"/>
+                <w:color w:val="047857"/>
+                <w:sz w:val="17"/>
+              </w:rPr>
+              <w:t>npx vercel env add FLASK_SECRET_KEY production</w:t>
+            </w:r>
+          </w:p>
+        </w:tc>
+        <w:tc>
+          <w:tcPr>
+            <w:tcW w:type="dxa" w:w="3744"/>
+            <w:shd w:fill="F8FAFC"/>
+            <w:tcMar>
+              <w:top w:w="90" w:type="dxa"/>
+              <w:bottom w:w="90" w:type="dxa"/>
+              <w:left w:w="150" w:type="dxa"/>
+              <w:right w:w="150" w:type="dxa"/>
+            </w:tcMar>
+          </w:tcPr>
+          <w:p>
+            <w:r>
+              <w:rPr>
+                <w:rFonts w:ascii="Arial" w:hAnsi="Arial"/>
+                <w:sz w:val="17"/>
+              </w:rPr>
+              <w:t>Securely provisions encrypted production secrets into Vercel Cloud KMS.</w:t>
+            </w:r>
+          </w:p>
+        </w:tc>
+      </w:tr>
+      <w:tr>
+        <w:tc>
+          <w:tcPr>
+            <w:tcW w:type="dxa" w:w="2592"/>
+            <w:shd w:fill="FFFFFF"/>
+            <w:tcMar>
+              <w:top w:w="90" w:type="dxa"/>
+              <w:bottom w:w="90" w:type="dxa"/>
+              <w:left w:w="150" w:type="dxa"/>
+              <w:right w:w="150" w:type="dxa"/>
+            </w:tcMar>
+          </w:tcPr>
+          <w:p>
+            <w:r>
+              <w:rPr>
+                <w:rFonts w:ascii="Arial" w:hAnsi="Arial"/>
+                <w:b/>
+                <w:sz w:val="17"/>
+              </w:rPr>
+              <w:t>Step 6: Production Edge Deployment</w:t>
+            </w:r>
+          </w:p>
+        </w:tc>
+        <w:tc>
+          <w:tcPr>
+            <w:tcW w:type="dxa" w:w="3744"/>
+            <w:shd w:fill="FFFFFF"/>
+            <w:tcMar>
+              <w:top w:w="90" w:type="dxa"/>
+              <w:bottom w:w="90" w:type="dxa"/>
+              <w:left w:w="150" w:type="dxa"/>
+              <w:right w:w="150" w:type="dxa"/>
+            </w:tcMar>
+          </w:tcPr>
+          <w:p>
+            <w:r>
+              <w:rPr>
+                <w:rFonts w:ascii="Consolas" w:hAnsi="Consolas"/>
+                <w:color w:val="047857"/>
+                <w:sz w:val="17"/>
+              </w:rPr>
+              <w:t>npx vercel deploy --prod --yes</w:t>
+            </w:r>
+          </w:p>
+        </w:tc>
+        <w:tc>
+          <w:tcPr>
+            <w:tcW w:type="dxa" w:w="3744"/>
+            <w:shd w:fill="FFFFFF"/>
+            <w:tcMar>
+              <w:top w:w="90" w:type="dxa"/>
+              <w:bottom w:w="90" w:type="dxa"/>
+              <w:left w:w="150" w:type="dxa"/>
+              <w:right w:w="150" w:type="dxa"/>
+            </w:tcMar>
+          </w:tcPr>
+          <w:p>
+            <w:r>
+              <w:rPr>
+                <w:rFonts w:ascii="Arial" w:hAnsi="Arial"/>
+                <w:sz w:val="17"/>
+              </w:rPr>
+              <w:t>Builds, bundles, and transmits serverless functions to Vercel global edge CDN.</w:t>
+            </w:r>
+          </w:p>
+        </w:tc>
+      </w:tr>
+      <w:tr>
+        <w:tc>
+          <w:tcPr>
+            <w:tcW w:type="dxa" w:w="2592"/>
+            <w:shd w:fill="F8FAFC"/>
+            <w:tcMar>
+              <w:top w:w="90" w:type="dxa"/>
+              <w:bottom w:w="90" w:type="dxa"/>
+              <w:left w:w="150" w:type="dxa"/>
+              <w:right w:w="150" w:type="dxa"/>
+            </w:tcMar>
+          </w:tcPr>
+          <w:p>
+            <w:r>
+              <w:rPr>
+                <w:rFonts w:ascii="Arial" w:hAnsi="Arial"/>
+                <w:b/>
+                <w:sz w:val="17"/>
+              </w:rPr>
+              <w:t>Step 7: Verification &amp; Health Check</w:t>
+            </w:r>
+          </w:p>
+        </w:tc>
+        <w:tc>
+          <w:tcPr>
+            <w:tcW w:type="dxa" w:w="3744"/>
+            <w:shd w:fill="F8FAFC"/>
+            <w:tcMar>
+              <w:top w:w="90" w:type="dxa"/>
+              <w:bottom w:w="90" w:type="dxa"/>
+              <w:left w:w="150" w:type="dxa"/>
+              <w:right w:w="150" w:type="dxa"/>
+            </w:tcMar>
+          </w:tcPr>
+          <w:p>
+            <w:r>
+              <w:rPr>
+                <w:rFonts w:ascii="Consolas" w:hAnsi="Consolas"/>
+                <w:color w:val="047857"/>
+                <w:sz w:val="17"/>
+              </w:rPr>
+              <w:t>curl -I https://sarathi-your-mental-wellness-compan.vercel.app</w:t>
+            </w:r>
+          </w:p>
+        </w:tc>
+        <w:tc>
+          <w:tcPr>
+            <w:tcW w:type="dxa" w:w="3744"/>
+            <w:shd w:fill="F8FAFC"/>
+            <w:tcMar>
+              <w:top w:w="90" w:type="dxa"/>
+              <w:bottom w:w="90" w:type="dxa"/>
+              <w:left w:w="150" w:type="dxa"/>
+              <w:right w:w="150" w:type="dxa"/>
+            </w:tcMar>
+          </w:tcPr>
+          <w:p>
+            <w:r>
+              <w:rPr>
+                <w:rFonts w:ascii="Arial" w:hAnsi="Arial"/>
+                <w:sz w:val="17"/>
+              </w:rPr>
+              <w:t>Verifies production edge routing, WSGI initialization, and HTTP 200 status.</w:t>
             </w:r>
           </w:p>
         </w:tc>
@@ -2848,7 +1641,7 @@
     </w:tbl>
     <w:sectPr>
       <w:pgSz w:w="12240" w:h="15840"/>
-      <w:pgMar w:top="1152" w:right="1152" w:bottom="1152" w:left="1152" w:header="720" w:footer="720" w:gutter="0"/>
+      <w:pgMar w:top="1080" w:right="1080" w:bottom="1080" w:left="1080" w:header="720" w:footer="720" w:gutter="0"/>
       <w:cols w:space="720"/>
       <w:docGrid w:linePitch="360"/>
     </w:sectPr>

</xml_diff>

<commit_message>
chore(repo): exclude gui_desktop from git web repository and add GitHub Actions CI/CD verify & deploy workflow
</commit_message>
<xml_diff>
--- a/Sarathi_Deployment_Commands_Guide.docx
+++ b/Sarathi_Deployment_Commands_Guide.docx
@@ -27,14 +27,14 @@
           <w:rFonts w:ascii="Arial" w:hAnsi="Arial"/>
           <w:i/>
           <w:color w:val="475569"/>
-          <w:sz w:val="26"/>
+          <w:sz w:val="24"/>
         </w:rPr>
-        <w:t>Deployment Architecture &amp; Command Reference Guide (GitHub + Vercel)</w:t>
+        <w:t>Deployment Architecture &amp; Command Reference Guide (GitHub + Vercel + GitHub Actions)</w:t>
       </w:r>
     </w:p>
     <w:p>
       <w:pPr>
-        <w:spacing w:after="320"/>
+        <w:spacing w:after="280"/>
       </w:pPr>
       <w:r>
         <w:rPr>
@@ -48,9 +48,7 @@
         <w:br/>
         <w:t>Primary Production URL: https://sarathi-your-mental-wellness-compan.vercel.app</w:t>
         <w:br/>
-        <w:t>Direct Deployment URL: https://sarathi-your-mental-wellness-companion-3xv8j6ust.vercel.app</w:t>
-        <w:br/>
-        <w:t>Status: Verified Operational (HTTP 200 OK) | 58/58 Automated Tests Passing</w:t>
+        <w:t>Status: Verified Operational (HTTP 200 OK) | 58/58 Tests Passing | Pure Web Repository</w:t>
       </w:r>
     </w:p>
     <w:p>
@@ -62,7 +60,7 @@
           <w:rFonts w:ascii="Arial" w:hAnsi="Arial"/>
           <w:b/>
           <w:color w:val="0E7490"/>
-          <w:sz w:val="28"/>
+          <w:sz w:val="26"/>
         </w:rPr>
         <w:t>1. Verified Live Deployment Links</w:t>
       </w:r>
@@ -84,8 +82,8 @@
             <w:tcW w:type="dxa" w:w="2592"/>
             <w:shd w:fill="0E7490"/>
             <w:tcMar>
-              <w:top w:w="120" w:type="dxa"/>
-              <w:bottom w:w="120" w:type="dxa"/>
+              <w:top w:w="100" w:type="dxa"/>
+              <w:bottom w:w="100" w:type="dxa"/>
               <w:left w:w="150" w:type="dxa"/>
               <w:right w:w="150" w:type="dxa"/>
             </w:tcMar>
@@ -96,7 +94,7 @@
                 <w:rFonts w:ascii="Arial" w:hAnsi="Arial"/>
                 <w:b/>
                 <w:color w:val="FFFFFF"/>
-                <w:sz w:val="19"/>
+                <w:sz w:val="18"/>
               </w:rPr>
               <w:t>Resource</w:t>
             </w:r>
@@ -107,8 +105,8 @@
             <w:tcW w:type="dxa" w:w="5184"/>
             <w:shd w:fill="0E7490"/>
             <w:tcMar>
-              <w:top w:w="120" w:type="dxa"/>
-              <w:bottom w:w="120" w:type="dxa"/>
+              <w:top w:w="100" w:type="dxa"/>
+              <w:bottom w:w="100" w:type="dxa"/>
               <w:left w:w="150" w:type="dxa"/>
               <w:right w:w="150" w:type="dxa"/>
             </w:tcMar>
@@ -119,7 +117,7 @@
                 <w:rFonts w:ascii="Arial" w:hAnsi="Arial"/>
                 <w:b/>
                 <w:color w:val="FFFFFF"/>
-                <w:sz w:val="19"/>
+                <w:sz w:val="18"/>
               </w:rPr>
               <w:t>Direct URL / Destination</w:t>
             </w:r>
@@ -130,8 +128,8 @@
             <w:tcW w:type="dxa" w:w="2304"/>
             <w:shd w:fill="0E7490"/>
             <w:tcMar>
-              <w:top w:w="120" w:type="dxa"/>
-              <w:bottom w:w="120" w:type="dxa"/>
+              <w:top w:w="100" w:type="dxa"/>
+              <w:bottom w:w="100" w:type="dxa"/>
               <w:left w:w="150" w:type="dxa"/>
               <w:right w:w="150" w:type="dxa"/>
             </w:tcMar>
@@ -142,7 +140,7 @@
                 <w:rFonts w:ascii="Arial" w:hAnsi="Arial"/>
                 <w:b/>
                 <w:color w:val="FFFFFF"/>
-                <w:sz w:val="19"/>
+                <w:sz w:val="18"/>
               </w:rPr>
               <w:t>Operational Status</w:t>
             </w:r>
@@ -155,8 +153,8 @@
             <w:tcW w:type="dxa" w:w="2592"/>
             <w:shd w:fill="F8FAFC"/>
             <w:tcMar>
-              <w:top w:w="90" w:type="dxa"/>
-              <w:bottom w:w="90" w:type="dxa"/>
+              <w:top w:w="70" w:type="dxa"/>
+              <w:bottom w:w="70" w:type="dxa"/>
               <w:left w:w="150" w:type="dxa"/>
               <w:right w:w="150" w:type="dxa"/>
             </w:tcMar>
@@ -167,7 +165,7 @@
                 <w:rFonts w:ascii="Arial" w:hAnsi="Arial"/>
                 <w:b/>
                 <w:color w:val="1E293B"/>
-                <w:sz w:val="17"/>
+                <w:sz w:val="16"/>
               </w:rPr>
               <w:t>GitHub Repository</w:t>
             </w:r>
@@ -178,8 +176,8 @@
             <w:tcW w:type="dxa" w:w="5184"/>
             <w:shd w:fill="F8FAFC"/>
             <w:tcMar>
-              <w:top w:w="90" w:type="dxa"/>
-              <w:bottom w:w="90" w:type="dxa"/>
+              <w:top w:w="70" w:type="dxa"/>
+              <w:bottom w:w="70" w:type="dxa"/>
               <w:left w:w="150" w:type="dxa"/>
               <w:right w:w="150" w:type="dxa"/>
             </w:tcMar>
@@ -189,7 +187,7 @@
               <w:rPr>
                 <w:rFonts w:ascii="Arial" w:hAnsi="Arial"/>
                 <w:color w:val="2563EB"/>
-                <w:sz w:val="17"/>
+                <w:sz w:val="16"/>
               </w:rPr>
               <w:t>https://github.com/ChahatModi18/sarathi-your-mental-wellness-companion</w:t>
             </w:r>
@@ -200,8 +198,8 @@
             <w:tcW w:type="dxa" w:w="2304"/>
             <w:shd w:fill="F8FAFC"/>
             <w:tcMar>
-              <w:top w:w="90" w:type="dxa"/>
-              <w:bottom w:w="90" w:type="dxa"/>
+              <w:top w:w="70" w:type="dxa"/>
+              <w:bottom w:w="70" w:type="dxa"/>
               <w:left w:w="150" w:type="dxa"/>
               <w:right w:w="150" w:type="dxa"/>
             </w:tcMar>
@@ -212,7 +210,7 @@
                 <w:rFonts w:ascii="Arial" w:hAnsi="Arial"/>
                 <w:b/>
                 <w:color w:val="166534"/>
-                <w:sz w:val="17"/>
+                <w:sz w:val="16"/>
               </w:rPr>
               <w:t>Published (main branch)</w:t>
             </w:r>
@@ -225,8 +223,8 @@
             <w:tcW w:type="dxa" w:w="2592"/>
             <w:shd w:fill="FFFFFF"/>
             <w:tcMar>
-              <w:top w:w="90" w:type="dxa"/>
-              <w:bottom w:w="90" w:type="dxa"/>
+              <w:top w:w="70" w:type="dxa"/>
+              <w:bottom w:w="70" w:type="dxa"/>
               <w:left w:w="150" w:type="dxa"/>
               <w:right w:w="150" w:type="dxa"/>
             </w:tcMar>
@@ -237,7 +235,7 @@
                 <w:rFonts w:ascii="Arial" w:hAnsi="Arial"/>
                 <w:b/>
                 <w:color w:val="1E293B"/>
-                <w:sz w:val="17"/>
+                <w:sz w:val="16"/>
               </w:rPr>
               <w:t>Vercel Production Domain</w:t>
             </w:r>
@@ -248,8 +246,8 @@
             <w:tcW w:type="dxa" w:w="5184"/>
             <w:shd w:fill="FFFFFF"/>
             <w:tcMar>
-              <w:top w:w="90" w:type="dxa"/>
-              <w:bottom w:w="90" w:type="dxa"/>
+              <w:top w:w="70" w:type="dxa"/>
+              <w:bottom w:w="70" w:type="dxa"/>
               <w:left w:w="150" w:type="dxa"/>
               <w:right w:w="150" w:type="dxa"/>
             </w:tcMar>
@@ -259,7 +257,7 @@
               <w:rPr>
                 <w:rFonts w:ascii="Arial" w:hAnsi="Arial"/>
                 <w:color w:val="2563EB"/>
-                <w:sz w:val="17"/>
+                <w:sz w:val="16"/>
               </w:rPr>
               <w:t>https://sarathi-your-mental-wellness-compan.vercel.app</w:t>
             </w:r>
@@ -270,8 +268,8 @@
             <w:tcW w:type="dxa" w:w="2304"/>
             <w:shd w:fill="FFFFFF"/>
             <w:tcMar>
-              <w:top w:w="90" w:type="dxa"/>
-              <w:bottom w:w="90" w:type="dxa"/>
+              <w:top w:w="70" w:type="dxa"/>
+              <w:bottom w:w="70" w:type="dxa"/>
               <w:left w:w="150" w:type="dxa"/>
               <w:right w:w="150" w:type="dxa"/>
             </w:tcMar>
@@ -282,7 +280,7 @@
                 <w:rFonts w:ascii="Arial" w:hAnsi="Arial"/>
                 <w:b/>
                 <w:color w:val="166534"/>
-                <w:sz w:val="17"/>
+                <w:sz w:val="16"/>
               </w:rPr>
               <w:t>Live &amp; Active (HTTP 200)</w:t>
             </w:r>
@@ -295,8 +293,8 @@
             <w:tcW w:type="dxa" w:w="2592"/>
             <w:shd w:fill="F8FAFC"/>
             <w:tcMar>
-              <w:top w:w="90" w:type="dxa"/>
-              <w:bottom w:w="90" w:type="dxa"/>
+              <w:top w:w="70" w:type="dxa"/>
+              <w:bottom w:w="70" w:type="dxa"/>
               <w:left w:w="150" w:type="dxa"/>
               <w:right w:w="150" w:type="dxa"/>
             </w:tcMar>
@@ -307,7 +305,7 @@
                 <w:rFonts w:ascii="Arial" w:hAnsi="Arial"/>
                 <w:b/>
                 <w:color w:val="1E293B"/>
-                <w:sz w:val="17"/>
+                <w:sz w:val="16"/>
               </w:rPr>
               <w:t>Vercel Deployment URL</w:t>
             </w:r>
@@ -318,8 +316,8 @@
             <w:tcW w:type="dxa" w:w="5184"/>
             <w:shd w:fill="F8FAFC"/>
             <w:tcMar>
-              <w:top w:w="90" w:type="dxa"/>
-              <w:bottom w:w="90" w:type="dxa"/>
+              <w:top w:w="70" w:type="dxa"/>
+              <w:bottom w:w="70" w:type="dxa"/>
               <w:left w:w="150" w:type="dxa"/>
               <w:right w:w="150" w:type="dxa"/>
             </w:tcMar>
@@ -329,9 +327,9 @@
               <w:rPr>
                 <w:rFonts w:ascii="Arial" w:hAnsi="Arial"/>
                 <w:color w:val="2563EB"/>
-                <w:sz w:val="17"/>
+                <w:sz w:val="16"/>
               </w:rPr>
-              <w:t>https://sarathi-your-mental-wellness-companion-3xv8j6ust.vercel.app</w:t>
+              <w:t>https://sarathi-your-mental-wellness-companion-xmv5px3is.vercel.app</w:t>
             </w:r>
           </w:p>
         </w:tc>
@@ -340,8 +338,8 @@
             <w:tcW w:type="dxa" w:w="2304"/>
             <w:shd w:fill="F8FAFC"/>
             <w:tcMar>
-              <w:top w:w="90" w:type="dxa"/>
-              <w:bottom w:w="90" w:type="dxa"/>
+              <w:top w:w="70" w:type="dxa"/>
+              <w:bottom w:w="70" w:type="dxa"/>
               <w:left w:w="150" w:type="dxa"/>
               <w:right w:w="150" w:type="dxa"/>
             </w:tcMar>
@@ -352,7 +350,7 @@
                 <w:rFonts w:ascii="Arial" w:hAnsi="Arial"/>
                 <w:b/>
                 <w:color w:val="166534"/>
-                <w:sz w:val="17"/>
+                <w:sz w:val="16"/>
               </w:rPr>
               <w:t>Deployed (READY)</w:t>
             </w:r>
@@ -365,8 +363,8 @@
             <w:tcW w:type="dxa" w:w="2592"/>
             <w:shd w:fill="FFFFFF"/>
             <w:tcMar>
-              <w:top w:w="90" w:type="dxa"/>
-              <w:bottom w:w="90" w:type="dxa"/>
+              <w:top w:w="70" w:type="dxa"/>
+              <w:bottom w:w="70" w:type="dxa"/>
               <w:left w:w="150" w:type="dxa"/>
               <w:right w:w="150" w:type="dxa"/>
             </w:tcMar>
@@ -377,7 +375,7 @@
                 <w:rFonts w:ascii="Arial" w:hAnsi="Arial"/>
                 <w:b/>
                 <w:color w:val="1E293B"/>
-                <w:sz w:val="17"/>
+                <w:sz w:val="16"/>
               </w:rPr>
               <w:t>Vercel Inspect Console</w:t>
             </w:r>
@@ -388,8 +386,8 @@
             <w:tcW w:type="dxa" w:w="5184"/>
             <w:shd w:fill="FFFFFF"/>
             <w:tcMar>
-              <w:top w:w="90" w:type="dxa"/>
-              <w:bottom w:w="90" w:type="dxa"/>
+              <w:top w:w="70" w:type="dxa"/>
+              <w:bottom w:w="70" w:type="dxa"/>
               <w:left w:w="150" w:type="dxa"/>
               <w:right w:w="150" w:type="dxa"/>
             </w:tcMar>
@@ -399,9 +397,9 @@
               <w:rPr>
                 <w:rFonts w:ascii="Arial" w:hAnsi="Arial"/>
                 <w:color w:val="2563EB"/>
-                <w:sz w:val="17"/>
+                <w:sz w:val="16"/>
               </w:rPr>
-              <w:t>https://vercel.com/chahatmodi18s-projects/sarathi-your-mental-wellness-companion/H8npvgSsTDoqRpaHCdCndSNHyWEj</w:t>
+              <w:t>https://vercel.com/chahatmodi18s-projects/sarathi-your-mental-wellness-companion/...</w:t>
             </w:r>
           </w:p>
         </w:tc>
@@ -410,8 +408,8 @@
             <w:tcW w:type="dxa" w:w="2304"/>
             <w:shd w:fill="FFFFFF"/>
             <w:tcMar>
-              <w:top w:w="90" w:type="dxa"/>
-              <w:bottom w:w="90" w:type="dxa"/>
+              <w:top w:w="70" w:type="dxa"/>
+              <w:bottom w:w="70" w:type="dxa"/>
               <w:left w:w="150" w:type="dxa"/>
               <w:right w:w="150" w:type="dxa"/>
             </w:tcMar>
@@ -422,9 +420,79 @@
                 <w:rFonts w:ascii="Arial" w:hAnsi="Arial"/>
                 <w:b/>
                 <w:color w:val="166534"/>
-                <w:sz w:val="17"/>
+                <w:sz w:val="16"/>
               </w:rPr>
               <w:t>Monitoring Active</w:t>
+            </w:r>
+          </w:p>
+        </w:tc>
+      </w:tr>
+      <w:tr>
+        <w:tc>
+          <w:tcPr>
+            <w:tcW w:type="dxa" w:w="2592"/>
+            <w:shd w:fill="F8FAFC"/>
+            <w:tcMar>
+              <w:top w:w="70" w:type="dxa"/>
+              <w:bottom w:w="70" w:type="dxa"/>
+              <w:left w:w="150" w:type="dxa"/>
+              <w:right w:w="150" w:type="dxa"/>
+            </w:tcMar>
+          </w:tcPr>
+          <w:p>
+            <w:r>
+              <w:rPr>
+                <w:rFonts w:ascii="Arial" w:hAnsi="Arial"/>
+                <w:b/>
+                <w:color w:val="1E293B"/>
+                <w:sz w:val="16"/>
+              </w:rPr>
+              <w:t>GitHub Actions CI/CD</w:t>
+            </w:r>
+          </w:p>
+        </w:tc>
+        <w:tc>
+          <w:tcPr>
+            <w:tcW w:type="dxa" w:w="5184"/>
+            <w:shd w:fill="F8FAFC"/>
+            <w:tcMar>
+              <w:top w:w="70" w:type="dxa"/>
+              <w:bottom w:w="70" w:type="dxa"/>
+              <w:left w:w="150" w:type="dxa"/>
+              <w:right w:w="150" w:type="dxa"/>
+            </w:tcMar>
+          </w:tcPr>
+          <w:p>
+            <w:r>
+              <w:rPr>
+                <w:rFonts w:ascii="Arial" w:hAnsi="Arial"/>
+                <w:color w:val="2563EB"/>
+                <w:sz w:val="16"/>
+              </w:rPr>
+              <w:t>https://github.com/ChahatModi18/sarathi-your-mental-wellness-companion/actions</w:t>
+            </w:r>
+          </w:p>
+        </w:tc>
+        <w:tc>
+          <w:tcPr>
+            <w:tcW w:type="dxa" w:w="2304"/>
+            <w:shd w:fill="F8FAFC"/>
+            <w:tcMar>
+              <w:top w:w="70" w:type="dxa"/>
+              <w:bottom w:w="70" w:type="dxa"/>
+              <w:left w:w="150" w:type="dxa"/>
+              <w:right w:w="150" w:type="dxa"/>
+            </w:tcMar>
+          </w:tcPr>
+          <w:p>
+            <w:r>
+              <w:rPr>
+                <w:rFonts w:ascii="Arial" w:hAnsi="Arial"/>
+                <w:b/>
+                <w:color w:val="166534"/>
+                <w:sz w:val="16"/>
+              </w:rPr>
+              <w:t>Automated Verification</w:t>
             </w:r>
           </w:p>
         </w:tc>
@@ -432,7 +500,7 @@
     </w:tbl>
     <w:p>
       <w:pPr>
-        <w:spacing w:after="240"/>
+        <w:spacing w:after="200"/>
       </w:pPr>
     </w:p>
     <w:p>
@@ -444,7 +512,7 @@
           <w:rFonts w:ascii="Arial" w:hAnsi="Arial"/>
           <w:b/>
           <w:color w:val="0E7490"/>
-          <w:sz w:val="28"/>
+          <w:sz w:val="26"/>
         </w:rPr>
         <w:t>2. GitHub Deployment Commands Reference Table</w:t>
       </w:r>
@@ -466,8 +534,8 @@
             <w:tcW w:type="dxa" w:w="2592"/>
             <w:shd w:fill="1E293B"/>
             <w:tcMar>
-              <w:top w:w="120" w:type="dxa"/>
-              <w:bottom w:w="120" w:type="dxa"/>
+              <w:top w:w="100" w:type="dxa"/>
+              <w:bottom w:w="100" w:type="dxa"/>
               <w:left w:w="150" w:type="dxa"/>
               <w:right w:w="150" w:type="dxa"/>
             </w:tcMar>
@@ -478,7 +546,7 @@
                 <w:rFonts w:ascii="Arial" w:hAnsi="Arial"/>
                 <w:b/>
                 <w:color w:val="FFFFFF"/>
-                <w:sz w:val="19"/>
+                <w:sz w:val="18"/>
               </w:rPr>
               <w:t>Execution Stage</w:t>
             </w:r>
@@ -489,8 +557,8 @@
             <w:tcW w:type="dxa" w:w="3600"/>
             <w:shd w:fill="1E293B"/>
             <w:tcMar>
-              <w:top w:w="120" w:type="dxa"/>
-              <w:bottom w:w="120" w:type="dxa"/>
+              <w:top w:w="100" w:type="dxa"/>
+              <w:bottom w:w="100" w:type="dxa"/>
               <w:left w:w="150" w:type="dxa"/>
               <w:right w:w="150" w:type="dxa"/>
             </w:tcMar>
@@ -501,7 +569,7 @@
                 <w:rFonts w:ascii="Arial" w:hAnsi="Arial"/>
                 <w:b/>
                 <w:color w:val="FFFFFF"/>
-                <w:sz w:val="19"/>
+                <w:sz w:val="18"/>
               </w:rPr>
               <w:t>Command / Operation</w:t>
             </w:r>
@@ -512,8 +580,8 @@
             <w:tcW w:type="dxa" w:w="3888"/>
             <w:shd w:fill="1E293B"/>
             <w:tcMar>
-              <w:top w:w="120" w:type="dxa"/>
-              <w:bottom w:w="120" w:type="dxa"/>
+              <w:top w:w="100" w:type="dxa"/>
+              <w:bottom w:w="100" w:type="dxa"/>
               <w:left w:w="150" w:type="dxa"/>
               <w:right w:w="150" w:type="dxa"/>
             </w:tcMar>
@@ -524,7 +592,7 @@
                 <w:rFonts w:ascii="Arial" w:hAnsi="Arial"/>
                 <w:b/>
                 <w:color w:val="FFFFFF"/>
-                <w:sz w:val="19"/>
+                <w:sz w:val="18"/>
               </w:rPr>
               <w:t>Technical Purpose &amp; Function</w:t>
             </w:r>
@@ -537,8 +605,8 @@
             <w:tcW w:type="dxa" w:w="2592"/>
             <w:shd w:fill="F8FAFC"/>
             <w:tcMar>
-              <w:top w:w="90" w:type="dxa"/>
-              <w:bottom w:w="90" w:type="dxa"/>
+              <w:top w:w="70" w:type="dxa"/>
+              <w:bottom w:w="70" w:type="dxa"/>
               <w:left w:w="150" w:type="dxa"/>
               <w:right w:w="150" w:type="dxa"/>
             </w:tcMar>
@@ -548,7 +616,7 @@
               <w:rPr>
                 <w:rFonts w:ascii="Arial" w:hAnsi="Arial"/>
                 <w:b/>
-                <w:sz w:val="17"/>
+                <w:sz w:val="16"/>
               </w:rPr>
               <w:t>Step 1: Check Working Tree</w:t>
             </w:r>
@@ -559,8 +627,8 @@
             <w:tcW w:type="dxa" w:w="3600"/>
             <w:shd w:fill="F8FAFC"/>
             <w:tcMar>
-              <w:top w:w="90" w:type="dxa"/>
-              <w:bottom w:w="90" w:type="dxa"/>
+              <w:top w:w="70" w:type="dxa"/>
+              <w:bottom w:w="70" w:type="dxa"/>
               <w:left w:w="150" w:type="dxa"/>
               <w:right w:w="150" w:type="dxa"/>
             </w:tcMar>
@@ -570,7 +638,7 @@
               <w:rPr>
                 <w:rFonts w:ascii="Consolas" w:hAnsi="Consolas"/>
                 <w:color w:val="C2410C"/>
-                <w:sz w:val="17"/>
+                <w:sz w:val="16"/>
               </w:rPr>
               <w:t>git status</w:t>
             </w:r>
@@ -581,8 +649,8 @@
             <w:tcW w:type="dxa" w:w="3888"/>
             <w:shd w:fill="F8FAFC"/>
             <w:tcMar>
-              <w:top w:w="90" w:type="dxa"/>
-              <w:bottom w:w="90" w:type="dxa"/>
+              <w:top w:w="70" w:type="dxa"/>
+              <w:bottom w:w="70" w:type="dxa"/>
               <w:left w:w="150" w:type="dxa"/>
               <w:right w:w="150" w:type="dxa"/>
             </w:tcMar>
@@ -591,7 +659,7 @@
             <w:r>
               <w:rPr>
                 <w:rFonts w:ascii="Arial" w:hAnsi="Arial"/>
-                <w:sz w:val="17"/>
+                <w:sz w:val="16"/>
               </w:rPr>
               <w:t>Audits current modified, staged, and untracked files before staging changes.</w:t>
             </w:r>
@@ -604,8 +672,8 @@
             <w:tcW w:type="dxa" w:w="2592"/>
             <w:shd w:fill="FFFFFF"/>
             <w:tcMar>
-              <w:top w:w="90" w:type="dxa"/>
-              <w:bottom w:w="90" w:type="dxa"/>
+              <w:top w:w="70" w:type="dxa"/>
+              <w:bottom w:w="70" w:type="dxa"/>
               <w:left w:w="150" w:type="dxa"/>
               <w:right w:w="150" w:type="dxa"/>
             </w:tcMar>
@@ -615,7 +683,7 @@
               <w:rPr>
                 <w:rFonts w:ascii="Arial" w:hAnsi="Arial"/>
                 <w:b/>
-                <w:sz w:val="17"/>
+                <w:sz w:val="16"/>
               </w:rPr>
               <w:t>Step 2: Security Verification</w:t>
             </w:r>
@@ -626,8 +694,8 @@
             <w:tcW w:type="dxa" w:w="3600"/>
             <w:shd w:fill="FFFFFF"/>
             <w:tcMar>
-              <w:top w:w="90" w:type="dxa"/>
-              <w:bottom w:w="90" w:type="dxa"/>
+              <w:top w:w="70" w:type="dxa"/>
+              <w:bottom w:w="70" w:type="dxa"/>
               <w:left w:w="150" w:type="dxa"/>
               <w:right w:w="150" w:type="dxa"/>
             </w:tcMar>
@@ -637,7 +705,7 @@
               <w:rPr>
                 <w:rFonts w:ascii="Consolas" w:hAnsi="Consolas"/>
                 <w:color w:val="C2410C"/>
-                <w:sz w:val="17"/>
+                <w:sz w:val="16"/>
               </w:rPr>
               <w:t>Verify .gitignore</w:t>
             </w:r>
@@ -648,8 +716,8 @@
             <w:tcW w:type="dxa" w:w="3888"/>
             <w:shd w:fill="FFFFFF"/>
             <w:tcMar>
-              <w:top w:w="90" w:type="dxa"/>
-              <w:bottom w:w="90" w:type="dxa"/>
+              <w:top w:w="70" w:type="dxa"/>
+              <w:bottom w:w="70" w:type="dxa"/>
               <w:left w:w="150" w:type="dxa"/>
               <w:right w:w="150" w:type="dxa"/>
             </w:tcMar>
@@ -658,9 +726,9 @@
             <w:r>
               <w:rPr>
                 <w:rFonts w:ascii="Arial" w:hAnsi="Arial"/>
-                <w:sz w:val="17"/>
+                <w:sz w:val="16"/>
               </w:rPr>
-              <w:t>Ensures .env, credentials, secrets, logs, and temporary caches are strictly excluded.</w:t>
+              <w:t>Ensures .env, credentials, gui_desktop, logs, and temporary caches are strictly excluded.</w:t>
             </w:r>
           </w:p>
         </w:tc>
@@ -671,8 +739,8 @@
             <w:tcW w:type="dxa" w:w="2592"/>
             <w:shd w:fill="F8FAFC"/>
             <w:tcMar>
-              <w:top w:w="90" w:type="dxa"/>
-              <w:bottom w:w="90" w:type="dxa"/>
+              <w:top w:w="70" w:type="dxa"/>
+              <w:bottom w:w="70" w:type="dxa"/>
               <w:left w:w="150" w:type="dxa"/>
               <w:right w:w="150" w:type="dxa"/>
             </w:tcMar>
@@ -682,9 +750,9 @@
               <w:rPr>
                 <w:rFonts w:ascii="Arial" w:hAnsi="Arial"/>
                 <w:b/>
-                <w:sz w:val="17"/>
+                <w:sz w:val="16"/>
               </w:rPr>
-              <w:t>Step 3: Stage Sanitized Files</w:t>
+              <w:t>Step 3: Remove Desktop GUI</w:t>
             </w:r>
           </w:p>
         </w:tc>
@@ -693,8 +761,8 @@
             <w:tcW w:type="dxa" w:w="3600"/>
             <w:shd w:fill="F8FAFC"/>
             <w:tcMar>
-              <w:top w:w="90" w:type="dxa"/>
-              <w:bottom w:w="90" w:type="dxa"/>
+              <w:top w:w="70" w:type="dxa"/>
+              <w:bottom w:w="70" w:type="dxa"/>
               <w:left w:w="150" w:type="dxa"/>
               <w:right w:w="150" w:type="dxa"/>
             </w:tcMar>
@@ -704,9 +772,9 @@
               <w:rPr>
                 <w:rFonts w:ascii="Consolas" w:hAnsi="Consolas"/>
                 <w:color w:val="C2410C"/>
-                <w:sz w:val="17"/>
+                <w:sz w:val="16"/>
               </w:rPr>
-              <w:t>git add .</w:t>
+              <w:t>git rm -r --cached gui_desktop</w:t>
             </w:r>
           </w:p>
         </w:tc>
@@ -715,8 +783,8 @@
             <w:tcW w:type="dxa" w:w="3888"/>
             <w:shd w:fill="F8FAFC"/>
             <w:tcMar>
-              <w:top w:w="90" w:type="dxa"/>
-              <w:bottom w:w="90" w:type="dxa"/>
+              <w:top w:w="70" w:type="dxa"/>
+              <w:bottom w:w="70" w:type="dxa"/>
               <w:left w:w="150" w:type="dxa"/>
               <w:right w:w="150" w:type="dxa"/>
             </w:tcMar>
@@ -725,9 +793,9 @@
             <w:r>
               <w:rPr>
                 <w:rFonts w:ascii="Arial" w:hAnsi="Arial"/>
-                <w:sz w:val="17"/>
+                <w:sz w:val="16"/>
               </w:rPr>
-              <w:t>Stages all application code, templates, assets, documentation, and tests.</w:t>
+              <w:t>Excludes non-web GUI desktop code and heavy binary PDFs from web repository.</w:t>
             </w:r>
           </w:p>
         </w:tc>
@@ -738,8 +806,8 @@
             <w:tcW w:type="dxa" w:w="2592"/>
             <w:shd w:fill="FFFFFF"/>
             <w:tcMar>
-              <w:top w:w="90" w:type="dxa"/>
-              <w:bottom w:w="90" w:type="dxa"/>
+              <w:top w:w="70" w:type="dxa"/>
+              <w:bottom w:w="70" w:type="dxa"/>
               <w:left w:w="150" w:type="dxa"/>
               <w:right w:w="150" w:type="dxa"/>
             </w:tcMar>
@@ -749,9 +817,9 @@
               <w:rPr>
                 <w:rFonts w:ascii="Arial" w:hAnsi="Arial"/>
                 <w:b/>
-                <w:sz w:val="17"/>
+                <w:sz w:val="16"/>
               </w:rPr>
-              <w:t>Step 4: Commit Cryptographic Snapshot</w:t>
+              <w:t>Step 4: Stage Sanitized Files</w:t>
             </w:r>
           </w:p>
         </w:tc>
@@ -760,8 +828,8 @@
             <w:tcW w:type="dxa" w:w="3600"/>
             <w:shd w:fill="FFFFFF"/>
             <w:tcMar>
-              <w:top w:w="90" w:type="dxa"/>
-              <w:bottom w:w="90" w:type="dxa"/>
+              <w:top w:w="70" w:type="dxa"/>
+              <w:bottom w:w="70" w:type="dxa"/>
               <w:left w:w="150" w:type="dxa"/>
               <w:right w:w="150" w:type="dxa"/>
             </w:tcMar>
@@ -771,9 +839,9 @@
               <w:rPr>
                 <w:rFonts w:ascii="Consolas" w:hAnsi="Consolas"/>
                 <w:color w:val="C2410C"/>
-                <w:sz w:val="17"/>
+                <w:sz w:val="16"/>
               </w:rPr>
-              <w:t>git commit -m "feat: release Sarathi..."</w:t>
+              <w:t>git add .</w:t>
             </w:r>
           </w:p>
         </w:tc>
@@ -782,8 +850,8 @@
             <w:tcW w:type="dxa" w:w="3888"/>
             <w:shd w:fill="FFFFFF"/>
             <w:tcMar>
-              <w:top w:w="90" w:type="dxa"/>
-              <w:bottom w:w="90" w:type="dxa"/>
+              <w:top w:w="70" w:type="dxa"/>
+              <w:bottom w:w="70" w:type="dxa"/>
               <w:left w:w="150" w:type="dxa"/>
               <w:right w:w="150" w:type="dxa"/>
             </w:tcMar>
@@ -792,7 +860,74 @@
             <w:r>
               <w:rPr>
                 <w:rFonts w:ascii="Arial" w:hAnsi="Arial"/>
-                <w:sz w:val="17"/>
+                <w:sz w:val="16"/>
+              </w:rPr>
+              <w:t>Stages all website application code, templates, assets, documentation, and tests.</w:t>
+            </w:r>
+          </w:p>
+        </w:tc>
+      </w:tr>
+      <w:tr>
+        <w:tc>
+          <w:tcPr>
+            <w:tcW w:type="dxa" w:w="2592"/>
+            <w:shd w:fill="F8FAFC"/>
+            <w:tcMar>
+              <w:top w:w="70" w:type="dxa"/>
+              <w:bottom w:w="70" w:type="dxa"/>
+              <w:left w:w="150" w:type="dxa"/>
+              <w:right w:w="150" w:type="dxa"/>
+            </w:tcMar>
+          </w:tcPr>
+          <w:p>
+            <w:r>
+              <w:rPr>
+                <w:rFonts w:ascii="Arial" w:hAnsi="Arial"/>
+                <w:b/>
+                <w:sz w:val="16"/>
+              </w:rPr>
+              <w:t>Step 5: Commit Cryptographic Snapshot</w:t>
+            </w:r>
+          </w:p>
+        </w:tc>
+        <w:tc>
+          <w:tcPr>
+            <w:tcW w:type="dxa" w:w="3600"/>
+            <w:shd w:fill="F8FAFC"/>
+            <w:tcMar>
+              <w:top w:w="70" w:type="dxa"/>
+              <w:bottom w:w="70" w:type="dxa"/>
+              <w:left w:w="150" w:type="dxa"/>
+              <w:right w:w="150" w:type="dxa"/>
+            </w:tcMar>
+          </w:tcPr>
+          <w:p>
+            <w:r>
+              <w:rPr>
+                <w:rFonts w:ascii="Consolas" w:hAnsi="Consolas"/>
+                <w:color w:val="C2410C"/>
+                <w:sz w:val="16"/>
+              </w:rPr>
+              <w:t>git commit -m "feat: ..."</w:t>
+            </w:r>
+          </w:p>
+        </w:tc>
+        <w:tc>
+          <w:tcPr>
+            <w:tcW w:type="dxa" w:w="3888"/>
+            <w:shd w:fill="F8FAFC"/>
+            <w:tcMar>
+              <w:top w:w="70" w:type="dxa"/>
+              <w:bottom w:w="70" w:type="dxa"/>
+              <w:left w:w="150" w:type="dxa"/>
+              <w:right w:w="150" w:type="dxa"/>
+            </w:tcMar>
+          </w:tcPr>
+          <w:p>
+            <w:r>
+              <w:rPr>
+                <w:rFonts w:ascii="Arial" w:hAnsi="Arial"/>
+                <w:sz w:val="16"/>
               </w:rPr>
               <w:t>Creates a secure commit record with semantic metadata in local history.</w:t>
             </w:r>
@@ -803,10 +938,10 @@
         <w:tc>
           <w:tcPr>
             <w:tcW w:type="dxa" w:w="2592"/>
-            <w:shd w:fill="F8FAFC"/>
+            <w:shd w:fill="FFFFFF"/>
             <w:tcMar>
-              <w:top w:w="90" w:type="dxa"/>
-              <w:bottom w:w="90" w:type="dxa"/>
+              <w:top w:w="70" w:type="dxa"/>
+              <w:bottom w:w="70" w:type="dxa"/>
               <w:left w:w="150" w:type="dxa"/>
               <w:right w:w="150" w:type="dxa"/>
             </w:tcMar>
@@ -816,19 +951,19 @@
               <w:rPr>
                 <w:rFonts w:ascii="Arial" w:hAnsi="Arial"/>
                 <w:b/>
-                <w:sz w:val="17"/>
+                <w:sz w:val="16"/>
               </w:rPr>
-              <w:t>Step 5: Set Primary Branch</w:t>
+              <w:t>Step 6: Set Primary Branch</w:t>
             </w:r>
           </w:p>
         </w:tc>
         <w:tc>
           <w:tcPr>
             <w:tcW w:type="dxa" w:w="3600"/>
-            <w:shd w:fill="F8FAFC"/>
+            <w:shd w:fill="FFFFFF"/>
             <w:tcMar>
-              <w:top w:w="90" w:type="dxa"/>
-              <w:bottom w:w="90" w:type="dxa"/>
+              <w:top w:w="70" w:type="dxa"/>
+              <w:bottom w:w="70" w:type="dxa"/>
               <w:left w:w="150" w:type="dxa"/>
               <w:right w:w="150" w:type="dxa"/>
             </w:tcMar>
@@ -838,7 +973,7 @@
               <w:rPr>
                 <w:rFonts w:ascii="Consolas" w:hAnsi="Consolas"/>
                 <w:color w:val="C2410C"/>
-                <w:sz w:val="17"/>
+                <w:sz w:val="16"/>
               </w:rPr>
               <w:t>git branch -M main</w:t>
             </w:r>
@@ -847,10 +982,10 @@
         <w:tc>
           <w:tcPr>
             <w:tcW w:type="dxa" w:w="3888"/>
-            <w:shd w:fill="F8FAFC"/>
+            <w:shd w:fill="FFFFFF"/>
             <w:tcMar>
-              <w:top w:w="90" w:type="dxa"/>
-              <w:bottom w:w="90" w:type="dxa"/>
+              <w:top w:w="70" w:type="dxa"/>
+              <w:bottom w:w="70" w:type="dxa"/>
               <w:left w:w="150" w:type="dxa"/>
               <w:right w:w="150" w:type="dxa"/>
             </w:tcMar>
@@ -859,7 +994,7 @@
             <w:r>
               <w:rPr>
                 <w:rFonts w:ascii="Arial" w:hAnsi="Arial"/>
-                <w:sz w:val="17"/>
+                <w:sz w:val="16"/>
               </w:rPr>
               <w:t>Standardizes the primary production branch to main.</w:t>
             </w:r>
@@ -870,10 +1005,10 @@
         <w:tc>
           <w:tcPr>
             <w:tcW w:type="dxa" w:w="2592"/>
-            <w:shd w:fill="FFFFFF"/>
+            <w:shd w:fill="F8FAFC"/>
             <w:tcMar>
-              <w:top w:w="90" w:type="dxa"/>
-              <w:bottom w:w="90" w:type="dxa"/>
+              <w:top w:w="70" w:type="dxa"/>
+              <w:bottom w:w="70" w:type="dxa"/>
               <w:left w:w="150" w:type="dxa"/>
               <w:right w:w="150" w:type="dxa"/>
             </w:tcMar>
@@ -883,74 +1018,7 @@
               <w:rPr>
                 <w:rFonts w:ascii="Arial" w:hAnsi="Arial"/>
                 <w:b/>
-                <w:sz w:val="17"/>
-              </w:rPr>
-              <w:t>Step 6: Remote Repository Initialization</w:t>
-            </w:r>
-          </w:p>
-        </w:tc>
-        <w:tc>
-          <w:tcPr>
-            <w:tcW w:type="dxa" w:w="3600"/>
-            <w:shd w:fill="FFFFFF"/>
-            <w:tcMar>
-              <w:top w:w="90" w:type="dxa"/>
-              <w:bottom w:w="90" w:type="dxa"/>
-              <w:left w:w="150" w:type="dxa"/>
-              <w:right w:w="150" w:type="dxa"/>
-            </w:tcMar>
-          </w:tcPr>
-          <w:p>
-            <w:r>
-              <w:rPr>
-                <w:rFonts w:ascii="Consolas" w:hAnsi="Consolas"/>
-                <w:color w:val="C2410C"/>
-                <w:sz w:val="17"/>
-              </w:rPr>
-              <w:t>POST https://api.github.com/user/repos</w:t>
-            </w:r>
-          </w:p>
-        </w:tc>
-        <w:tc>
-          <w:tcPr>
-            <w:tcW w:type="dxa" w:w="3888"/>
-            <w:shd w:fill="FFFFFF"/>
-            <w:tcMar>
-              <w:top w:w="90" w:type="dxa"/>
-              <w:bottom w:w="90" w:type="dxa"/>
-              <w:left w:w="150" w:type="dxa"/>
-              <w:right w:w="150" w:type="dxa"/>
-            </w:tcMar>
-          </w:tcPr>
-          <w:p>
-            <w:r>
-              <w:rPr>
-                <w:rFonts w:ascii="Arial" w:hAnsi="Arial"/>
-                <w:sz w:val="17"/>
-              </w:rPr>
-              <w:t>Initializes the remote repository sarathi-your-mental-wellness-companion on GitHub.</w:t>
-            </w:r>
-          </w:p>
-        </w:tc>
-      </w:tr>
-      <w:tr>
-        <w:tc>
-          <w:tcPr>
-            <w:tcW w:type="dxa" w:w="2592"/>
-            <w:shd w:fill="F8FAFC"/>
-            <w:tcMar>
-              <w:top w:w="90" w:type="dxa"/>
-              <w:bottom w:w="90" w:type="dxa"/>
-              <w:left w:w="150" w:type="dxa"/>
-              <w:right w:w="150" w:type="dxa"/>
-            </w:tcMar>
-          </w:tcPr>
-          <w:p>
-            <w:r>
-              <w:rPr>
-                <w:rFonts w:ascii="Arial" w:hAnsi="Arial"/>
-                <w:b/>
-                <w:sz w:val="17"/>
+                <w:sz w:val="16"/>
               </w:rPr>
               <w:t>Step 7: Configure Remote Origin</w:t>
             </w:r>
@@ -961,8 +1029,8 @@
             <w:tcW w:type="dxa" w:w="3600"/>
             <w:shd w:fill="F8FAFC"/>
             <w:tcMar>
-              <w:top w:w="90" w:type="dxa"/>
-              <w:bottom w:w="90" w:type="dxa"/>
+              <w:top w:w="70" w:type="dxa"/>
+              <w:bottom w:w="70" w:type="dxa"/>
               <w:left w:w="150" w:type="dxa"/>
               <w:right w:w="150" w:type="dxa"/>
             </w:tcMar>
@@ -972,7 +1040,7 @@
               <w:rPr>
                 <w:rFonts w:ascii="Consolas" w:hAnsi="Consolas"/>
                 <w:color w:val="C2410C"/>
-                <w:sz w:val="17"/>
+                <w:sz w:val="16"/>
               </w:rPr>
               <w:t>git remote set-url origin https://github.com/...</w:t>
             </w:r>
@@ -983,8 +1051,8 @@
             <w:tcW w:type="dxa" w:w="3888"/>
             <w:shd w:fill="F8FAFC"/>
             <w:tcMar>
-              <w:top w:w="90" w:type="dxa"/>
-              <w:bottom w:w="90" w:type="dxa"/>
+              <w:top w:w="70" w:type="dxa"/>
+              <w:bottom w:w="70" w:type="dxa"/>
               <w:left w:w="150" w:type="dxa"/>
               <w:right w:w="150" w:type="dxa"/>
             </w:tcMar>
@@ -993,9 +1061,9 @@
             <w:r>
               <w:rPr>
                 <w:rFonts w:ascii="Arial" w:hAnsi="Arial"/>
-                <w:sz w:val="17"/>
+                <w:sz w:val="16"/>
               </w:rPr>
-              <w:t>Sets the origin fetch and push URLs pointing to the created repository.</w:t>
+              <w:t>Sets origin fetch and push URLs pointing to the created repository.</w:t>
             </w:r>
           </w:p>
         </w:tc>
@@ -1006,8 +1074,8 @@
             <w:tcW w:type="dxa" w:w="2592"/>
             <w:shd w:fill="FFFFFF"/>
             <w:tcMar>
-              <w:top w:w="90" w:type="dxa"/>
-              <w:bottom w:w="90" w:type="dxa"/>
+              <w:top w:w="70" w:type="dxa"/>
+              <w:bottom w:w="70" w:type="dxa"/>
               <w:left w:w="150" w:type="dxa"/>
               <w:right w:w="150" w:type="dxa"/>
             </w:tcMar>
@@ -1017,7 +1085,7 @@
               <w:rPr>
                 <w:rFonts w:ascii="Arial" w:hAnsi="Arial"/>
                 <w:b/>
-                <w:sz w:val="17"/>
+                <w:sz w:val="16"/>
               </w:rPr>
               <w:t>Step 8: Transmit to Remote Main</w:t>
             </w:r>
@@ -1028,8 +1096,8 @@
             <w:tcW w:type="dxa" w:w="3600"/>
             <w:shd w:fill="FFFFFF"/>
             <w:tcMar>
-              <w:top w:w="90" w:type="dxa"/>
-              <w:bottom w:w="90" w:type="dxa"/>
+              <w:top w:w="70" w:type="dxa"/>
+              <w:bottom w:w="70" w:type="dxa"/>
               <w:left w:w="150" w:type="dxa"/>
               <w:right w:w="150" w:type="dxa"/>
             </w:tcMar>
@@ -1039,7 +1107,7 @@
               <w:rPr>
                 <w:rFonts w:ascii="Consolas" w:hAnsi="Consolas"/>
                 <w:color w:val="C2410C"/>
-                <w:sz w:val="17"/>
+                <w:sz w:val="16"/>
               </w:rPr>
               <w:t>git push -u origin main</w:t>
             </w:r>
@@ -1050,8 +1118,8 @@
             <w:tcW w:type="dxa" w:w="3888"/>
             <w:shd w:fill="FFFFFF"/>
             <w:tcMar>
-              <w:top w:w="90" w:type="dxa"/>
-              <w:bottom w:w="90" w:type="dxa"/>
+              <w:top w:w="70" w:type="dxa"/>
+              <w:bottom w:w="70" w:type="dxa"/>
               <w:left w:w="150" w:type="dxa"/>
               <w:right w:w="150" w:type="dxa"/>
             </w:tcMar>
@@ -1060,7 +1128,7 @@
             <w:r>
               <w:rPr>
                 <w:rFonts w:ascii="Arial" w:hAnsi="Arial"/>
-                <w:sz w:val="17"/>
+                <w:sz w:val="16"/>
               </w:rPr>
               <w:t>Transmits all commits, history, and branches up to GitHub.</w:t>
             </w:r>
@@ -1070,7 +1138,7 @@
     </w:tbl>
     <w:p>
       <w:pPr>
-        <w:spacing w:after="240"/>
+        <w:spacing w:after="200"/>
       </w:pPr>
     </w:p>
     <w:p>
@@ -1082,7 +1150,7 @@
           <w:rFonts w:ascii="Arial" w:hAnsi="Arial"/>
           <w:b/>
           <w:color w:val="0E7490"/>
-          <w:sz w:val="28"/>
+          <w:sz w:val="26"/>
         </w:rPr>
         <w:t>3. Vercel Serverless Deployment Commands Reference Table</w:t>
       </w:r>
@@ -1104,8 +1172,8 @@
             <w:tcW w:type="dxa" w:w="2592"/>
             <w:shd w:fill="047857"/>
             <w:tcMar>
-              <w:top w:w="120" w:type="dxa"/>
-              <w:bottom w:w="120" w:type="dxa"/>
+              <w:top w:w="100" w:type="dxa"/>
+              <w:bottom w:w="100" w:type="dxa"/>
               <w:left w:w="150" w:type="dxa"/>
               <w:right w:w="150" w:type="dxa"/>
             </w:tcMar>
@@ -1116,7 +1184,7 @@
                 <w:rFonts w:ascii="Arial" w:hAnsi="Arial"/>
                 <w:b/>
                 <w:color w:val="FFFFFF"/>
-                <w:sz w:val="19"/>
+                <w:sz w:val="18"/>
               </w:rPr>
               <w:t>Deployment Phase</w:t>
             </w:r>
@@ -1127,8 +1195,8 @@
             <w:tcW w:type="dxa" w:w="3744"/>
             <w:shd w:fill="047857"/>
             <w:tcMar>
-              <w:top w:w="120" w:type="dxa"/>
-              <w:bottom w:w="120" w:type="dxa"/>
+              <w:top w:w="100" w:type="dxa"/>
+              <w:bottom w:w="100" w:type="dxa"/>
               <w:left w:w="150" w:type="dxa"/>
               <w:right w:w="150" w:type="dxa"/>
             </w:tcMar>
@@ -1139,7 +1207,7 @@
                 <w:rFonts w:ascii="Arial" w:hAnsi="Arial"/>
                 <w:b/>
                 <w:color w:val="FFFFFF"/>
-                <w:sz w:val="19"/>
+                <w:sz w:val="18"/>
               </w:rPr>
               <w:t>Vercel Command</w:t>
             </w:r>
@@ -1150,8 +1218,8 @@
             <w:tcW w:type="dxa" w:w="3744"/>
             <w:shd w:fill="047857"/>
             <w:tcMar>
-              <w:top w:w="120" w:type="dxa"/>
-              <w:bottom w:w="120" w:type="dxa"/>
+              <w:top w:w="100" w:type="dxa"/>
+              <w:bottom w:w="100" w:type="dxa"/>
               <w:left w:w="150" w:type="dxa"/>
               <w:right w:w="150" w:type="dxa"/>
             </w:tcMar>
@@ -1162,7 +1230,7 @@
                 <w:rFonts w:ascii="Arial" w:hAnsi="Arial"/>
                 <w:b/>
                 <w:color w:val="FFFFFF"/>
-                <w:sz w:val="19"/>
+                <w:sz w:val="18"/>
               </w:rPr>
               <w:t>Purpose &amp; Operational Impact</w:t>
             </w:r>
@@ -1175,8 +1243,8 @@
             <w:tcW w:type="dxa" w:w="2592"/>
             <w:shd w:fill="F8FAFC"/>
             <w:tcMar>
-              <w:top w:w="90" w:type="dxa"/>
-              <w:bottom w:w="90" w:type="dxa"/>
+              <w:top w:w="70" w:type="dxa"/>
+              <w:bottom w:w="70" w:type="dxa"/>
               <w:left w:w="150" w:type="dxa"/>
               <w:right w:w="150" w:type="dxa"/>
             </w:tcMar>
@@ -1186,7 +1254,7 @@
               <w:rPr>
                 <w:rFonts w:ascii="Arial" w:hAnsi="Arial"/>
                 <w:b/>
-                <w:sz w:val="17"/>
+                <w:sz w:val="16"/>
               </w:rPr>
               <w:t>Step 1: Routing Configuration</w:t>
             </w:r>
@@ -1197,8 +1265,8 @@
             <w:tcW w:type="dxa" w:w="3744"/>
             <w:shd w:fill="F8FAFC"/>
             <w:tcMar>
-              <w:top w:w="90" w:type="dxa"/>
-              <w:bottom w:w="90" w:type="dxa"/>
+              <w:top w:w="70" w:type="dxa"/>
+              <w:bottom w:w="70" w:type="dxa"/>
               <w:left w:w="150" w:type="dxa"/>
               <w:right w:w="150" w:type="dxa"/>
             </w:tcMar>
@@ -1208,7 +1276,7 @@
               <w:rPr>
                 <w:rFonts w:ascii="Consolas" w:hAnsi="Consolas"/>
                 <w:color w:val="047857"/>
-                <w:sz w:val="17"/>
+                <w:sz w:val="16"/>
               </w:rPr>
               <w:t>cat vercel.json</w:t>
             </w:r>
@@ -1219,8 +1287,8 @@
             <w:tcW w:type="dxa" w:w="3744"/>
             <w:shd w:fill="F8FAFC"/>
             <w:tcMar>
-              <w:top w:w="90" w:type="dxa"/>
-              <w:bottom w:w="90" w:type="dxa"/>
+              <w:top w:w="70" w:type="dxa"/>
+              <w:bottom w:w="70" w:type="dxa"/>
               <w:left w:w="150" w:type="dxa"/>
               <w:right w:w="150" w:type="dxa"/>
             </w:tcMar>
@@ -1229,7 +1297,7 @@
             <w:r>
               <w:rPr>
                 <w:rFonts w:ascii="Arial" w:hAnsi="Arial"/>
-                <w:sz w:val="17"/>
+                <w:sz w:val="16"/>
               </w:rPr>
               <w:t>Verifies routing rules, @vercel/python runtime, and maxDuration settings.</w:t>
             </w:r>
@@ -1242,8 +1310,8 @@
             <w:tcW w:type="dxa" w:w="2592"/>
             <w:shd w:fill="FFFFFF"/>
             <w:tcMar>
-              <w:top w:w="90" w:type="dxa"/>
-              <w:bottom w:w="90" w:type="dxa"/>
+              <w:top w:w="70" w:type="dxa"/>
+              <w:bottom w:w="70" w:type="dxa"/>
               <w:left w:w="150" w:type="dxa"/>
               <w:right w:w="150" w:type="dxa"/>
             </w:tcMar>
@@ -1253,7 +1321,7 @@
               <w:rPr>
                 <w:rFonts w:ascii="Arial" w:hAnsi="Arial"/>
                 <w:b/>
-                <w:sz w:val="17"/>
+                <w:sz w:val="16"/>
               </w:rPr>
               <w:t>Step 2: Serverless Requirements</w:t>
             </w:r>
@@ -1264,8 +1332,8 @@
             <w:tcW w:type="dxa" w:w="3744"/>
             <w:shd w:fill="FFFFFF"/>
             <w:tcMar>
-              <w:top w:w="90" w:type="dxa"/>
-              <w:bottom w:w="90" w:type="dxa"/>
+              <w:top w:w="70" w:type="dxa"/>
+              <w:bottom w:w="70" w:type="dxa"/>
               <w:left w:w="150" w:type="dxa"/>
               <w:right w:w="150" w:type="dxa"/>
             </w:tcMar>
@@ -1275,7 +1343,7 @@
               <w:rPr>
                 <w:rFonts w:ascii="Consolas" w:hAnsi="Consolas"/>
                 <w:color w:val="047857"/>
-                <w:sz w:val="17"/>
+                <w:sz w:val="16"/>
               </w:rPr>
               <w:t>cat requirements.txt</w:t>
             </w:r>
@@ -1286,8 +1354,8 @@
             <w:tcW w:type="dxa" w:w="3744"/>
             <w:shd w:fill="FFFFFF"/>
             <w:tcMar>
-              <w:top w:w="90" w:type="dxa"/>
-              <w:bottom w:w="90" w:type="dxa"/>
+              <w:top w:w="70" w:type="dxa"/>
+              <w:bottom w:w="70" w:type="dxa"/>
               <w:left w:w="150" w:type="dxa"/>
               <w:right w:w="150" w:type="dxa"/>
             </w:tcMar>
@@ -1296,7 +1364,7 @@
             <w:r>
               <w:rPr>
                 <w:rFonts w:ascii="Arial" w:hAnsi="Arial"/>
-                <w:sz w:val="17"/>
+                <w:sz w:val="16"/>
               </w:rPr>
               <w:t>Ensures web dependencies are segregated from heavy desktop GUI dependencies.</w:t>
             </w:r>
@@ -1309,8 +1377,8 @@
             <w:tcW w:type="dxa" w:w="2592"/>
             <w:shd w:fill="F8FAFC"/>
             <w:tcMar>
-              <w:top w:w="90" w:type="dxa"/>
-              <w:bottom w:w="90" w:type="dxa"/>
+              <w:top w:w="70" w:type="dxa"/>
+              <w:bottom w:w="70" w:type="dxa"/>
               <w:left w:w="150" w:type="dxa"/>
               <w:right w:w="150" w:type="dxa"/>
             </w:tcMar>
@@ -1320,7 +1388,7 @@
               <w:rPr>
                 <w:rFonts w:ascii="Arial" w:hAnsi="Arial"/>
                 <w:b/>
-                <w:sz w:val="17"/>
+                <w:sz w:val="16"/>
               </w:rPr>
               <w:t>Step 3: CLI Authentication</w:t>
             </w:r>
@@ -1331,8 +1399,8 @@
             <w:tcW w:type="dxa" w:w="3744"/>
             <w:shd w:fill="F8FAFC"/>
             <w:tcMar>
-              <w:top w:w="90" w:type="dxa"/>
-              <w:bottom w:w="90" w:type="dxa"/>
+              <w:top w:w="70" w:type="dxa"/>
+              <w:bottom w:w="70" w:type="dxa"/>
               <w:left w:w="150" w:type="dxa"/>
               <w:right w:w="150" w:type="dxa"/>
             </w:tcMar>
@@ -1342,7 +1410,7 @@
               <w:rPr>
                 <w:rFonts w:ascii="Consolas" w:hAnsi="Consolas"/>
                 <w:color w:val="047857"/>
-                <w:sz w:val="17"/>
+                <w:sz w:val="16"/>
               </w:rPr>
               <w:t>npx vercel login</w:t>
             </w:r>
@@ -1353,8 +1421,8 @@
             <w:tcW w:type="dxa" w:w="3744"/>
             <w:shd w:fill="F8FAFC"/>
             <w:tcMar>
-              <w:top w:w="90" w:type="dxa"/>
-              <w:bottom w:w="90" w:type="dxa"/>
+              <w:top w:w="70" w:type="dxa"/>
+              <w:bottom w:w="70" w:type="dxa"/>
               <w:left w:w="150" w:type="dxa"/>
               <w:right w:w="150" w:type="dxa"/>
             </w:tcMar>
@@ -1363,7 +1431,7 @@
             <w:r>
               <w:rPr>
                 <w:rFonts w:ascii="Arial" w:hAnsi="Arial"/>
-                <w:sz w:val="17"/>
+                <w:sz w:val="16"/>
               </w:rPr>
               <w:t>Authenticates CLI session with Vercel team/account (chahatmodi18).</w:t>
             </w:r>
@@ -1376,8 +1444,8 @@
             <w:tcW w:type="dxa" w:w="2592"/>
             <w:shd w:fill="FFFFFF"/>
             <w:tcMar>
-              <w:top w:w="90" w:type="dxa"/>
-              <w:bottom w:w="90" w:type="dxa"/>
+              <w:top w:w="70" w:type="dxa"/>
+              <w:bottom w:w="70" w:type="dxa"/>
               <w:left w:w="150" w:type="dxa"/>
               <w:right w:w="150" w:type="dxa"/>
             </w:tcMar>
@@ -1387,7 +1455,7 @@
               <w:rPr>
                 <w:rFonts w:ascii="Arial" w:hAnsi="Arial"/>
                 <w:b/>
-                <w:sz w:val="17"/>
+                <w:sz w:val="16"/>
               </w:rPr>
               <w:t>Step 4: Project Linkage</w:t>
             </w:r>
@@ -1398,8 +1466,8 @@
             <w:tcW w:type="dxa" w:w="3744"/>
             <w:shd w:fill="FFFFFF"/>
             <w:tcMar>
-              <w:top w:w="90" w:type="dxa"/>
-              <w:bottom w:w="90" w:type="dxa"/>
+              <w:top w:w="70" w:type="dxa"/>
+              <w:bottom w:w="70" w:type="dxa"/>
               <w:left w:w="150" w:type="dxa"/>
               <w:right w:w="150" w:type="dxa"/>
             </w:tcMar>
@@ -1409,7 +1477,7 @@
               <w:rPr>
                 <w:rFonts w:ascii="Consolas" w:hAnsi="Consolas"/>
                 <w:color w:val="047857"/>
-                <w:sz w:val="17"/>
+                <w:sz w:val="16"/>
               </w:rPr>
               <w:t>npx vercel link</w:t>
             </w:r>
@@ -1420,8 +1488,8 @@
             <w:tcW w:type="dxa" w:w="3744"/>
             <w:shd w:fill="FFFFFF"/>
             <w:tcMar>
-              <w:top w:w="90" w:type="dxa"/>
-              <w:bottom w:w="90" w:type="dxa"/>
+              <w:top w:w="70" w:type="dxa"/>
+              <w:bottom w:w="70" w:type="dxa"/>
               <w:left w:w="150" w:type="dxa"/>
               <w:right w:w="150" w:type="dxa"/>
             </w:tcMar>
@@ -1430,7 +1498,7 @@
             <w:r>
               <w:rPr>
                 <w:rFonts w:ascii="Arial" w:hAnsi="Arial"/>
-                <w:sz w:val="17"/>
+                <w:sz w:val="16"/>
               </w:rPr>
               <w:t>Associates the working tree with the Vercel project sarathi-your-mental-wellness-companion.</w:t>
             </w:r>
@@ -1443,8 +1511,8 @@
             <w:tcW w:type="dxa" w:w="2592"/>
             <w:shd w:fill="F8FAFC"/>
             <w:tcMar>
-              <w:top w:w="90" w:type="dxa"/>
-              <w:bottom w:w="90" w:type="dxa"/>
+              <w:top w:w="70" w:type="dxa"/>
+              <w:bottom w:w="70" w:type="dxa"/>
               <w:left w:w="150" w:type="dxa"/>
               <w:right w:w="150" w:type="dxa"/>
             </w:tcMar>
@@ -1454,7 +1522,7 @@
               <w:rPr>
                 <w:rFonts w:ascii="Arial" w:hAnsi="Arial"/>
                 <w:b/>
-                <w:sz w:val="17"/>
+                <w:sz w:val="16"/>
               </w:rPr>
               <w:t>Step 5: Cloud Secrets Setup</w:t>
             </w:r>
@@ -1465,8 +1533,8 @@
             <w:tcW w:type="dxa" w:w="3744"/>
             <w:shd w:fill="F8FAFC"/>
             <w:tcMar>
-              <w:top w:w="90" w:type="dxa"/>
-              <w:bottom w:w="90" w:type="dxa"/>
+              <w:top w:w="70" w:type="dxa"/>
+              <w:bottom w:w="70" w:type="dxa"/>
               <w:left w:w="150" w:type="dxa"/>
               <w:right w:w="150" w:type="dxa"/>
             </w:tcMar>
@@ -1476,7 +1544,7 @@
               <w:rPr>
                 <w:rFonts w:ascii="Consolas" w:hAnsi="Consolas"/>
                 <w:color w:val="047857"/>
-                <w:sz w:val="17"/>
+                <w:sz w:val="16"/>
               </w:rPr>
               <w:t>npx vercel env add FLASK_SECRET_KEY production</w:t>
             </w:r>
@@ -1487,8 +1555,8 @@
             <w:tcW w:type="dxa" w:w="3744"/>
             <w:shd w:fill="F8FAFC"/>
             <w:tcMar>
-              <w:top w:w="90" w:type="dxa"/>
-              <w:bottom w:w="90" w:type="dxa"/>
+              <w:top w:w="70" w:type="dxa"/>
+              <w:bottom w:w="70" w:type="dxa"/>
               <w:left w:w="150" w:type="dxa"/>
               <w:right w:w="150" w:type="dxa"/>
             </w:tcMar>
@@ -1497,7 +1565,7 @@
             <w:r>
               <w:rPr>
                 <w:rFonts w:ascii="Arial" w:hAnsi="Arial"/>
-                <w:sz w:val="17"/>
+                <w:sz w:val="16"/>
               </w:rPr>
               <w:t>Securely provisions encrypted production secrets into Vercel Cloud KMS.</w:t>
             </w:r>
@@ -1510,8 +1578,8 @@
             <w:tcW w:type="dxa" w:w="2592"/>
             <w:shd w:fill="FFFFFF"/>
             <w:tcMar>
-              <w:top w:w="90" w:type="dxa"/>
-              <w:bottom w:w="90" w:type="dxa"/>
+              <w:top w:w="70" w:type="dxa"/>
+              <w:bottom w:w="70" w:type="dxa"/>
               <w:left w:w="150" w:type="dxa"/>
               <w:right w:w="150" w:type="dxa"/>
             </w:tcMar>
@@ -1521,7 +1589,7 @@
               <w:rPr>
                 <w:rFonts w:ascii="Arial" w:hAnsi="Arial"/>
                 <w:b/>
-                <w:sz w:val="17"/>
+                <w:sz w:val="16"/>
               </w:rPr>
               <w:t>Step 6: Production Edge Deployment</w:t>
             </w:r>
@@ -1532,8 +1600,8 @@
             <w:tcW w:type="dxa" w:w="3744"/>
             <w:shd w:fill="FFFFFF"/>
             <w:tcMar>
-              <w:top w:w="90" w:type="dxa"/>
-              <w:bottom w:w="90" w:type="dxa"/>
+              <w:top w:w="70" w:type="dxa"/>
+              <w:bottom w:w="70" w:type="dxa"/>
               <w:left w:w="150" w:type="dxa"/>
               <w:right w:w="150" w:type="dxa"/>
             </w:tcMar>
@@ -1543,7 +1611,7 @@
               <w:rPr>
                 <w:rFonts w:ascii="Consolas" w:hAnsi="Consolas"/>
                 <w:color w:val="047857"/>
-                <w:sz w:val="17"/>
+                <w:sz w:val="16"/>
               </w:rPr>
               <w:t>npx vercel deploy --prod --yes</w:t>
             </w:r>
@@ -1554,8 +1622,8 @@
             <w:tcW w:type="dxa" w:w="3744"/>
             <w:shd w:fill="FFFFFF"/>
             <w:tcMar>
-              <w:top w:w="90" w:type="dxa"/>
-              <w:bottom w:w="90" w:type="dxa"/>
+              <w:top w:w="70" w:type="dxa"/>
+              <w:bottom w:w="70" w:type="dxa"/>
               <w:left w:w="150" w:type="dxa"/>
               <w:right w:w="150" w:type="dxa"/>
             </w:tcMar>
@@ -1564,7 +1632,7 @@
             <w:r>
               <w:rPr>
                 <w:rFonts w:ascii="Arial" w:hAnsi="Arial"/>
-                <w:sz w:val="17"/>
+                <w:sz w:val="16"/>
               </w:rPr>
               <w:t>Builds, bundles, and transmits serverless functions to Vercel global edge CDN.</w:t>
             </w:r>
@@ -1577,8 +1645,8 @@
             <w:tcW w:type="dxa" w:w="2592"/>
             <w:shd w:fill="F8FAFC"/>
             <w:tcMar>
-              <w:top w:w="90" w:type="dxa"/>
-              <w:bottom w:w="90" w:type="dxa"/>
+              <w:top w:w="70" w:type="dxa"/>
+              <w:bottom w:w="70" w:type="dxa"/>
               <w:left w:w="150" w:type="dxa"/>
               <w:right w:w="150" w:type="dxa"/>
             </w:tcMar>
@@ -1588,7 +1656,7 @@
               <w:rPr>
                 <w:rFonts w:ascii="Arial" w:hAnsi="Arial"/>
                 <w:b/>
-                <w:sz w:val="17"/>
+                <w:sz w:val="16"/>
               </w:rPr>
               <w:t>Step 7: Verification &amp; Health Check</w:t>
             </w:r>
@@ -1599,8 +1667,8 @@
             <w:tcW w:type="dxa" w:w="3744"/>
             <w:shd w:fill="F8FAFC"/>
             <w:tcMar>
-              <w:top w:w="90" w:type="dxa"/>
-              <w:bottom w:w="90" w:type="dxa"/>
+              <w:top w:w="70" w:type="dxa"/>
+              <w:bottom w:w="70" w:type="dxa"/>
               <w:left w:w="150" w:type="dxa"/>
               <w:right w:w="150" w:type="dxa"/>
             </w:tcMar>
@@ -1610,7 +1678,7 @@
               <w:rPr>
                 <w:rFonts w:ascii="Consolas" w:hAnsi="Consolas"/>
                 <w:color w:val="047857"/>
-                <w:sz w:val="17"/>
+                <w:sz w:val="16"/>
               </w:rPr>
               <w:t>curl -I https://sarathi-your-mental-wellness-compan.vercel.app</w:t>
             </w:r>
@@ -1621,8 +1689,8 @@
             <w:tcW w:type="dxa" w:w="3744"/>
             <w:shd w:fill="F8FAFC"/>
             <w:tcMar>
-              <w:top w:w="90" w:type="dxa"/>
-              <w:bottom w:w="90" w:type="dxa"/>
+              <w:top w:w="70" w:type="dxa"/>
+              <w:bottom w:w="70" w:type="dxa"/>
               <w:left w:w="150" w:type="dxa"/>
               <w:right w:w="150" w:type="dxa"/>
             </w:tcMar>
@@ -1631,9 +1699,647 @@
             <w:r>
               <w:rPr>
                 <w:rFonts w:ascii="Arial" w:hAnsi="Arial"/>
-                <w:sz w:val="17"/>
+                <w:sz w:val="16"/>
               </w:rPr>
               <w:t>Verifies production edge routing, WSGI initialization, and HTTP 200 status.</w:t>
+            </w:r>
+          </w:p>
+        </w:tc>
+      </w:tr>
+    </w:tbl>
+    <w:p>
+      <w:pPr>
+        <w:spacing w:after="200"/>
+      </w:pPr>
+    </w:p>
+    <w:p>
+      <w:pPr>
+        <w:pStyle w:val="Heading1"/>
+      </w:pPr>
+      <w:r>
+        <w:rPr>
+          <w:rFonts w:ascii="Arial" w:hAnsi="Arial"/>
+          <w:b/>
+          <w:color w:val="0E7490"/>
+          <w:sz w:val="26"/>
+        </w:rPr>
+        <w:t>4. GitHub Actions CI/CD Deployment Steps Reference Table</w:t>
+      </w:r>
+    </w:p>
+    <w:tbl>
+      <w:tblPr>
+        <w:tblW w:type="auto" w:w="0"/>
+        <w:jc w:val="center"/>
+        <w:tblLook w:firstColumn="1" w:firstRow="1" w:lastColumn="0" w:lastRow="0" w:noHBand="0" w:noVBand="1" w:val="04A0"/>
+      </w:tblPr>
+      <w:tblGrid>
+        <w:gridCol w:w="3360"/>
+        <w:gridCol w:w="3360"/>
+        <w:gridCol w:w="3360"/>
+      </w:tblGrid>
+      <w:tr>
+        <w:tc>
+          <w:tcPr>
+            <w:tcW w:type="dxa" w:w="2592"/>
+            <w:shd w:fill="4338CA"/>
+            <w:tcMar>
+              <w:top w:w="100" w:type="dxa"/>
+              <w:bottom w:w="100" w:type="dxa"/>
+              <w:left w:w="150" w:type="dxa"/>
+              <w:right w:w="150" w:type="dxa"/>
+            </w:tcMar>
+          </w:tcPr>
+          <w:p>
+            <w:r>
+              <w:rPr>
+                <w:rFonts w:ascii="Arial" w:hAnsi="Arial"/>
+                <w:b/>
+                <w:color w:val="FFFFFF"/>
+                <w:sz w:val="18"/>
+              </w:rPr>
+              <w:t>CI/CD Step</w:t>
+            </w:r>
+          </w:p>
+        </w:tc>
+        <w:tc>
+          <w:tcPr>
+            <w:tcW w:type="dxa" w:w="3744"/>
+            <w:shd w:fill="4338CA"/>
+            <w:tcMar>
+              <w:top w:w="100" w:type="dxa"/>
+              <w:bottom w:w="100" w:type="dxa"/>
+              <w:left w:w="150" w:type="dxa"/>
+              <w:right w:w="150" w:type="dxa"/>
+            </w:tcMar>
+          </w:tcPr>
+          <w:p>
+            <w:r>
+              <w:rPr>
+                <w:rFonts w:ascii="Arial" w:hAnsi="Arial"/>
+                <w:b/>
+                <w:color w:val="FFFFFF"/>
+                <w:sz w:val="18"/>
+              </w:rPr>
+              <w:t>GitHub Interface Action / Secret</w:t>
+            </w:r>
+          </w:p>
+        </w:tc>
+        <w:tc>
+          <w:tcPr>
+            <w:tcW w:type="dxa" w:w="3744"/>
+            <w:shd w:fill="4338CA"/>
+            <w:tcMar>
+              <w:top w:w="100" w:type="dxa"/>
+              <w:bottom w:w="100" w:type="dxa"/>
+              <w:left w:w="150" w:type="dxa"/>
+              <w:right w:w="150" w:type="dxa"/>
+            </w:tcMar>
+          </w:tcPr>
+          <w:p>
+            <w:r>
+              <w:rPr>
+                <w:rFonts w:ascii="Arial" w:hAnsi="Arial"/>
+                <w:b/>
+                <w:color w:val="FFFFFF"/>
+                <w:sz w:val="18"/>
+              </w:rPr>
+              <w:t>Functional Outcome</w:t>
+            </w:r>
+          </w:p>
+        </w:tc>
+      </w:tr>
+      <w:tr>
+        <w:tc>
+          <w:tcPr>
+            <w:tcW w:type="dxa" w:w="2592"/>
+            <w:shd w:fill="F8FAFC"/>
+            <w:tcMar>
+              <w:top w:w="70" w:type="dxa"/>
+              <w:bottom w:w="70" w:type="dxa"/>
+              <w:left w:w="150" w:type="dxa"/>
+              <w:right w:w="150" w:type="dxa"/>
+            </w:tcMar>
+          </w:tcPr>
+          <w:p>
+            <w:r>
+              <w:rPr>
+                <w:rFonts w:ascii="Arial" w:hAnsi="Arial"/>
+                <w:b/>
+                <w:sz w:val="16"/>
+              </w:rPr>
+              <w:t>Step 1: Open Settings</w:t>
+            </w:r>
+          </w:p>
+        </w:tc>
+        <w:tc>
+          <w:tcPr>
+            <w:tcW w:type="dxa" w:w="3744"/>
+            <w:shd w:fill="F8FAFC"/>
+            <w:tcMar>
+              <w:top w:w="70" w:type="dxa"/>
+              <w:bottom w:w="70" w:type="dxa"/>
+              <w:left w:w="150" w:type="dxa"/>
+              <w:right w:w="150" w:type="dxa"/>
+            </w:tcMar>
+          </w:tcPr>
+          <w:p>
+            <w:r>
+              <w:rPr>
+                <w:rFonts w:ascii="Consolas" w:hAnsi="Consolas"/>
+                <w:color w:val="4338CA"/>
+                <w:sz w:val="16"/>
+              </w:rPr>
+              <w:t>Settings -&gt; Secrets and variables -&gt; Actions</w:t>
+            </w:r>
+          </w:p>
+        </w:tc>
+        <w:tc>
+          <w:tcPr>
+            <w:tcW w:type="dxa" w:w="3744"/>
+            <w:shd w:fill="F8FAFC"/>
+            <w:tcMar>
+              <w:top w:w="70" w:type="dxa"/>
+              <w:bottom w:w="70" w:type="dxa"/>
+              <w:left w:w="150" w:type="dxa"/>
+              <w:right w:w="150" w:type="dxa"/>
+            </w:tcMar>
+          </w:tcPr>
+          <w:p>
+            <w:r>
+              <w:rPr>
+                <w:rFonts w:ascii="Arial" w:hAnsi="Arial"/>
+                <w:sz w:val="16"/>
+              </w:rPr>
+              <w:t>Navigate to repository secrets configuration page.</w:t>
+            </w:r>
+          </w:p>
+        </w:tc>
+      </w:tr>
+      <w:tr>
+        <w:tc>
+          <w:tcPr>
+            <w:tcW w:type="dxa" w:w="2592"/>
+            <w:shd w:fill="FFFFFF"/>
+            <w:tcMar>
+              <w:top w:w="70" w:type="dxa"/>
+              <w:bottom w:w="70" w:type="dxa"/>
+              <w:left w:w="150" w:type="dxa"/>
+              <w:right w:w="150" w:type="dxa"/>
+            </w:tcMar>
+          </w:tcPr>
+          <w:p>
+            <w:r>
+              <w:rPr>
+                <w:rFonts w:ascii="Arial" w:hAnsi="Arial"/>
+                <w:b/>
+                <w:sz w:val="16"/>
+              </w:rPr>
+              <w:t>Step 2: Add Vercel Token</w:t>
+            </w:r>
+          </w:p>
+        </w:tc>
+        <w:tc>
+          <w:tcPr>
+            <w:tcW w:type="dxa" w:w="3744"/>
+            <w:shd w:fill="FFFFFF"/>
+            <w:tcMar>
+              <w:top w:w="70" w:type="dxa"/>
+              <w:bottom w:w="70" w:type="dxa"/>
+              <w:left w:w="150" w:type="dxa"/>
+              <w:right w:w="150" w:type="dxa"/>
+            </w:tcMar>
+          </w:tcPr>
+          <w:p>
+            <w:r>
+              <w:rPr>
+                <w:rFonts w:ascii="Consolas" w:hAnsi="Consolas"/>
+                <w:color w:val="4338CA"/>
+                <w:sz w:val="16"/>
+              </w:rPr>
+              <w:t>New secret: VERCEL_TOKEN</w:t>
+            </w:r>
+          </w:p>
+        </w:tc>
+        <w:tc>
+          <w:tcPr>
+            <w:tcW w:type="dxa" w:w="3744"/>
+            <w:shd w:fill="FFFFFF"/>
+            <w:tcMar>
+              <w:top w:w="70" w:type="dxa"/>
+              <w:bottom w:w="70" w:type="dxa"/>
+              <w:left w:w="150" w:type="dxa"/>
+              <w:right w:w="150" w:type="dxa"/>
+            </w:tcMar>
+          </w:tcPr>
+          <w:p>
+            <w:r>
+              <w:rPr>
+                <w:rFonts w:ascii="Arial" w:hAnsi="Arial"/>
+                <w:sz w:val="16"/>
+              </w:rPr>
+              <w:t>Paste Personal Access Token generated at vercel.com/account/tokens.</w:t>
+            </w:r>
+          </w:p>
+        </w:tc>
+      </w:tr>
+      <w:tr>
+        <w:tc>
+          <w:tcPr>
+            <w:tcW w:type="dxa" w:w="2592"/>
+            <w:shd w:fill="F8FAFC"/>
+            <w:tcMar>
+              <w:top w:w="70" w:type="dxa"/>
+              <w:bottom w:w="70" w:type="dxa"/>
+              <w:left w:w="150" w:type="dxa"/>
+              <w:right w:w="150" w:type="dxa"/>
+            </w:tcMar>
+          </w:tcPr>
+          <w:p>
+            <w:r>
+              <w:rPr>
+                <w:rFonts w:ascii="Arial" w:hAnsi="Arial"/>
+                <w:b/>
+                <w:sz w:val="16"/>
+              </w:rPr>
+              <w:t>Step 3: Add Org Identifier</w:t>
+            </w:r>
+          </w:p>
+        </w:tc>
+        <w:tc>
+          <w:tcPr>
+            <w:tcW w:type="dxa" w:w="3744"/>
+            <w:shd w:fill="F8FAFC"/>
+            <w:tcMar>
+              <w:top w:w="70" w:type="dxa"/>
+              <w:bottom w:w="70" w:type="dxa"/>
+              <w:left w:w="150" w:type="dxa"/>
+              <w:right w:w="150" w:type="dxa"/>
+            </w:tcMar>
+          </w:tcPr>
+          <w:p>
+            <w:r>
+              <w:rPr>
+                <w:rFonts w:ascii="Consolas" w:hAnsi="Consolas"/>
+                <w:color w:val="4338CA"/>
+                <w:sz w:val="16"/>
+              </w:rPr>
+              <w:t>New secret: VERCEL_ORG_ID</w:t>
+            </w:r>
+          </w:p>
+        </w:tc>
+        <w:tc>
+          <w:tcPr>
+            <w:tcW w:type="dxa" w:w="3744"/>
+            <w:shd w:fill="F8FAFC"/>
+            <w:tcMar>
+              <w:top w:w="70" w:type="dxa"/>
+              <w:bottom w:w="70" w:type="dxa"/>
+              <w:left w:w="150" w:type="dxa"/>
+              <w:right w:w="150" w:type="dxa"/>
+            </w:tcMar>
+          </w:tcPr>
+          <w:p>
+            <w:r>
+              <w:rPr>
+                <w:rFonts w:ascii="Arial" w:hAnsi="Arial"/>
+                <w:sz w:val="16"/>
+              </w:rPr>
+              <w:t>Set to team_mhFb8ssXMuHtfFxY59VnhLKY (from .vercel/project.json).</w:t>
+            </w:r>
+          </w:p>
+        </w:tc>
+      </w:tr>
+      <w:tr>
+        <w:tc>
+          <w:tcPr>
+            <w:tcW w:type="dxa" w:w="2592"/>
+            <w:shd w:fill="FFFFFF"/>
+            <w:tcMar>
+              <w:top w:w="70" w:type="dxa"/>
+              <w:bottom w:w="70" w:type="dxa"/>
+              <w:left w:w="150" w:type="dxa"/>
+              <w:right w:w="150" w:type="dxa"/>
+            </w:tcMar>
+          </w:tcPr>
+          <w:p>
+            <w:r>
+              <w:rPr>
+                <w:rFonts w:ascii="Arial" w:hAnsi="Arial"/>
+                <w:b/>
+                <w:sz w:val="16"/>
+              </w:rPr>
+              <w:t>Step 4: Add Project Identifier</w:t>
+            </w:r>
+          </w:p>
+        </w:tc>
+        <w:tc>
+          <w:tcPr>
+            <w:tcW w:type="dxa" w:w="3744"/>
+            <w:shd w:fill="FFFFFF"/>
+            <w:tcMar>
+              <w:top w:w="70" w:type="dxa"/>
+              <w:bottom w:w="70" w:type="dxa"/>
+              <w:left w:w="150" w:type="dxa"/>
+              <w:right w:w="150" w:type="dxa"/>
+            </w:tcMar>
+          </w:tcPr>
+          <w:p>
+            <w:r>
+              <w:rPr>
+                <w:rFonts w:ascii="Consolas" w:hAnsi="Consolas"/>
+                <w:color w:val="4338CA"/>
+                <w:sz w:val="16"/>
+              </w:rPr>
+              <w:t>New secret: VERCEL_PROJECT_ID</w:t>
+            </w:r>
+          </w:p>
+        </w:tc>
+        <w:tc>
+          <w:tcPr>
+            <w:tcW w:type="dxa" w:w="3744"/>
+            <w:shd w:fill="FFFFFF"/>
+            <w:tcMar>
+              <w:top w:w="70" w:type="dxa"/>
+              <w:bottom w:w="70" w:type="dxa"/>
+              <w:left w:w="150" w:type="dxa"/>
+              <w:right w:w="150" w:type="dxa"/>
+            </w:tcMar>
+          </w:tcPr>
+          <w:p>
+            <w:r>
+              <w:rPr>
+                <w:rFonts w:ascii="Arial" w:hAnsi="Arial"/>
+                <w:sz w:val="16"/>
+              </w:rPr>
+              <w:t>Set to prj_AtJAxzlwcWidya8jxxpfXu97Lerq (from .vercel/project.json).</w:t>
+            </w:r>
+          </w:p>
+        </w:tc>
+      </w:tr>
+      <w:tr>
+        <w:tc>
+          <w:tcPr>
+            <w:tcW w:type="dxa" w:w="2592"/>
+            <w:shd w:fill="F8FAFC"/>
+            <w:tcMar>
+              <w:top w:w="70" w:type="dxa"/>
+              <w:bottom w:w="70" w:type="dxa"/>
+              <w:left w:w="150" w:type="dxa"/>
+              <w:right w:w="150" w:type="dxa"/>
+            </w:tcMar>
+          </w:tcPr>
+          <w:p>
+            <w:r>
+              <w:rPr>
+                <w:rFonts w:ascii="Arial" w:hAnsi="Arial"/>
+                <w:b/>
+                <w:sz w:val="16"/>
+              </w:rPr>
+              <w:t>Step 5: Open Actions Tab</w:t>
+            </w:r>
+          </w:p>
+        </w:tc>
+        <w:tc>
+          <w:tcPr>
+            <w:tcW w:type="dxa" w:w="3744"/>
+            <w:shd w:fill="F8FAFC"/>
+            <w:tcMar>
+              <w:top w:w="70" w:type="dxa"/>
+              <w:bottom w:w="70" w:type="dxa"/>
+              <w:left w:w="150" w:type="dxa"/>
+              <w:right w:w="150" w:type="dxa"/>
+            </w:tcMar>
+          </w:tcPr>
+          <w:p>
+            <w:r>
+              <w:rPr>
+                <w:rFonts w:ascii="Consolas" w:hAnsi="Consolas"/>
+                <w:color w:val="4338CA"/>
+                <w:sz w:val="16"/>
+              </w:rPr>
+              <w:t>github.com/.../actions</w:t>
+            </w:r>
+          </w:p>
+        </w:tc>
+        <w:tc>
+          <w:tcPr>
+            <w:tcW w:type="dxa" w:w="3744"/>
+            <w:shd w:fill="F8FAFC"/>
+            <w:tcMar>
+              <w:top w:w="70" w:type="dxa"/>
+              <w:bottom w:w="70" w:type="dxa"/>
+              <w:left w:w="150" w:type="dxa"/>
+              <w:right w:w="150" w:type="dxa"/>
+            </w:tcMar>
+          </w:tcPr>
+          <w:p>
+            <w:r>
+              <w:rPr>
+                <w:rFonts w:ascii="Arial" w:hAnsi="Arial"/>
+                <w:sz w:val="16"/>
+              </w:rPr>
+              <w:t>View registered workflow "Sarathi CI/CD - Verify &amp; Deploy".</w:t>
+            </w:r>
+          </w:p>
+        </w:tc>
+      </w:tr>
+      <w:tr>
+        <w:tc>
+          <w:tcPr>
+            <w:tcW w:type="dxa" w:w="2592"/>
+            <w:shd w:fill="FFFFFF"/>
+            <w:tcMar>
+              <w:top w:w="70" w:type="dxa"/>
+              <w:bottom w:w="70" w:type="dxa"/>
+              <w:left w:w="150" w:type="dxa"/>
+              <w:right w:w="150" w:type="dxa"/>
+            </w:tcMar>
+          </w:tcPr>
+          <w:p>
+            <w:r>
+              <w:rPr>
+                <w:rFonts w:ascii="Arial" w:hAnsi="Arial"/>
+                <w:b/>
+                <w:sz w:val="16"/>
+              </w:rPr>
+              <w:t>Step 6: Trigger Workflow</w:t>
+            </w:r>
+          </w:p>
+        </w:tc>
+        <w:tc>
+          <w:tcPr>
+            <w:tcW w:type="dxa" w:w="3744"/>
+            <w:shd w:fill="FFFFFF"/>
+            <w:tcMar>
+              <w:top w:w="70" w:type="dxa"/>
+              <w:bottom w:w="70" w:type="dxa"/>
+              <w:left w:w="150" w:type="dxa"/>
+              <w:right w:w="150" w:type="dxa"/>
+            </w:tcMar>
+          </w:tcPr>
+          <w:p>
+            <w:r>
+              <w:rPr>
+                <w:rFonts w:ascii="Consolas" w:hAnsi="Consolas"/>
+                <w:color w:val="4338CA"/>
+                <w:sz w:val="16"/>
+              </w:rPr>
+              <w:t>Run workflow -&gt; Branch: main -&gt; Run</w:t>
+            </w:r>
+          </w:p>
+        </w:tc>
+        <w:tc>
+          <w:tcPr>
+            <w:tcW w:type="dxa" w:w="3744"/>
+            <w:shd w:fill="FFFFFF"/>
+            <w:tcMar>
+              <w:top w:w="70" w:type="dxa"/>
+              <w:bottom w:w="70" w:type="dxa"/>
+              <w:left w:w="150" w:type="dxa"/>
+              <w:right w:w="150" w:type="dxa"/>
+            </w:tcMar>
+          </w:tcPr>
+          <w:p>
+            <w:r>
+              <w:rPr>
+                <w:rFonts w:ascii="Arial" w:hAnsi="Arial"/>
+                <w:sz w:val="16"/>
+              </w:rPr>
+              <w:t>Initiates automated pipeline on demand or on every future git push.</w:t>
+            </w:r>
+          </w:p>
+        </w:tc>
+      </w:tr>
+      <w:tr>
+        <w:tc>
+          <w:tcPr>
+            <w:tcW w:type="dxa" w:w="2592"/>
+            <w:shd w:fill="F8FAFC"/>
+            <w:tcMar>
+              <w:top w:w="70" w:type="dxa"/>
+              <w:bottom w:w="70" w:type="dxa"/>
+              <w:left w:w="150" w:type="dxa"/>
+              <w:right w:w="150" w:type="dxa"/>
+            </w:tcMar>
+          </w:tcPr>
+          <w:p>
+            <w:r>
+              <w:rPr>
+                <w:rFonts w:ascii="Arial" w:hAnsi="Arial"/>
+                <w:b/>
+                <w:sz w:val="16"/>
+              </w:rPr>
+              <w:t>Step 7: Audit &amp; Test Stage</w:t>
+            </w:r>
+          </w:p>
+        </w:tc>
+        <w:tc>
+          <w:tcPr>
+            <w:tcW w:type="dxa" w:w="3744"/>
+            <w:shd w:fill="F8FAFC"/>
+            <w:tcMar>
+              <w:top w:w="70" w:type="dxa"/>
+              <w:bottom w:w="70" w:type="dxa"/>
+              <w:left w:w="150" w:type="dxa"/>
+              <w:right w:w="150" w:type="dxa"/>
+            </w:tcMar>
+          </w:tcPr>
+          <w:p>
+            <w:r>
+              <w:rPr>
+                <w:rFonts w:ascii="Consolas" w:hAnsi="Consolas"/>
+                <w:color w:val="4338CA"/>
+                <w:sz w:val="16"/>
+              </w:rPr>
+              <w:t>Job: Audit Structure &amp; Run Tests</w:t>
+            </w:r>
+          </w:p>
+        </w:tc>
+        <w:tc>
+          <w:tcPr>
+            <w:tcW w:type="dxa" w:w="3744"/>
+            <w:shd w:fill="F8FAFC"/>
+            <w:tcMar>
+              <w:top w:w="70" w:type="dxa"/>
+              <w:bottom w:w="70" w:type="dxa"/>
+              <w:left w:w="150" w:type="dxa"/>
+              <w:right w:w="150" w:type="dxa"/>
+            </w:tcMar>
+          </w:tcPr>
+          <w:p>
+            <w:r>
+              <w:rPr>
+                <w:rFonts w:ascii="Arial" w:hAnsi="Arial"/>
+                <w:sz w:val="16"/>
+              </w:rPr>
+              <w:t>Audits all repository folders and runs 58 pytest tests automatically.</w:t>
+            </w:r>
+          </w:p>
+        </w:tc>
+      </w:tr>
+      <w:tr>
+        <w:tc>
+          <w:tcPr>
+            <w:tcW w:type="dxa" w:w="2592"/>
+            <w:shd w:fill="FFFFFF"/>
+            <w:tcMar>
+              <w:top w:w="70" w:type="dxa"/>
+              <w:bottom w:w="70" w:type="dxa"/>
+              <w:left w:w="150" w:type="dxa"/>
+              <w:right w:w="150" w:type="dxa"/>
+            </w:tcMar>
+          </w:tcPr>
+          <w:p>
+            <w:r>
+              <w:rPr>
+                <w:rFonts w:ascii="Arial" w:hAnsi="Arial"/>
+                <w:b/>
+                <w:sz w:val="16"/>
+              </w:rPr>
+              <w:t>Step 8: Vercel Deploy Stage</w:t>
+            </w:r>
+          </w:p>
+        </w:tc>
+        <w:tc>
+          <w:tcPr>
+            <w:tcW w:type="dxa" w:w="3744"/>
+            <w:shd w:fill="FFFFFF"/>
+            <w:tcMar>
+              <w:top w:w="70" w:type="dxa"/>
+              <w:bottom w:w="70" w:type="dxa"/>
+              <w:left w:w="150" w:type="dxa"/>
+              <w:right w:w="150" w:type="dxa"/>
+            </w:tcMar>
+          </w:tcPr>
+          <w:p>
+            <w:r>
+              <w:rPr>
+                <w:rFonts w:ascii="Consolas" w:hAnsi="Consolas"/>
+                <w:color w:val="4338CA"/>
+                <w:sz w:val="16"/>
+              </w:rPr>
+              <w:t>Job: Deploy to Vercel Production</w:t>
+            </w:r>
+          </w:p>
+        </w:tc>
+        <w:tc>
+          <w:tcPr>
+            <w:tcW w:type="dxa" w:w="3744"/>
+            <w:shd w:fill="FFFFFF"/>
+            <w:tcMar>
+              <w:top w:w="70" w:type="dxa"/>
+              <w:bottom w:w="70" w:type="dxa"/>
+              <w:left w:w="150" w:type="dxa"/>
+              <w:right w:w="150" w:type="dxa"/>
+            </w:tcMar>
+          </w:tcPr>
+          <w:p>
+            <w:r>
+              <w:rPr>
+                <w:rFonts w:ascii="Arial" w:hAnsi="Arial"/>
+                <w:sz w:val="16"/>
+              </w:rPr>
+              <w:t>Deploys verified website bundle to Vercel global edge CDN.</w:t>
             </w:r>
           </w:p>
         </w:tc>

</xml_diff>